<commit_message>
Add riot_data_extraction; remove old scripts
Replace the previous Riot POC and heuristic generator with a new riot_data_extraction.py script. Deleted scripts/generate_heuristics.py and scripts/riot_api_poc.py; added scripts/riot_data_extraction.py which uses the Riot API to collect Emerald-ranked players, convert summoner IDs to PUUIDs, fetch recent ranked matches, analyze lane matchups and aggregate win/loss statistics (demo limits: 3 players x 5 matches). Updated docs/plantilla.docx (binary change). Note: the new script contains an API_KEY variable and simple rate-limit sleeps — move the key to environment variables and adjust throttling for production.
</commit_message>
<xml_diff>
--- a/docs/plantilla.docx
+++ b/docs/plantilla.docx
@@ -2750,10 +2750,16 @@
     </w:p>
     <w:p>
       <w:r>
-        <w:t>La convergencia entre la teoría de juegos y la computación avanzada ha transformado los entornos de ocio digital en escenarios de alta complejidad estratégica. El presente trabajo se sumerge en esta intersección para abordar el diseño y desarrollo de un sistema experto orientado a la toma de decisiones estratégicas en el videojuego League Of Legends (LoL). En las siguientes secciones detallaré la motivación que me impulsó a realizar esta investigación, destacando la complejidad inherente al dominio del problema, la necesidad de sistemas de inteligencia artificial (IA) interpretables. Posteriormente, definiré el planteamiento del trabajando, describiendo la naturaleza de la solución técnica propuesta basada en Python y Flask. Finalmente, expondré la estructura general del documento, resumiendo el contenido de los capítulos posteriores.</w:t>
-      </w:r>
-      <w:r>
-        <w:t xml:space="preserve"> </w:t>
+        <w:t>Python como lenguaje de programación, Flask para la aplicación web, manejo de API oficial de Riot Games para extracción de datos de miles de partidas para conseguir el winrate de los camepones a nivel individual</w:t>
+      </w:r>
+      <w:r>
+        <w:t>, mongodb para la base de datos</w:t>
+      </w:r>
+    </w:p>
+    <w:p/>
+    <w:p>
+      <w:r>
+        <w:t>En la actualidad, la industria de los videojuegos experimenta unos cambios constantes,</w:t>
       </w:r>
     </w:p>
     <w:p>
@@ -2788,16 +2794,16 @@
     </w:p>
     <w:p>
       <w:r>
-        <w:t xml:space="preserve">A pesar de que el estado del arte ha porpuesto múltiples modelos de Aprendizaje Automático (Machine Learning) capaces de predecir el resultado de una partida con precisiones superiores al 75% (Do et al., 2021), observo que estos enfoques estadísticos y de redes neuronales a menudo operan como “cajas negras”. La falta de transparencia en sus predicciones limita severamente su adopción por parte de los usuarios, quienes necesitan comprender el </w:t>
+        <w:t>A pesar de que el estado del arte ha porpuesto múltiples modelos de Aprendizaje Automático (Machine Learning) capaces de predecir el resultado de una partida con precisiones superiores al 75% (Do et al., 2021), observo que estos enfoques estadísticos y de redes neuronales a menudo operan como “cajas negras”. La falta de transparencia en sus predicciones limita severamente su adopción por parte de los usuarios, quienes necesitan comprender el razonamiento detrás de una recomendación para mejorar su aprendizaje estratégico (García-Méndez &amp; de Arriba-Pérez, s.f.).</w:t>
+      </w:r>
+    </w:p>
+    <w:p>
+      <w:r>
+        <w:t xml:space="preserve">Esta investigación surge de mi motivación por resolver dicha limitación mediante la creación de un Sistema Experto basado en reglas lógicas. A diferencia de los modelos puramente probabilísticos, propongo un sistema experto capaz de manejar la incertidumbre táctica </w:t>
       </w:r>
       <w:r>
         <w:lastRenderedPageBreak/>
-        <w:t>razonamiento detrás de una recomendación para mejorar su aprendizaje estratégico (García-Méndez &amp; de Arriba-Pérez, s.f.).</w:t>
-      </w:r>
-    </w:p>
-    <w:p>
-      <w:r>
-        <w:t>Esta investigación surge de mi motivación por resolver dicha limitación mediante la creación de un Sistema Experto basado en reglas lógicas. A diferencia de los modelos puramente probabilísticos, propongo un sistema experto capaz de manejar la incertidumbre táctica mediante inferencias (potencialmente ampliada con lógica difusa) y de ofrecer explicabilidad (Explainable AI). Considero esto un equisito fundamental para garanizar la confianza del jugador, al justificar en lenguaje natural por qué una decisión es óptima dadas las circunstancias del juego (“The Architecut”)</w:t>
+        <w:t>mediante inferencias (potencialmente ampliada con lógica difusa) y de ofrecer explicabilidad (Explainable AI). Considero esto un equisito fundamental para garanizar la confianza del jugador, al justificar en lenguaje natural por qué una decisión es óptima dadas las circunstancias del juego (“The Architecut”)</w:t>
       </w:r>
     </w:p>
     <w:p>
@@ -2926,7 +2932,6 @@
     </w:p>
     <w:p>
       <w:r>
-        <w:lastRenderedPageBreak/>
         <w:t>Recuerda que si este capítulo queda demasiado extenso so puedes separar en dos capítulos diferentes:</w:t>
       </w:r>
     </w:p>
@@ -2974,6 +2979,7 @@
       </w:pPr>
       <w:bookmarkStart w:id="8" w:name="_Toc149554661"/>
       <w:r>
+        <w:lastRenderedPageBreak/>
         <w:t>“T</w:t>
       </w:r>
       <w:r>
@@ -7495,10 +7501,6 @@
 </file>
 
 <file path=customXml/item1.xml><?xml version="1.0" encoding="utf-8"?>
-<b:Sources xmlns:b="http://schemas.openxmlformats.org/officeDocument/2006/bibliography" xmlns="http://schemas.openxmlformats.org/officeDocument/2006/bibliography" SelectedStyle="\APASixthEditionOfficeOnline.xsl" StyleName="APA" Version="6"/>
-</file>
-
-<file path=customXml/item2.xml><?xml version="1.0" encoding="utf-8"?>
 <?mso-contentType ?>
 <FormTemplates xmlns="http://schemas.microsoft.com/sharepoint/v3/contenttype/forms">
   <Display>DocumentLibraryForm</Display>
@@ -7507,7 +7509,23 @@
 </FormTemplates>
 </file>
 
+<file path=customXml/item2.xml><?xml version="1.0" encoding="utf-8"?>
+<b:Sources xmlns:b="http://schemas.openxmlformats.org/officeDocument/2006/bibliography" xmlns="http://schemas.openxmlformats.org/officeDocument/2006/bibliography" SelectedStyle="\APASixthEditionOfficeOnline.xsl" StyleName="APA" Version="6"/>
+</file>
+
 <file path=customXml/item3.xml><?xml version="1.0" encoding="utf-8"?>
+<p:properties xmlns:p="http://schemas.microsoft.com/office/2006/metadata/properties" xmlns:xsi="http://www.w3.org/2001/XMLSchema-instance" xmlns:pc="http://schemas.microsoft.com/office/infopath/2007/PartnerControls">
+  <documentManagement>
+    <TaxCatchAll xmlns="0a70e875-3d35-4be2-921f-7117c31bab9b" xsi:nil="true"/>
+    <lcf76f155ced4ddcb4097134ff3c332f xmlns="27c1adeb-3674-457c-b08c-8a73f31b6e23">
+      <Terms xmlns="http://schemas.microsoft.com/office/infopath/2007/PartnerControls"/>
+    </lcf76f155ced4ddcb4097134ff3c332f>
+    <_Flow_SignoffStatus xmlns="27c1adeb-3674-457c-b08c-8a73f31b6e23" xsi:nil="true"/>
+  </documentManagement>
+</p:properties>
+</file>
+
+<file path=customXml/item4.xml><?xml version="1.0" encoding="utf-8"?>
 <ct:contentTypeSchema xmlns:ct="http://schemas.microsoft.com/office/2006/metadata/contentType" xmlns:ma="http://schemas.microsoft.com/office/2006/metadata/properties/metaAttributes" ct:_="" ma:_="" ma:contentTypeName="Documento" ma:contentTypeID="0x010100DF3D7C797EA12745A270EF30E38719B9" ma:contentTypeVersion="19" ma:contentTypeDescription="Crear nuevo documento." ma:contentTypeScope="" ma:versionID="227b02526234ef39b0b78895a9d90cf5">
   <xsd:schema xmlns:xsd="http://www.w3.org/2001/XMLSchema" xmlns:xs="http://www.w3.org/2001/XMLSchema" xmlns:p="http://schemas.microsoft.com/office/2006/metadata/properties" xmlns:ns2="0a70e875-3d35-4be2-921f-7117c31bab9b" xmlns:ns3="27c1adeb-3674-457c-b08c-8a73f31b6e23" targetNamespace="http://schemas.microsoft.com/office/2006/metadata/properties" ma:root="true" ma:fieldsID="3c939c8607e2f594db8bbb23634dd059" ns2:_="" ns3:_="">
     <xsd:import namespace="0a70e875-3d35-4be2-921f-7117c31bab9b"/>
@@ -7768,19 +7786,15 @@
 </ct:contentTypeSchema>
 </file>
 
-<file path=customXml/item4.xml><?xml version="1.0" encoding="utf-8"?>
-<p:properties xmlns:p="http://schemas.microsoft.com/office/2006/metadata/properties" xmlns:xsi="http://www.w3.org/2001/XMLSchema-instance" xmlns:pc="http://schemas.microsoft.com/office/infopath/2007/PartnerControls">
-  <documentManagement>
-    <TaxCatchAll xmlns="0a70e875-3d35-4be2-921f-7117c31bab9b" xsi:nil="true"/>
-    <lcf76f155ced4ddcb4097134ff3c332f xmlns="27c1adeb-3674-457c-b08c-8a73f31b6e23">
-      <Terms xmlns="http://schemas.microsoft.com/office/infopath/2007/PartnerControls"/>
-    </lcf76f155ced4ddcb4097134ff3c332f>
-    <_Flow_SignoffStatus xmlns="27c1adeb-3674-457c-b08c-8a73f31b6e23" xsi:nil="true"/>
-  </documentManagement>
-</p:properties>
+<file path=customXml/itemProps1.xml><?xml version="1.0" encoding="utf-8"?>
+<ds:datastoreItem xmlns:ds="http://schemas.openxmlformats.org/officeDocument/2006/customXml" ds:itemID="{5B3F4A43-888D-4D33-BD1C-7066736CDCB4}">
+  <ds:schemaRefs>
+    <ds:schemaRef ds:uri="http://schemas.microsoft.com/sharepoint/v3/contenttype/forms"/>
+  </ds:schemaRefs>
+</ds:datastoreItem>
 </file>
 
-<file path=customXml/itemProps1.xml><?xml version="1.0" encoding="utf-8"?>
+<file path=customXml/itemProps2.xml><?xml version="1.0" encoding="utf-8"?>
 <ds:datastoreItem xmlns:ds="http://schemas.openxmlformats.org/officeDocument/2006/customXml" ds:itemID="{FD1A1271-5F91-421F-91AA-F5599BF2C903}">
   <ds:schemaRefs>
     <ds:schemaRef ds:uri="http://schemas.openxmlformats.org/officeDocument/2006/bibliography"/>
@@ -7788,15 +7802,18 @@
 </ds:datastoreItem>
 </file>
 
-<file path=customXml/itemProps2.xml><?xml version="1.0" encoding="utf-8"?>
-<ds:datastoreItem xmlns:ds="http://schemas.openxmlformats.org/officeDocument/2006/customXml" ds:itemID="{5B3F4A43-888D-4D33-BD1C-7066736CDCB4}">
+<file path=customXml/itemProps3.xml><?xml version="1.0" encoding="utf-8"?>
+<ds:datastoreItem xmlns:ds="http://schemas.openxmlformats.org/officeDocument/2006/customXml" ds:itemID="{1F3C1B10-EE25-478F-A378-26280E5A2662}">
   <ds:schemaRefs>
-    <ds:schemaRef ds:uri="http://schemas.microsoft.com/sharepoint/v3/contenttype/forms"/>
+    <ds:schemaRef ds:uri="http://schemas.microsoft.com/office/2006/metadata/properties"/>
+    <ds:schemaRef ds:uri="http://schemas.microsoft.com/office/infopath/2007/PartnerControls"/>
+    <ds:schemaRef ds:uri="0a70e875-3d35-4be2-921f-7117c31bab9b"/>
+    <ds:schemaRef ds:uri="27c1adeb-3674-457c-b08c-8a73f31b6e23"/>
   </ds:schemaRefs>
 </ds:datastoreItem>
 </file>
 
-<file path=customXml/itemProps3.xml><?xml version="1.0" encoding="utf-8"?>
+<file path=customXml/itemProps4.xml><?xml version="1.0" encoding="utf-8"?>
 <ds:datastoreItem xmlns:ds="http://schemas.openxmlformats.org/officeDocument/2006/customXml" ds:itemID="{3624E214-1B8A-4A51-B10D-C847268B4539}">
   <ds:schemaRefs>
     <ds:schemaRef ds:uri="http://schemas.microsoft.com/office/2006/metadata/contentType"/>
@@ -7813,15 +7830,4 @@
     <ds:schemaRef ds:uri="http://schemas.microsoft.com/internal/obd"/>
   </ds:schemaRefs>
 </ds:datastoreItem>
-</file>
-
-<file path=customXml/itemProps4.xml><?xml version="1.0" encoding="utf-8"?>
-<ds:datastoreItem xmlns:ds="http://schemas.openxmlformats.org/officeDocument/2006/customXml" ds:itemID="{1F3C1B10-EE25-478F-A378-26280E5A2662}">
-  <ds:schemaRefs>
-    <ds:schemaRef ds:uri="http://schemas.microsoft.com/office/2006/metadata/properties"/>
-    <ds:schemaRef ds:uri="http://schemas.microsoft.com/office/infopath/2007/PartnerControls"/>
-    <ds:schemaRef ds:uri="0a70e875-3d35-4be2-921f-7117c31bab9b"/>
-    <ds:schemaRef ds:uri="27c1adeb-3674-457c-b08c-8a73f31b6e23"/>
-  </ds:schemaRefs>
-</ds:datastoreItem>
 </file>
</xml_diff>

<commit_message>
Migrate champion data to SQLite and update loader
Replace JSON-first data flow with an SQLite-backed approach: add data/knowledge.db and a one-time scripts/migrate_to_sqlite.py that imports champions and matchups into champions and matchups tables. Update data/data_loader.py to load champions from the SQLite DB (with JSON fallback) and to assemble matchups from the DB. Update scripts/riot_data_extraction.py to export raw matchup results to data/raw_matchups.csv (added csv import). Remove obsolete tooling and files: Dockerfile, .dockerignore, parser.py and patcher.py. Also add a temporary docs/~$antilla.docx binary. This change centralizes matchups storage for faster queries and enables safer migrations from the original champions.json.
</commit_message>
<xml_diff>
--- a/docs/plantilla.docx
+++ b/docs/plantilla.docx
@@ -359,7 +359,25 @@
                 <w:sz w:val="24"/>
                 <w:szCs w:val="28"/>
               </w:rPr>
-              <w:t>Claudia Blanca Gonzalez Calleros</w:t>
+              <w:t xml:space="preserve">Claudia Blanca </w:t>
+            </w:r>
+            <w:proofErr w:type="spellStart"/>
+            <w:r>
+              <w:rPr>
+                <w:rFonts w:asciiTheme="majorHAnsi" w:hAnsiTheme="majorHAnsi" w:cs="Tahoma"/>
+                <w:sz w:val="24"/>
+                <w:szCs w:val="28"/>
+              </w:rPr>
+              <w:t>Gonzalez</w:t>
+            </w:r>
+            <w:proofErr w:type="spellEnd"/>
+            <w:r>
+              <w:rPr>
+                <w:rFonts w:asciiTheme="majorHAnsi" w:hAnsiTheme="majorHAnsi" w:cs="Tahoma"/>
+                <w:sz w:val="24"/>
+                <w:szCs w:val="28"/>
+              </w:rPr>
+              <w:t xml:space="preserve"> Calleros</w:t>
             </w:r>
           </w:p>
         </w:tc>
@@ -617,6 +635,7 @@
       <w:pPr>
         <w:pStyle w:val="Ttulondices"/>
       </w:pPr>
+      <w:proofErr w:type="spellStart"/>
       <w:r>
         <w:rPr>
           <w:highlight w:val="magenta"/>
@@ -624,6 +643,7 @@
         <w:lastRenderedPageBreak/>
         <w:t>Abstract</w:t>
       </w:r>
+      <w:proofErr w:type="spellEnd"/>
     </w:p>
     <w:p>
       <w:r>
@@ -632,6 +652,7 @@
     </w:p>
     <w:p/>
     <w:p>
+      <w:proofErr w:type="spellStart"/>
       <w:r>
         <w:rPr>
           <w:b/>
@@ -639,6 +660,7 @@
         </w:rPr>
         <w:t>Keywords</w:t>
       </w:r>
+      <w:proofErr w:type="spellEnd"/>
       <w:r>
         <w:t xml:space="preserve">: </w:t>
       </w:r>
@@ -2749,12 +2771,104 @@
       </w:r>
     </w:p>
     <w:p>
-      <w:r>
-        <w:t>Python como lenguaje de programación, Flask para la aplicación web, manejo de API oficial de Riot Games para extracción de datos de miles de partidas para conseguir el winrate de los camepones a nivel individual</w:t>
-      </w:r>
-      <w:r>
-        <w:t>, mongodb para la base de datos</w:t>
-      </w:r>
+      <w:proofErr w:type="spellStart"/>
+      <w:r>
+        <w:t>Backend</w:t>
+      </w:r>
+      <w:proofErr w:type="spellEnd"/>
+      <w:r>
+        <w:t xml:space="preserve">: Python y </w:t>
+      </w:r>
+      <w:proofErr w:type="spellStart"/>
+      <w:r>
+        <w:t>flask</w:t>
+      </w:r>
+      <w:proofErr w:type="spellEnd"/>
+    </w:p>
+    <w:p>
+      <w:r>
+        <w:t>Base de datos: SQLite (</w:t>
+      </w:r>
+      <w:proofErr w:type="spellStart"/>
+      <w:r>
+        <w:t>knowledge.db</w:t>
+      </w:r>
+      <w:proofErr w:type="spellEnd"/>
+      <w:r>
+        <w:t xml:space="preserve">) con tablas </w:t>
+      </w:r>
+      <w:proofErr w:type="spellStart"/>
+      <w:r>
+        <w:t>champions</w:t>
+      </w:r>
+      <w:proofErr w:type="spellEnd"/>
+      <w:r>
+        <w:t xml:space="preserve"> y </w:t>
+      </w:r>
+      <w:proofErr w:type="spellStart"/>
+      <w:r>
+        <w:t>matchups</w:t>
+      </w:r>
+      <w:proofErr w:type="spellEnd"/>
+    </w:p>
+    <w:p>
+      <w:r>
+        <w:t>Motor experto: Sistema de inferencia propio (encadenamiento hacia adelante) con hechos y reglas definidas en Python</w:t>
+      </w:r>
+    </w:p>
+    <w:p>
+      <w:r>
+        <w:t>API externa: Riot Games API (League V4 + Match V5) para extracción de datos reales</w:t>
+      </w:r>
+    </w:p>
+    <w:p>
+      <w:r>
+        <w:t xml:space="preserve">Datos: </w:t>
+      </w:r>
+      <w:proofErr w:type="spellStart"/>
+      <w:r>
+        <w:t>champions.json</w:t>
+      </w:r>
+      <w:proofErr w:type="spellEnd"/>
+      <w:r>
+        <w:t xml:space="preserve"> (fuente original) migrada a SQLite raw_matchups.csv (salida de extracción)</w:t>
+      </w:r>
+    </w:p>
+    <w:p>
+      <w:proofErr w:type="spellStart"/>
+      <w:r>
+        <w:t>Frontend</w:t>
+      </w:r>
+      <w:proofErr w:type="spellEnd"/>
+      <w:r>
+        <w:t xml:space="preserve">: HTML + CSS + JavaScript </w:t>
+      </w:r>
+      <w:proofErr w:type="spellStart"/>
+      <w:r>
+        <w:t>vanilla</w:t>
+      </w:r>
+      <w:proofErr w:type="spellEnd"/>
+      <w:r>
+        <w:t xml:space="preserve"> (jinja2 </w:t>
+      </w:r>
+      <w:proofErr w:type="spellStart"/>
+      <w:r>
+        <w:t>templates</w:t>
+      </w:r>
+      <w:proofErr w:type="spellEnd"/>
+      <w:r>
+        <w:t xml:space="preserve"> vía Flask)</w:t>
+      </w:r>
+    </w:p>
+    <w:p>
+      <w:r>
+        <w:t xml:space="preserve">Testing: </w:t>
+      </w:r>
+      <w:proofErr w:type="spellStart"/>
+      <w:r>
+        <w:t>Pytest</w:t>
+      </w:r>
+      <w:proofErr w:type="spellEnd"/>
     </w:p>
     <w:p/>
     <w:p>
@@ -2774,11 +2888,21 @@
     </w:p>
     <w:p>
       <w:r>
-        <w:t>La industria de los deportes electrónicos, también conocidos como eSports, ha experimentado un crecimiento exponencial en la última década, consolidándose como uno de los sectores más rentables e innovadores del entretenimiento digital (</w:t>
-      </w:r>
+        <w:t xml:space="preserve">La industria de los deportes electrónicos, también conocidos como </w:t>
+      </w:r>
+      <w:proofErr w:type="spellStart"/>
+      <w:r>
+        <w:t>eSports</w:t>
+      </w:r>
+      <w:proofErr w:type="spellEnd"/>
+      <w:r>
+        <w:t>, ha experimentado un crecimiento exponencial en la última década, consolidándose como uno de los sectores más rentables e innovadores del entretenimiento digital (</w:t>
+      </w:r>
+      <w:proofErr w:type="spellStart"/>
       <w:r>
         <w:t>Arık</w:t>
       </w:r>
+      <w:proofErr w:type="spellEnd"/>
       <w:r>
         <w:t xml:space="preserve">, </w:t>
       </w:r>
@@ -2789,21 +2913,109 @@
         <w:t>)</w:t>
       </w:r>
       <w:r>
-        <w:t>. Dentro de este ámbito, los juegos de tipo Multiplayer Online Battle Arena, también conocidos popularmente como MOBA, y en particular League Of Legends, presentan desafíos computacionales de primer nivel. Con un elenco de más de 170 campeones disponibles en la actualidad (Riot Games, s.f.) y miles de permutaciones de objetos, considero que la fase de selección de personaje (Draft) y la itemización generan un espacio de estados combinatorio masivo (“The Architecture of Intelligence”, s.f.). En este entorno, la victoria no depende únicamente de la habilidad mecánica del jugador, sino de decisiones stratégicas que mximicen las sinergias del equipo y neutralicen la composición rival.</w:t>
-      </w:r>
-    </w:p>
-    <w:p>
-      <w:r>
-        <w:t>A pesar de que el estado del arte ha porpuesto múltiples modelos de Aprendizaje Automático (Machine Learning) capaces de predecir el resultado de una partida con precisiones superiores al 75% (Do et al., 2021), observo que estos enfoques estadísticos y de redes neuronales a menudo operan como “cajas negras”. La falta de transparencia en sus predicciones limita severamente su adopción por parte de los usuarios, quienes necesitan comprender el razonamiento detrás de una recomendación para mejorar su aprendizaje estratégico (García-Méndez &amp; de Arriba-Pérez, s.f.).</w:t>
-      </w:r>
-    </w:p>
-    <w:p>
-      <w:r>
-        <w:t xml:space="preserve">Esta investigación surge de mi motivación por resolver dicha limitación mediante la creación de un Sistema Experto basado en reglas lógicas. A diferencia de los modelos puramente probabilísticos, propongo un sistema experto capaz de manejar la incertidumbre táctica </w:t>
+        <w:t xml:space="preserve">. Dentro de este ámbito, los juegos de tipo </w:t>
+      </w:r>
+      <w:proofErr w:type="spellStart"/>
+      <w:r>
+        <w:t>Multiplayer</w:t>
+      </w:r>
+      <w:proofErr w:type="spellEnd"/>
+      <w:r>
+        <w:t xml:space="preserve"> Online Battle Arena, también conocidos popularmente como MOBA, y en particular League Of Legends, presentan desafíos computacionales de primer nivel. Con un elenco de más de 170 campeones disponibles en la actualidad (Riot Games, s.f.) y miles de permutaciones de objetos, considero que la fase de selección de personaje (Draft) y la itemización generan un espacio de estados combinatorio masivo (“The </w:t>
+      </w:r>
+      <w:proofErr w:type="spellStart"/>
+      <w:r>
+        <w:t>Architecture</w:t>
+      </w:r>
+      <w:proofErr w:type="spellEnd"/>
+      <w:r>
+        <w:t xml:space="preserve"> of </w:t>
+      </w:r>
+      <w:proofErr w:type="spellStart"/>
+      <w:r>
+        <w:t>Intelligence</w:t>
+      </w:r>
+      <w:proofErr w:type="spellEnd"/>
+      <w:r>
+        <w:t xml:space="preserve">”, s.f.). En este entorno, la victoria no depende únicamente de la habilidad mecánica del jugador, sino de decisiones </w:t>
+      </w:r>
+      <w:proofErr w:type="spellStart"/>
+      <w:r>
+        <w:t>stratégicas</w:t>
+      </w:r>
+      <w:proofErr w:type="spellEnd"/>
+      <w:r>
+        <w:t xml:space="preserve"> que </w:t>
+      </w:r>
+      <w:proofErr w:type="spellStart"/>
+      <w:r>
+        <w:t>mximicen</w:t>
+      </w:r>
+      <w:proofErr w:type="spellEnd"/>
+      <w:r>
+        <w:t xml:space="preserve"> las sinergias del equipo y neutralicen la composición rival.</w:t>
+      </w:r>
+    </w:p>
+    <w:p>
+      <w:r>
+        <w:t xml:space="preserve">A pesar de que el estado del arte ha </w:t>
+      </w:r>
+      <w:proofErr w:type="spellStart"/>
+      <w:r>
+        <w:t>porpuesto</w:t>
+      </w:r>
+      <w:proofErr w:type="spellEnd"/>
+      <w:r>
+        <w:t xml:space="preserve"> múltiples modelos de Aprendizaje Automático (Machine Learning) capaces de predecir el resultado de una partida con precisiones superiores al 75% (Do et al., 2021), observo que estos enfoques estadísticos y de redes neuronales a </w:t>
       </w:r>
       <w:r>
         <w:lastRenderedPageBreak/>
-        <w:t>mediante inferencias (potencialmente ampliada con lógica difusa) y de ofrecer explicabilidad (Explainable AI). Considero esto un equisito fundamental para garanizar la confianza del jugador, al justificar en lenguaje natural por qué una decisión es óptima dadas las circunstancias del juego (“The Architecut”)</w:t>
+        <w:t>menudo operan como “cajas negras”. La falta de transparencia en sus predicciones limita severamente su adopción por parte de los usuarios, quienes necesitan comprender el razonamiento detrás de una recomendación para mejorar su aprendizaje estratégico (García-Méndez &amp; de Arriba-Pérez, s.f.).</w:t>
+      </w:r>
+    </w:p>
+    <w:p>
+      <w:r>
+        <w:t xml:space="preserve">Esta investigación surge de mi motivación por resolver dicha limitación mediante la creación de un Sistema Experto basado en reglas lógicas. A diferencia de los modelos puramente probabilísticos, propongo un sistema experto capaz de manejar la incertidumbre táctica mediante inferencias (potencialmente ampliada con lógica difusa) y de ofrecer </w:t>
+      </w:r>
+      <w:proofErr w:type="spellStart"/>
+      <w:r>
+        <w:t>explicabilidad</w:t>
+      </w:r>
+      <w:proofErr w:type="spellEnd"/>
+      <w:r>
+        <w:t xml:space="preserve"> (</w:t>
+      </w:r>
+      <w:proofErr w:type="spellStart"/>
+      <w:r>
+        <w:t>Explainable</w:t>
+      </w:r>
+      <w:proofErr w:type="spellEnd"/>
+      <w:r>
+        <w:t xml:space="preserve"> AI). Considero esto un </w:t>
+      </w:r>
+      <w:proofErr w:type="spellStart"/>
+      <w:r>
+        <w:t>equisito</w:t>
+      </w:r>
+      <w:proofErr w:type="spellEnd"/>
+      <w:r>
+        <w:t xml:space="preserve"> fundamental para </w:t>
+      </w:r>
+      <w:proofErr w:type="spellStart"/>
+      <w:r>
+        <w:t>garanizar</w:t>
+      </w:r>
+      <w:proofErr w:type="spellEnd"/>
+      <w:r>
+        <w:t xml:space="preserve"> la confianza del jugador, al justificar en lenguaje natural por qué una decisión es óptima dadas las circunstancias del juego (“The </w:t>
+      </w:r>
+      <w:proofErr w:type="spellStart"/>
+      <w:r>
+        <w:t>Architecut</w:t>
+      </w:r>
+      <w:proofErr w:type="spellEnd"/>
+      <w:r>
+        <w:t>”)</w:t>
       </w:r>
     </w:p>
     <w:p>
@@ -2927,7 +3139,11 @@
         <w:t>cada capítulo debe comenzar siempre en una nueva página</w:t>
       </w:r>
       <w:r>
-        <w:t>. Puedes utilizar las herramientas de “Disposición” del procesador de textos para introducir un salgo de página. De este modo, aunque amplíes el tamaño de un capítulo, los que vienen a continuación comenzarán siempre al inicio de una nueva página.</w:t>
+        <w:t xml:space="preserve">. Puedes utilizar las herramientas de “Disposición” del procesador de textos para introducir un salgo de página. </w:t>
+      </w:r>
+      <w:r>
+        <w:lastRenderedPageBreak/>
+        <w:t>De este modo, aunque amplíes el tamaño de un capítulo, los que vienen a continuación comenzarán siempre al inicio de una nueva página.</w:t>
       </w:r>
     </w:p>
     <w:p>
@@ -2979,7 +3195,6 @@
       </w:pPr>
       <w:bookmarkStart w:id="8" w:name="_Toc149554661"/>
       <w:r>
-        <w:lastRenderedPageBreak/>
         <w:t>“T</w:t>
       </w:r>
       <w:r>
@@ -7501,6 +7716,10 @@
 </file>
 
 <file path=customXml/item1.xml><?xml version="1.0" encoding="utf-8"?>
+<b:Sources xmlns:b="http://schemas.openxmlformats.org/officeDocument/2006/bibliography" xmlns="http://schemas.openxmlformats.org/officeDocument/2006/bibliography" SelectedStyle="\APASixthEditionOfficeOnline.xsl" StyleName="APA" Version="6"/>
+</file>
+
+<file path=customXml/item2.xml><?xml version="1.0" encoding="utf-8"?>
 <?mso-contentType ?>
 <FormTemplates xmlns="http://schemas.microsoft.com/sharepoint/v3/contenttype/forms">
   <Display>DocumentLibraryForm</Display>
@@ -7509,23 +7728,7 @@
 </FormTemplates>
 </file>
 
-<file path=customXml/item2.xml><?xml version="1.0" encoding="utf-8"?>
-<b:Sources xmlns:b="http://schemas.openxmlformats.org/officeDocument/2006/bibliography" xmlns="http://schemas.openxmlformats.org/officeDocument/2006/bibliography" SelectedStyle="\APASixthEditionOfficeOnline.xsl" StyleName="APA" Version="6"/>
-</file>
-
 <file path=customXml/item3.xml><?xml version="1.0" encoding="utf-8"?>
-<p:properties xmlns:p="http://schemas.microsoft.com/office/2006/metadata/properties" xmlns:xsi="http://www.w3.org/2001/XMLSchema-instance" xmlns:pc="http://schemas.microsoft.com/office/infopath/2007/PartnerControls">
-  <documentManagement>
-    <TaxCatchAll xmlns="0a70e875-3d35-4be2-921f-7117c31bab9b" xsi:nil="true"/>
-    <lcf76f155ced4ddcb4097134ff3c332f xmlns="27c1adeb-3674-457c-b08c-8a73f31b6e23">
-      <Terms xmlns="http://schemas.microsoft.com/office/infopath/2007/PartnerControls"/>
-    </lcf76f155ced4ddcb4097134ff3c332f>
-    <_Flow_SignoffStatus xmlns="27c1adeb-3674-457c-b08c-8a73f31b6e23" xsi:nil="true"/>
-  </documentManagement>
-</p:properties>
-</file>
-
-<file path=customXml/item4.xml><?xml version="1.0" encoding="utf-8"?>
 <ct:contentTypeSchema xmlns:ct="http://schemas.microsoft.com/office/2006/metadata/contentType" xmlns:ma="http://schemas.microsoft.com/office/2006/metadata/properties/metaAttributes" ct:_="" ma:_="" ma:contentTypeName="Documento" ma:contentTypeID="0x010100DF3D7C797EA12745A270EF30E38719B9" ma:contentTypeVersion="19" ma:contentTypeDescription="Crear nuevo documento." ma:contentTypeScope="" ma:versionID="227b02526234ef39b0b78895a9d90cf5">
   <xsd:schema xmlns:xsd="http://www.w3.org/2001/XMLSchema" xmlns:xs="http://www.w3.org/2001/XMLSchema" xmlns:p="http://schemas.microsoft.com/office/2006/metadata/properties" xmlns:ns2="0a70e875-3d35-4be2-921f-7117c31bab9b" xmlns:ns3="27c1adeb-3674-457c-b08c-8a73f31b6e23" targetNamespace="http://schemas.microsoft.com/office/2006/metadata/properties" ma:root="true" ma:fieldsID="3c939c8607e2f594db8bbb23634dd059" ns2:_="" ns3:_="">
     <xsd:import namespace="0a70e875-3d35-4be2-921f-7117c31bab9b"/>
@@ -7786,7 +7989,27 @@
 </ct:contentTypeSchema>
 </file>
 
+<file path=customXml/item4.xml><?xml version="1.0" encoding="utf-8"?>
+<p:properties xmlns:p="http://schemas.microsoft.com/office/2006/metadata/properties" xmlns:xsi="http://www.w3.org/2001/XMLSchema-instance" xmlns:pc="http://schemas.microsoft.com/office/infopath/2007/PartnerControls">
+  <documentManagement>
+    <TaxCatchAll xmlns="0a70e875-3d35-4be2-921f-7117c31bab9b" xsi:nil="true"/>
+    <lcf76f155ced4ddcb4097134ff3c332f xmlns="27c1adeb-3674-457c-b08c-8a73f31b6e23">
+      <Terms xmlns="http://schemas.microsoft.com/office/infopath/2007/PartnerControls"/>
+    </lcf76f155ced4ddcb4097134ff3c332f>
+    <_Flow_SignoffStatus xmlns="27c1adeb-3674-457c-b08c-8a73f31b6e23" xsi:nil="true"/>
+  </documentManagement>
+</p:properties>
+</file>
+
 <file path=customXml/itemProps1.xml><?xml version="1.0" encoding="utf-8"?>
+<ds:datastoreItem xmlns:ds="http://schemas.openxmlformats.org/officeDocument/2006/customXml" ds:itemID="{FD1A1271-5F91-421F-91AA-F5599BF2C903}">
+  <ds:schemaRefs>
+    <ds:schemaRef ds:uri="http://schemas.openxmlformats.org/officeDocument/2006/bibliography"/>
+  </ds:schemaRefs>
+</ds:datastoreItem>
+</file>
+
+<file path=customXml/itemProps2.xml><?xml version="1.0" encoding="utf-8"?>
 <ds:datastoreItem xmlns:ds="http://schemas.openxmlformats.org/officeDocument/2006/customXml" ds:itemID="{5B3F4A43-888D-4D33-BD1C-7066736CDCB4}">
   <ds:schemaRefs>
     <ds:schemaRef ds:uri="http://schemas.microsoft.com/sharepoint/v3/contenttype/forms"/>
@@ -7794,26 +8017,7 @@
 </ds:datastoreItem>
 </file>
 
-<file path=customXml/itemProps2.xml><?xml version="1.0" encoding="utf-8"?>
-<ds:datastoreItem xmlns:ds="http://schemas.openxmlformats.org/officeDocument/2006/customXml" ds:itemID="{FD1A1271-5F91-421F-91AA-F5599BF2C903}">
-  <ds:schemaRefs>
-    <ds:schemaRef ds:uri="http://schemas.openxmlformats.org/officeDocument/2006/bibliography"/>
-  </ds:schemaRefs>
-</ds:datastoreItem>
-</file>
-
 <file path=customXml/itemProps3.xml><?xml version="1.0" encoding="utf-8"?>
-<ds:datastoreItem xmlns:ds="http://schemas.openxmlformats.org/officeDocument/2006/customXml" ds:itemID="{1F3C1B10-EE25-478F-A378-26280E5A2662}">
-  <ds:schemaRefs>
-    <ds:schemaRef ds:uri="http://schemas.microsoft.com/office/2006/metadata/properties"/>
-    <ds:schemaRef ds:uri="http://schemas.microsoft.com/office/infopath/2007/PartnerControls"/>
-    <ds:schemaRef ds:uri="0a70e875-3d35-4be2-921f-7117c31bab9b"/>
-    <ds:schemaRef ds:uri="27c1adeb-3674-457c-b08c-8a73f31b6e23"/>
-  </ds:schemaRefs>
-</ds:datastoreItem>
-</file>
-
-<file path=customXml/itemProps4.xml><?xml version="1.0" encoding="utf-8"?>
 <ds:datastoreItem xmlns:ds="http://schemas.openxmlformats.org/officeDocument/2006/customXml" ds:itemID="{3624E214-1B8A-4A51-B10D-C847268B4539}">
   <ds:schemaRefs>
     <ds:schemaRef ds:uri="http://schemas.microsoft.com/office/2006/metadata/contentType"/>
@@ -7830,4 +8034,15 @@
     <ds:schemaRef ds:uri="http://schemas.microsoft.com/internal/obd"/>
   </ds:schemaRefs>
 </ds:datastoreItem>
+</file>
+
+<file path=customXml/itemProps4.xml><?xml version="1.0" encoding="utf-8"?>
+<ds:datastoreItem xmlns:ds="http://schemas.openxmlformats.org/officeDocument/2006/customXml" ds:itemID="{1F3C1B10-EE25-478F-A378-26280E5A2662}">
+  <ds:schemaRefs>
+    <ds:schemaRef ds:uri="http://schemas.microsoft.com/office/2006/metadata/properties"/>
+    <ds:schemaRef ds:uri="http://schemas.microsoft.com/office/infopath/2007/PartnerControls"/>
+    <ds:schemaRef ds:uri="0a70e875-3d35-4be2-921f-7117c31bab9b"/>
+    <ds:schemaRef ds:uri="27c1adeb-3674-457c-b08c-8a73f31b6e23"/>
+  </ds:schemaRefs>
+</ds:datastoreItem>
 </file>
</xml_diff>

<commit_message>
Update plantilla.docx and remove python file
Replace docs/plantilla.docx with an updated binary version and delete the top-level `python` file (removed from repository). This cleans up the repo by removing the obsolete python artifact and updating the documentation template.
</commit_message>
<xml_diff>
--- a/docs/plantilla.docx
+++ b/docs/plantilla.docx
@@ -359,25 +359,7 @@
                 <w:sz w:val="24"/>
                 <w:szCs w:val="28"/>
               </w:rPr>
-              <w:t xml:space="preserve">Claudia Blanca </w:t>
-            </w:r>
-            <w:proofErr w:type="spellStart"/>
-            <w:r>
-              <w:rPr>
-                <w:rFonts w:asciiTheme="majorHAnsi" w:hAnsiTheme="majorHAnsi" w:cs="Tahoma"/>
-                <w:sz w:val="24"/>
-                <w:szCs w:val="28"/>
-              </w:rPr>
-              <w:t>Gonzalez</w:t>
-            </w:r>
-            <w:proofErr w:type="spellEnd"/>
-            <w:r>
-              <w:rPr>
-                <w:rFonts w:asciiTheme="majorHAnsi" w:hAnsiTheme="majorHAnsi" w:cs="Tahoma"/>
-                <w:sz w:val="24"/>
-                <w:szCs w:val="28"/>
-              </w:rPr>
-              <w:t xml:space="preserve"> Calleros</w:t>
+              <w:t>Claudia Blanca Gonzalez Calleros</w:t>
             </w:r>
           </w:p>
         </w:tc>
@@ -529,6 +511,350 @@
         <w:rPr>
           <w:lang w:eastAsia="en-US"/>
         </w:rPr>
+        <w:t>En este trabajo de fin de grado he creado una aplicación con la función de ayudar a personas en la toma de decisiones en el videojuego League of Legends (LoL), un videojuego con una cantidad de variables y posibilidades inmensas, cada decisión tomada dentro del juego es relevante y podría ser decisiva para obtener la victoria en la partida en muchos casos.</w:t>
+      </w:r>
+    </w:p>
+    <w:p>
+      <w:pPr>
+        <w:rPr>
+          <w:lang w:eastAsia="en-US"/>
+        </w:rPr>
+      </w:pPr>
+    </w:p>
+    <w:p>
+      <w:pPr>
+        <w:rPr>
+          <w:lang w:eastAsia="en-US"/>
+        </w:rPr>
+      </w:pPr>
+      <w:r>
+        <w:rPr>
+          <w:lang w:eastAsia="en-US"/>
+        </w:rPr>
+        <w:t>La tecnología empleada para el desarrollo de la aplicación para solventar estos problemas es la siguiente:</w:t>
+      </w:r>
+    </w:p>
+    <w:p>
+      <w:pPr>
+        <w:pStyle w:val="Prrafodelista"/>
+        <w:numPr>
+          <w:ilvl w:val="0"/>
+          <w:numId w:val="25"/>
+        </w:numPr>
+        <w:rPr>
+          <w:lang w:eastAsia="en-US"/>
+        </w:rPr>
+      </w:pPr>
+      <w:r>
+        <w:rPr>
+          <w:lang w:eastAsia="en-US"/>
+        </w:rPr>
+        <w:t>Backend: Python + Flask</w:t>
+      </w:r>
+    </w:p>
+    <w:p>
+      <w:pPr>
+        <w:pStyle w:val="Prrafodelista"/>
+        <w:numPr>
+          <w:ilvl w:val="0"/>
+          <w:numId w:val="25"/>
+        </w:numPr>
+        <w:rPr>
+          <w:lang w:eastAsia="en-US"/>
+        </w:rPr>
+      </w:pPr>
+      <w:r>
+        <w:rPr>
+          <w:lang w:eastAsia="en-US"/>
+        </w:rPr>
+        <w:t>Frontend: HTML + CSS + JavaScrip</w:t>
+      </w:r>
+      <w:r>
+        <w:rPr>
+          <w:lang w:eastAsia="en-US"/>
+        </w:rPr>
+        <w:t>t</w:t>
+      </w:r>
+    </w:p>
+    <w:p>
+      <w:pPr>
+        <w:pStyle w:val="Prrafodelista"/>
+        <w:numPr>
+          <w:ilvl w:val="0"/>
+          <w:numId w:val="25"/>
+        </w:numPr>
+        <w:rPr>
+          <w:lang w:eastAsia="en-US"/>
+        </w:rPr>
+      </w:pPr>
+      <w:r>
+        <w:rPr>
+          <w:lang w:eastAsia="en-US"/>
+        </w:rPr>
+        <w:t xml:space="preserve">Base de </w:t>
+      </w:r>
+      <w:r>
+        <w:rPr>
+          <w:lang w:eastAsia="en-US"/>
+        </w:rPr>
+        <w:t>D</w:t>
+      </w:r>
+      <w:r>
+        <w:rPr>
+          <w:lang w:eastAsia="en-US"/>
+        </w:rPr>
+        <w:t>atos: SQLite</w:t>
+      </w:r>
+    </w:p>
+    <w:p>
+      <w:pPr>
+        <w:pStyle w:val="Prrafodelista"/>
+        <w:numPr>
+          <w:ilvl w:val="0"/>
+          <w:numId w:val="25"/>
+        </w:numPr>
+        <w:rPr>
+          <w:lang w:eastAsia="en-US"/>
+        </w:rPr>
+      </w:pPr>
+      <w:r>
+        <w:rPr>
+          <w:lang w:eastAsia="en-US"/>
+        </w:rPr>
+        <w:t xml:space="preserve">Motor </w:t>
+      </w:r>
+      <w:r>
+        <w:rPr>
+          <w:lang w:eastAsia="en-US"/>
+        </w:rPr>
+        <w:t>E</w:t>
+      </w:r>
+      <w:r>
+        <w:rPr>
+          <w:lang w:eastAsia="en-US"/>
+        </w:rPr>
+        <w:t>xperto: Sistema de inferencias propio (encadenamiento hacia adelante) con hechos y reglas definidas</w:t>
+      </w:r>
+    </w:p>
+    <w:p>
+      <w:pPr>
+        <w:pStyle w:val="Prrafodelista"/>
+        <w:numPr>
+          <w:ilvl w:val="0"/>
+          <w:numId w:val="25"/>
+        </w:numPr>
+        <w:rPr>
+          <w:lang w:eastAsia="en-US"/>
+        </w:rPr>
+      </w:pPr>
+      <w:r>
+        <w:rPr>
+          <w:lang w:eastAsia="en-US"/>
+        </w:rPr>
+        <w:t xml:space="preserve">API </w:t>
+      </w:r>
+      <w:r>
+        <w:rPr>
+          <w:lang w:eastAsia="en-US"/>
+        </w:rPr>
+        <w:t>E</w:t>
+      </w:r>
+      <w:r>
+        <w:rPr>
+          <w:lang w:eastAsia="en-US"/>
+        </w:rPr>
+        <w:t>xternas: Riot Games API (League V4 + Match V5) para extracción de datos reales</w:t>
+      </w:r>
+    </w:p>
+    <w:p>
+      <w:pPr>
+        <w:rPr>
+          <w:lang w:eastAsia="en-US"/>
+        </w:rPr>
+      </w:pPr>
+    </w:p>
+    <w:p>
+      <w:pPr>
+        <w:rPr>
+          <w:lang w:eastAsia="en-US"/>
+        </w:rPr>
+      </w:pPr>
+      <w:r>
+        <w:rPr>
+          <w:lang w:eastAsia="en-US"/>
+        </w:rPr>
+        <w:t xml:space="preserve">En </w:t>
+      </w:r>
+      <w:r>
+        <w:rPr>
+          <w:lang w:eastAsia="en-US"/>
+        </w:rPr>
+        <w:t>este</w:t>
+      </w:r>
+      <w:r>
+        <w:rPr>
+          <w:lang w:eastAsia="en-US"/>
+        </w:rPr>
+        <w:t xml:space="preserve"> trabajo se </w:t>
+      </w:r>
+      <w:r>
+        <w:rPr>
+          <w:lang w:eastAsia="en-US"/>
+        </w:rPr>
+        <w:t>explican</w:t>
+      </w:r>
+      <w:r>
+        <w:rPr>
+          <w:lang w:eastAsia="en-US"/>
+        </w:rPr>
+        <w:t xml:space="preserve"> las funcionalidades básicas </w:t>
+      </w:r>
+      <w:r>
+        <w:rPr>
+          <w:lang w:eastAsia="en-US"/>
+        </w:rPr>
+        <w:t xml:space="preserve">y variables </w:t>
+      </w:r>
+      <w:r>
+        <w:rPr>
+          <w:lang w:eastAsia="en-US"/>
+        </w:rPr>
+        <w:t xml:space="preserve">del videojuego </w:t>
+      </w:r>
+      <w:r>
+        <w:rPr>
+          <w:lang w:eastAsia="en-US"/>
+        </w:rPr>
+        <w:t>para</w:t>
+      </w:r>
+      <w:r>
+        <w:rPr>
+          <w:lang w:eastAsia="en-US"/>
+        </w:rPr>
+        <w:t xml:space="preserve"> </w:t>
+      </w:r>
+      <w:r>
+        <w:rPr>
+          <w:lang w:eastAsia="en-US"/>
+        </w:rPr>
+        <w:t xml:space="preserve">poder </w:t>
+      </w:r>
+      <w:r>
+        <w:rPr>
+          <w:lang w:eastAsia="en-US"/>
+        </w:rPr>
+        <w:t>tener</w:t>
+      </w:r>
+      <w:r>
+        <w:rPr>
+          <w:lang w:eastAsia="en-US"/>
+        </w:rPr>
+        <w:t>las</w:t>
+      </w:r>
+      <w:r>
+        <w:rPr>
+          <w:lang w:eastAsia="en-US"/>
+        </w:rPr>
+        <w:t xml:space="preserve"> en cuenta</w:t>
+      </w:r>
+      <w:r>
+        <w:rPr>
+          <w:lang w:eastAsia="en-US"/>
+        </w:rPr>
+        <w:t>,</w:t>
+      </w:r>
+      <w:r>
+        <w:rPr>
+          <w:lang w:eastAsia="en-US"/>
+        </w:rPr>
+        <w:t xml:space="preserve"> </w:t>
+      </w:r>
+      <w:r>
+        <w:rPr>
+          <w:lang w:eastAsia="en-US"/>
+        </w:rPr>
+        <w:t>de esta forma</w:t>
+      </w:r>
+      <w:r>
+        <w:rPr>
+          <w:lang w:eastAsia="en-US"/>
+        </w:rPr>
+        <w:t xml:space="preserve"> el programa recomiende la mejor decisión lógica </w:t>
+      </w:r>
+      <w:r>
+        <w:rPr>
+          <w:lang w:eastAsia="en-US"/>
+        </w:rPr>
+        <w:t>buscando</w:t>
+      </w:r>
+      <w:r>
+        <w:rPr>
+          <w:lang w:eastAsia="en-US"/>
+        </w:rPr>
+        <w:t xml:space="preserve"> aumentar la probabilidad de victoria en la partida</w:t>
+      </w:r>
+      <w:r>
+        <w:rPr>
+          <w:lang w:eastAsia="en-US"/>
+        </w:rPr>
+        <w:t xml:space="preserve"> mediante una recomendación de personaje en la fase de selección de personaje y recomendaciones de objetos y anotaciones a tener en cuenta para la partida</w:t>
+      </w:r>
+      <w:r>
+        <w:rPr>
+          <w:lang w:eastAsia="en-US"/>
+        </w:rPr>
+        <w:t>.</w:t>
+      </w:r>
+    </w:p>
+    <w:p>
+      <w:pPr>
+        <w:rPr>
+          <w:lang w:eastAsia="en-US"/>
+        </w:rPr>
+      </w:pPr>
+    </w:p>
+    <w:p>
+      <w:pPr>
+        <w:rPr>
+          <w:lang w:eastAsia="en-US"/>
+        </w:rPr>
+      </w:pPr>
+      <w:r>
+        <w:rPr>
+          <w:lang w:eastAsia="en-US"/>
+        </w:rPr>
+        <w:t xml:space="preserve">(Aquí pondría las principales conclusiones del trabajo para finalizar el </w:t>
+      </w:r>
+      <w:r>
+        <w:rPr>
+          <w:lang w:eastAsia="en-US"/>
+        </w:rPr>
+        <w:t>resumen,</w:t>
+      </w:r>
+      <w:r>
+        <w:rPr>
+          <w:lang w:eastAsia="en-US"/>
+        </w:rPr>
+        <w:t xml:space="preserve"> pero aún no lo he terminado)</w:t>
+      </w:r>
+    </w:p>
+    <w:p>
+      <w:pPr>
+        <w:rPr>
+          <w:lang w:eastAsia="en-US"/>
+        </w:rPr>
+      </w:pPr>
+    </w:p>
+    <w:p>
+      <w:pPr>
+        <w:rPr>
+          <w:lang w:eastAsia="en-US"/>
+        </w:rPr>
+      </w:pPr>
+      <w:r>
+        <w:rPr>
+          <w:lang w:eastAsia="en-US"/>
+        </w:rPr>
         <w:t xml:space="preserve">Redacta un resumen de todo el trabajo, destacando los aspectos más importantes. Resume el problema de partida, el tipo de solución propuesta y las principales conclusiones de tu trabajo </w:t>
       </w:r>
       <w:r>
@@ -555,13 +881,6 @@
         </w:rPr>
         <w:t>.</w:t>
       </w:r>
-    </w:p>
-    <w:p>
-      <w:pPr>
-        <w:rPr>
-          <w:lang w:eastAsia="en-US"/>
-        </w:rPr>
-      </w:pPr>
     </w:p>
     <w:p>
       <w:pPr>
@@ -600,51 +919,272 @@
         </w:rPr>
         <w:t>.</w:t>
       </w:r>
-    </w:p>
-    <w:p>
-      <w:pPr>
-        <w:rPr>
-          <w:lang w:eastAsia="en-US"/>
-        </w:rPr>
-      </w:pPr>
-    </w:p>
-    <w:p>
-      <w:pPr>
-        <w:rPr>
-          <w:lang w:eastAsia="en-US"/>
-        </w:rPr>
-      </w:pPr>
-    </w:p>
-    <w:p>
-      <w:pPr>
-        <w:spacing w:before="0" w:after="0" w:line="240" w:lineRule="auto"/>
-        <w:jc w:val="left"/>
-        <w:rPr>
-          <w:lang w:eastAsia="en-US"/>
-        </w:rPr>
-      </w:pPr>
       <w:bookmarkStart w:id="0" w:name="_Toc437509152"/>
-      <w:r>
-        <w:rPr>
-          <w:lang w:eastAsia="en-US"/>
-        </w:rPr>
-        <w:br w:type="page"/>
-      </w:r>
     </w:p>
     <w:p>
       <w:pPr>
         <w:pStyle w:val="Ttulondices"/>
-      </w:pPr>
-      <w:proofErr w:type="spellStart"/>
+        <w:rPr>
+          <w:lang w:val="en-US"/>
+        </w:rPr>
+      </w:pPr>
       <w:r>
         <w:rPr>
           <w:highlight w:val="magenta"/>
+          <w:lang w:val="en-US"/>
         </w:rPr>
         <w:lastRenderedPageBreak/>
         <w:t>Abstract</w:t>
       </w:r>
-      <w:proofErr w:type="spellEnd"/>
-    </w:p>
+    </w:p>
+    <w:p>
+      <w:pPr>
+        <w:rPr>
+          <w:lang w:val="en-US"/>
+        </w:rPr>
+      </w:pPr>
+      <w:r>
+        <w:rPr>
+          <w:lang w:val="en-US"/>
+        </w:rPr>
+        <w:t xml:space="preserve">In this </w:t>
+      </w:r>
+      <w:r>
+        <w:rPr>
+          <w:lang w:val="en-US"/>
+        </w:rPr>
+        <w:t>B</w:t>
+      </w:r>
+      <w:r>
+        <w:rPr>
+          <w:lang w:val="en-US"/>
+        </w:rPr>
+        <w:t xml:space="preserve">achelor’s </w:t>
+      </w:r>
+      <w:r>
+        <w:rPr>
+          <w:lang w:val="en-US"/>
+        </w:rPr>
+        <w:t>T</w:t>
+      </w:r>
+      <w:r>
+        <w:rPr>
+          <w:lang w:val="en-US"/>
+        </w:rPr>
+        <w:t>h</w:t>
+      </w:r>
+      <w:r>
+        <w:rPr>
+          <w:lang w:val="en-US"/>
+        </w:rPr>
+        <w:t xml:space="preserve">esis, I have developed an application designed to assist users in </w:t>
+      </w:r>
+      <w:r>
+        <w:rPr>
+          <w:lang w:val="en-US"/>
+        </w:rPr>
+        <w:t>decision</w:t>
+      </w:r>
+      <w:r>
+        <w:rPr>
+          <w:lang w:val="en-US"/>
+        </w:rPr>
+        <w:t xml:space="preserve">-making within the video game League of Legends (LoL). Given the immense number of variables and possibilities in the game, every </w:t>
+      </w:r>
+      <w:r>
+        <w:rPr>
+          <w:lang w:val="en-US"/>
+        </w:rPr>
+        <w:t>decision</w:t>
+      </w:r>
+      <w:r>
+        <w:rPr>
+          <w:lang w:val="en-US"/>
+        </w:rPr>
+        <w:t xml:space="preserve"> made is relevant and can often be the deciding factor in securing a victory.</w:t>
+      </w:r>
+    </w:p>
+    <w:p>
+      <w:pPr>
+        <w:rPr>
+          <w:lang w:val="en-US"/>
+        </w:rPr>
+      </w:pPr>
+    </w:p>
+    <w:p>
+      <w:pPr>
+        <w:rPr>
+          <w:lang w:val="en-US"/>
+        </w:rPr>
+      </w:pPr>
+      <w:r>
+        <w:rPr>
+          <w:lang w:val="en-US"/>
+        </w:rPr>
+        <w:t>The technology stack used to develop the application and address these challenges is as follows:</w:t>
+      </w:r>
+    </w:p>
+    <w:p>
+      <w:pPr>
+        <w:pStyle w:val="Prrafodelista"/>
+        <w:numPr>
+          <w:ilvl w:val="0"/>
+          <w:numId w:val="25"/>
+        </w:numPr>
+      </w:pPr>
+      <w:r>
+        <w:t>Backend: Python + Flask</w:t>
+      </w:r>
+    </w:p>
+    <w:p>
+      <w:pPr>
+        <w:pStyle w:val="Prrafodelista"/>
+        <w:numPr>
+          <w:ilvl w:val="0"/>
+          <w:numId w:val="25"/>
+        </w:numPr>
+      </w:pPr>
+      <w:r>
+        <w:t>Frontend: HTML + CSS + JavaScript</w:t>
+      </w:r>
+    </w:p>
+    <w:p>
+      <w:pPr>
+        <w:pStyle w:val="Prrafodelista"/>
+        <w:numPr>
+          <w:ilvl w:val="0"/>
+          <w:numId w:val="25"/>
+        </w:numPr>
+      </w:pPr>
+      <w:r>
+        <w:t>Database: SQLite</w:t>
+      </w:r>
+    </w:p>
+    <w:p>
+      <w:pPr>
+        <w:pStyle w:val="Prrafodelista"/>
+        <w:numPr>
+          <w:ilvl w:val="0"/>
+          <w:numId w:val="25"/>
+        </w:numPr>
+        <w:rPr>
+          <w:lang w:val="en-US"/>
+        </w:rPr>
+      </w:pPr>
+      <w:r>
+        <w:rPr>
+          <w:lang w:val="en-US"/>
+        </w:rPr>
+        <w:t>Expert Engine: A custom inference system (forward chaining) with defined facts and rules</w:t>
+      </w:r>
+    </w:p>
+    <w:p>
+      <w:pPr>
+        <w:pStyle w:val="Prrafodelista"/>
+        <w:numPr>
+          <w:ilvl w:val="0"/>
+          <w:numId w:val="25"/>
+        </w:numPr>
+        <w:rPr>
+          <w:lang w:val="en-US"/>
+        </w:rPr>
+      </w:pPr>
+      <w:r>
+        <w:rPr>
+          <w:lang w:val="en-US"/>
+        </w:rPr>
+        <w:t>External APIs: Riot Games API</w:t>
+      </w:r>
+      <w:r>
+        <w:rPr>
+          <w:lang w:val="en-US"/>
+        </w:rPr>
+        <w:t xml:space="preserve"> </w:t>
+      </w:r>
+      <w:r>
+        <w:rPr>
+          <w:lang w:val="en-US"/>
+        </w:rPr>
+        <w:t>(League V4 + Match V5) for real-time data extraction</w:t>
+      </w:r>
+    </w:p>
+    <w:p>
+      <w:pPr>
+        <w:rPr>
+          <w:lang w:val="en-US"/>
+        </w:rPr>
+      </w:pPr>
+    </w:p>
+    <w:p>
+      <w:pPr>
+        <w:rPr>
+          <w:lang w:val="en-US"/>
+        </w:rPr>
+      </w:pPr>
+      <w:r>
+        <w:rPr>
+          <w:lang w:val="en-US"/>
+        </w:rPr>
+        <w:t>This t</w:t>
+      </w:r>
+      <w:r>
+        <w:rPr>
+          <w:lang w:val="en-US"/>
+        </w:rPr>
+        <w:t>h</w:t>
+      </w:r>
+      <w:r>
+        <w:rPr>
+          <w:lang w:val="en-US"/>
+        </w:rPr>
+        <w:t xml:space="preserve">esis explains the fundamental mechanics and variables of the game to ensure they are properly accounted for. Consequently, the program recommends the most logical decisions to increase the probability of winning, providing </w:t>
+      </w:r>
+      <w:r>
+        <w:rPr>
+          <w:lang w:val="en-US"/>
+        </w:rPr>
+        <w:t>champion</w:t>
+      </w:r>
+      <w:r>
+        <w:rPr>
+          <w:lang w:val="en-US"/>
+        </w:rPr>
+        <w:t xml:space="preserve"> suggestions during the champion select phase, as well as item recommendations and strategic notes to consider during the match.</w:t>
+      </w:r>
+    </w:p>
+    <w:p>
+      <w:pPr>
+        <w:rPr>
+          <w:lang w:val="en-US" w:eastAsia="en-US"/>
+        </w:rPr>
+      </w:pPr>
+    </w:p>
+    <w:p>
+      <w:pPr>
+        <w:rPr>
+          <w:lang w:eastAsia="en-US"/>
+        </w:rPr>
+      </w:pPr>
+      <w:r>
+        <w:rPr>
+          <w:lang w:eastAsia="en-US"/>
+        </w:rPr>
+        <w:t>(Aquí pondría las principales conclusiones del trabajo</w:t>
+      </w:r>
+      <w:r>
+        <w:rPr>
+          <w:lang w:eastAsia="en-US"/>
+        </w:rPr>
+        <w:t xml:space="preserve"> en inglés</w:t>
+      </w:r>
+      <w:r>
+        <w:rPr>
+          <w:lang w:eastAsia="en-US"/>
+        </w:rPr>
+        <w:t xml:space="preserve"> para finalizar el resumen, pero aún no lo he terminado)</w:t>
+      </w:r>
+    </w:p>
+    <w:p/>
     <w:p>
       <w:r>
         <w:t>Esta es una traducción al inglés del resumen anterior.</w:t>
@@ -652,7 +1192,6 @@
     </w:p>
     <w:p/>
     <w:p>
-      <w:proofErr w:type="spellStart"/>
       <w:r>
         <w:rPr>
           <w:b/>
@@ -660,7 +1199,6 @@
         </w:rPr>
         <w:t>Keywords</w:t>
       </w:r>
-      <w:proofErr w:type="spellEnd"/>
       <w:r>
         <w:t xml:space="preserve">: </w:t>
       </w:r>
@@ -2771,112 +3309,12 @@
       </w:r>
     </w:p>
     <w:p>
-      <w:proofErr w:type="spellStart"/>
-      <w:r>
-        <w:t>Backend</w:t>
-      </w:r>
-      <w:proofErr w:type="spellEnd"/>
-      <w:r>
-        <w:t xml:space="preserve">: Python y </w:t>
-      </w:r>
-      <w:proofErr w:type="spellStart"/>
-      <w:r>
-        <w:t>flask</w:t>
-      </w:r>
-      <w:proofErr w:type="spellEnd"/>
-    </w:p>
-    <w:p>
-      <w:r>
-        <w:t>Base de datos: SQLite (</w:t>
-      </w:r>
-      <w:proofErr w:type="spellStart"/>
-      <w:r>
-        <w:t>knowledge.db</w:t>
-      </w:r>
-      <w:proofErr w:type="spellEnd"/>
-      <w:r>
-        <w:t xml:space="preserve">) con tablas </w:t>
-      </w:r>
-      <w:proofErr w:type="spellStart"/>
-      <w:r>
-        <w:t>champions</w:t>
-      </w:r>
-      <w:proofErr w:type="spellEnd"/>
-      <w:r>
-        <w:t xml:space="preserve"> y </w:t>
-      </w:r>
-      <w:proofErr w:type="spellStart"/>
-      <w:r>
-        <w:t>matchups</w:t>
-      </w:r>
-      <w:proofErr w:type="spellEnd"/>
-    </w:p>
-    <w:p>
-      <w:r>
-        <w:t>Motor experto: Sistema de inferencia propio (encadenamiento hacia adelante) con hechos y reglas definidas en Python</w:t>
-      </w:r>
-    </w:p>
-    <w:p>
-      <w:r>
-        <w:t>API externa: Riot Games API (League V4 + Match V5) para extracción de datos reales</w:t>
-      </w:r>
-    </w:p>
-    <w:p>
-      <w:r>
-        <w:t xml:space="preserve">Datos: </w:t>
-      </w:r>
-      <w:proofErr w:type="spellStart"/>
-      <w:r>
-        <w:t>champions.json</w:t>
-      </w:r>
-      <w:proofErr w:type="spellEnd"/>
-      <w:r>
-        <w:t xml:space="preserve"> (fuente original) migrada a SQLite raw_matchups.csv (salida de extracción)</w:t>
-      </w:r>
-    </w:p>
-    <w:p>
-      <w:proofErr w:type="spellStart"/>
-      <w:r>
-        <w:t>Frontend</w:t>
-      </w:r>
-      <w:proofErr w:type="spellEnd"/>
-      <w:r>
-        <w:t xml:space="preserve">: HTML + CSS + JavaScript </w:t>
-      </w:r>
-      <w:proofErr w:type="spellStart"/>
-      <w:r>
-        <w:t>vanilla</w:t>
-      </w:r>
-      <w:proofErr w:type="spellEnd"/>
-      <w:r>
-        <w:t xml:space="preserve"> (jinja2 </w:t>
-      </w:r>
-      <w:proofErr w:type="spellStart"/>
-      <w:r>
-        <w:t>templates</w:t>
-      </w:r>
-      <w:proofErr w:type="spellEnd"/>
-      <w:r>
-        <w:t xml:space="preserve"> vía Flask)</w:t>
-      </w:r>
-    </w:p>
-    <w:p>
-      <w:r>
-        <w:t xml:space="preserve">Testing: </w:t>
-      </w:r>
-      <w:proofErr w:type="spellStart"/>
-      <w:r>
-        <w:t>Pytest</w:t>
-      </w:r>
-      <w:proofErr w:type="spellEnd"/>
+      <w:r>
+        <w:t xml:space="preserve">En </w:t>
+      </w:r>
     </w:p>
     <w:p/>
     <w:p>
-      <w:r>
-        <w:t>En la actualidad, la industria de los videojuegos experimenta unos cambios constantes,</w:t>
-      </w:r>
-    </w:p>
-    <w:p>
       <w:pPr>
         <w:pStyle w:val="Ttulo2"/>
       </w:pPr>
@@ -2888,21 +3326,11 @@
     </w:p>
     <w:p>
       <w:r>
-        <w:t xml:space="preserve">La industria de los deportes electrónicos, también conocidos como </w:t>
-      </w:r>
-      <w:proofErr w:type="spellStart"/>
-      <w:r>
-        <w:t>eSports</w:t>
-      </w:r>
-      <w:proofErr w:type="spellEnd"/>
-      <w:r>
-        <w:t>, ha experimentado un crecimiento exponencial en la última década, consolidándose como uno de los sectores más rentables e innovadores del entretenimiento digital (</w:t>
-      </w:r>
-      <w:proofErr w:type="spellStart"/>
+        <w:t>La industria de los deportes electrónicos, también conocidos como eSports, ha experimentado un crecimiento exponencial en la última década, consolidándose como uno de los sectores más rentables e innovadores del entretenimiento digital (</w:t>
+      </w:r>
       <w:r>
         <w:t>Arık</w:t>
       </w:r>
-      <w:proofErr w:type="spellEnd"/>
       <w:r>
         <w:t xml:space="preserve">, </w:t>
       </w:r>
@@ -2913,109 +3341,21 @@
         <w:t>)</w:t>
       </w:r>
       <w:r>
-        <w:t xml:space="preserve">. Dentro de este ámbito, los juegos de tipo </w:t>
-      </w:r>
-      <w:proofErr w:type="spellStart"/>
-      <w:r>
-        <w:t>Multiplayer</w:t>
-      </w:r>
-      <w:proofErr w:type="spellEnd"/>
-      <w:r>
-        <w:t xml:space="preserve"> Online Battle Arena, también conocidos popularmente como MOBA, y en particular League Of Legends, presentan desafíos computacionales de primer nivel. Con un elenco de más de 170 campeones disponibles en la actualidad (Riot Games, s.f.) y miles de permutaciones de objetos, considero que la fase de selección de personaje (Draft) y la itemización generan un espacio de estados combinatorio masivo (“The </w:t>
-      </w:r>
-      <w:proofErr w:type="spellStart"/>
-      <w:r>
-        <w:t>Architecture</w:t>
-      </w:r>
-      <w:proofErr w:type="spellEnd"/>
-      <w:r>
-        <w:t xml:space="preserve"> of </w:t>
-      </w:r>
-      <w:proofErr w:type="spellStart"/>
-      <w:r>
-        <w:t>Intelligence</w:t>
-      </w:r>
-      <w:proofErr w:type="spellEnd"/>
-      <w:r>
-        <w:t xml:space="preserve">”, s.f.). En este entorno, la victoria no depende únicamente de la habilidad mecánica del jugador, sino de decisiones </w:t>
-      </w:r>
-      <w:proofErr w:type="spellStart"/>
-      <w:r>
-        <w:t>stratégicas</w:t>
-      </w:r>
-      <w:proofErr w:type="spellEnd"/>
-      <w:r>
-        <w:t xml:space="preserve"> que </w:t>
-      </w:r>
-      <w:proofErr w:type="spellStart"/>
-      <w:r>
-        <w:t>mximicen</w:t>
-      </w:r>
-      <w:proofErr w:type="spellEnd"/>
-      <w:r>
-        <w:t xml:space="preserve"> las sinergias del equipo y neutralicen la composición rival.</w:t>
-      </w:r>
-    </w:p>
-    <w:p>
-      <w:r>
-        <w:t xml:space="preserve">A pesar de que el estado del arte ha </w:t>
-      </w:r>
-      <w:proofErr w:type="spellStart"/>
-      <w:r>
-        <w:t>porpuesto</w:t>
-      </w:r>
-      <w:proofErr w:type="spellEnd"/>
-      <w:r>
-        <w:t xml:space="preserve"> múltiples modelos de Aprendizaje Automático (Machine Learning) capaces de predecir el resultado de una partida con precisiones superiores al 75% (Do et al., 2021), observo que estos enfoques estadísticos y de redes neuronales a </w:t>
+        <w:t>. Dentro de este ámbito, los juegos de tipo Multiplayer Online Battle Arena, también conocidos popularmente como MOBA, y en particular League Of Legends, presentan desafíos computacionales de primer nivel. Con un elenco de más de 170 campeones disponibles en la actualidad (Riot Games, s.f.) y miles de permutaciones de objetos, considero que la fase de selección de personaje (Draft) y la itemización generan un espacio de estados combinatorio masivo (“The Architecture of Intelligence”, s.f.). En este entorno, la victoria no depende únicamente de la habilidad mecánica del jugador, sino de decisiones stratégicas que mximicen las sinergias del equipo y neutralicen la composición rival.</w:t>
+      </w:r>
+    </w:p>
+    <w:p>
+      <w:r>
+        <w:t>A pesar de que el estado del arte ha porpuesto múltiples modelos de Aprendizaje Automático (Machine Learning) capaces de predecir el resultado de una partida con precisiones superiores al 75% (Do et al., 2021), observo que estos enfoques estadísticos y de redes neuronales a menudo operan como “cajas negras”. La falta de transparencia en sus predicciones limita severamente su adopción por parte de los usuarios, quienes necesitan comprender el razonamiento detrás de una recomendación para mejorar su aprendizaje estratégico (García-Méndez &amp; de Arriba-Pérez, s.f.).</w:t>
+      </w:r>
+    </w:p>
+    <w:p>
+      <w:r>
+        <w:t xml:space="preserve">Esta investigación surge de mi motivación por resolver dicha limitación mediante la creación de un Sistema Experto basado en reglas lógicas. A diferencia de los modelos puramente probabilísticos, propongo un sistema experto capaz de manejar la incertidumbre táctica mediante inferencias (potencialmente ampliada con lógica difusa) y de ofrecer explicabilidad (Explainable AI). Considero esto un equisito fundamental para garanizar la confianza del </w:t>
       </w:r>
       <w:r>
         <w:lastRenderedPageBreak/>
-        <w:t>menudo operan como “cajas negras”. La falta de transparencia en sus predicciones limita severamente su adopción por parte de los usuarios, quienes necesitan comprender el razonamiento detrás de una recomendación para mejorar su aprendizaje estratégico (García-Méndez &amp; de Arriba-Pérez, s.f.).</w:t>
-      </w:r>
-    </w:p>
-    <w:p>
-      <w:r>
-        <w:t xml:space="preserve">Esta investigación surge de mi motivación por resolver dicha limitación mediante la creación de un Sistema Experto basado en reglas lógicas. A diferencia de los modelos puramente probabilísticos, propongo un sistema experto capaz de manejar la incertidumbre táctica mediante inferencias (potencialmente ampliada con lógica difusa) y de ofrecer </w:t>
-      </w:r>
-      <w:proofErr w:type="spellStart"/>
-      <w:r>
-        <w:t>explicabilidad</w:t>
-      </w:r>
-      <w:proofErr w:type="spellEnd"/>
-      <w:r>
-        <w:t xml:space="preserve"> (</w:t>
-      </w:r>
-      <w:proofErr w:type="spellStart"/>
-      <w:r>
-        <w:t>Explainable</w:t>
-      </w:r>
-      <w:proofErr w:type="spellEnd"/>
-      <w:r>
-        <w:t xml:space="preserve"> AI). Considero esto un </w:t>
-      </w:r>
-      <w:proofErr w:type="spellStart"/>
-      <w:r>
-        <w:t>equisito</w:t>
-      </w:r>
-      <w:proofErr w:type="spellEnd"/>
-      <w:r>
-        <w:t xml:space="preserve"> fundamental para </w:t>
-      </w:r>
-      <w:proofErr w:type="spellStart"/>
-      <w:r>
-        <w:t>garanizar</w:t>
-      </w:r>
-      <w:proofErr w:type="spellEnd"/>
-      <w:r>
-        <w:t xml:space="preserve"> la confianza del jugador, al justificar en lenguaje natural por qué una decisión es óptima dadas las circunstancias del juego (“The </w:t>
-      </w:r>
-      <w:proofErr w:type="spellStart"/>
-      <w:r>
-        <w:t>Architecut</w:t>
-      </w:r>
-      <w:proofErr w:type="spellEnd"/>
-      <w:r>
-        <w:t>”)</w:t>
+        <w:t>jugador, al justificar en lenguaje natural por qué una decisión es óptima dadas las circunstancias del juego (“The Architecut”)</w:t>
       </w:r>
     </w:p>
     <w:p>
@@ -3139,11 +3479,7 @@
         <w:t>cada capítulo debe comenzar siempre en una nueva página</w:t>
       </w:r>
       <w:r>
-        <w:t xml:space="preserve">. Puedes utilizar las herramientas de “Disposición” del procesador de textos para introducir un salgo de página. </w:t>
-      </w:r>
-      <w:r>
-        <w:lastRenderedPageBreak/>
-        <w:t>De este modo, aunque amplíes el tamaño de un capítulo, los que vienen a continuación comenzarán siempre al inicio de una nueva página.</w:t>
+        <w:t>. Puedes utilizar las herramientas de “Disposición” del procesador de textos para introducir un salgo de página. De este modo, aunque amplíes el tamaño de un capítulo, los que vienen a continuación comenzarán siempre al inicio de una nueva página.</w:t>
       </w:r>
     </w:p>
     <w:p>
@@ -3195,6 +3531,7 @@
       </w:pPr>
       <w:bookmarkStart w:id="8" w:name="_Toc149554661"/>
       <w:r>
+        <w:lastRenderedPageBreak/>
         <w:t>“T</w:t>
       </w:r>
       <w:r>
@@ -5370,6 +5707,118 @@
     </w:lvl>
   </w:abstractNum>
   <w:abstractNum w:abstractNumId="16" w15:restartNumberingAfterBreak="0">
+    <w:nsid w:val="62FC2ADE"/>
+    <w:multiLevelType w:val="hybridMultilevel"/>
+    <w:tmpl w:val="099E7298"/>
+    <w:lvl w:ilvl="0" w:tplc="0C0A0001">
+      <w:numFmt w:val="bullet"/>
+      <w:lvlText w:val=""/>
+      <w:lvlJc w:val="left"/>
+      <w:pPr>
+        <w:ind w:left="720" w:hanging="360"/>
+      </w:pPr>
+      <w:rPr>
+        <w:rFonts w:ascii="Symbol" w:eastAsia="Times New Roman" w:hAnsi="Symbol" w:cs="Times New Roman" w:hint="default"/>
+      </w:rPr>
+    </w:lvl>
+    <w:lvl w:ilvl="1" w:tplc="0C0A0003" w:tentative="1">
+      <w:start w:val="1"/>
+      <w:numFmt w:val="bullet"/>
+      <w:lvlText w:val="o"/>
+      <w:lvlJc w:val="left"/>
+      <w:pPr>
+        <w:ind w:left="1440" w:hanging="360"/>
+      </w:pPr>
+      <w:rPr>
+        <w:rFonts w:ascii="Courier New" w:hAnsi="Courier New" w:cs="Courier New" w:hint="default"/>
+      </w:rPr>
+    </w:lvl>
+    <w:lvl w:ilvl="2" w:tplc="0C0A0005" w:tentative="1">
+      <w:start w:val="1"/>
+      <w:numFmt w:val="bullet"/>
+      <w:lvlText w:val=""/>
+      <w:lvlJc w:val="left"/>
+      <w:pPr>
+        <w:ind w:left="2160" w:hanging="360"/>
+      </w:pPr>
+      <w:rPr>
+        <w:rFonts w:ascii="Wingdings" w:hAnsi="Wingdings" w:hint="default"/>
+      </w:rPr>
+    </w:lvl>
+    <w:lvl w:ilvl="3" w:tplc="0C0A0001" w:tentative="1">
+      <w:start w:val="1"/>
+      <w:numFmt w:val="bullet"/>
+      <w:lvlText w:val=""/>
+      <w:lvlJc w:val="left"/>
+      <w:pPr>
+        <w:ind w:left="2880" w:hanging="360"/>
+      </w:pPr>
+      <w:rPr>
+        <w:rFonts w:ascii="Symbol" w:hAnsi="Symbol" w:hint="default"/>
+      </w:rPr>
+    </w:lvl>
+    <w:lvl w:ilvl="4" w:tplc="0C0A0003" w:tentative="1">
+      <w:start w:val="1"/>
+      <w:numFmt w:val="bullet"/>
+      <w:lvlText w:val="o"/>
+      <w:lvlJc w:val="left"/>
+      <w:pPr>
+        <w:ind w:left="3600" w:hanging="360"/>
+      </w:pPr>
+      <w:rPr>
+        <w:rFonts w:ascii="Courier New" w:hAnsi="Courier New" w:cs="Courier New" w:hint="default"/>
+      </w:rPr>
+    </w:lvl>
+    <w:lvl w:ilvl="5" w:tplc="0C0A0005" w:tentative="1">
+      <w:start w:val="1"/>
+      <w:numFmt w:val="bullet"/>
+      <w:lvlText w:val=""/>
+      <w:lvlJc w:val="left"/>
+      <w:pPr>
+        <w:ind w:left="4320" w:hanging="360"/>
+      </w:pPr>
+      <w:rPr>
+        <w:rFonts w:ascii="Wingdings" w:hAnsi="Wingdings" w:hint="default"/>
+      </w:rPr>
+    </w:lvl>
+    <w:lvl w:ilvl="6" w:tplc="0C0A0001" w:tentative="1">
+      <w:start w:val="1"/>
+      <w:numFmt w:val="bullet"/>
+      <w:lvlText w:val=""/>
+      <w:lvlJc w:val="left"/>
+      <w:pPr>
+        <w:ind w:left="5040" w:hanging="360"/>
+      </w:pPr>
+      <w:rPr>
+        <w:rFonts w:ascii="Symbol" w:hAnsi="Symbol" w:hint="default"/>
+      </w:rPr>
+    </w:lvl>
+    <w:lvl w:ilvl="7" w:tplc="0C0A0003" w:tentative="1">
+      <w:start w:val="1"/>
+      <w:numFmt w:val="bullet"/>
+      <w:lvlText w:val="o"/>
+      <w:lvlJc w:val="left"/>
+      <w:pPr>
+        <w:ind w:left="5760" w:hanging="360"/>
+      </w:pPr>
+      <w:rPr>
+        <w:rFonts w:ascii="Courier New" w:hAnsi="Courier New" w:cs="Courier New" w:hint="default"/>
+      </w:rPr>
+    </w:lvl>
+    <w:lvl w:ilvl="8" w:tplc="0C0A0005" w:tentative="1">
+      <w:start w:val="1"/>
+      <w:numFmt w:val="bullet"/>
+      <w:lvlText w:val=""/>
+      <w:lvlJc w:val="left"/>
+      <w:pPr>
+        <w:ind w:left="6480" w:hanging="360"/>
+      </w:pPr>
+      <w:rPr>
+        <w:rFonts w:ascii="Wingdings" w:hAnsi="Wingdings" w:hint="default"/>
+      </w:rPr>
+    </w:lvl>
+  </w:abstractNum>
+  <w:abstractNum w:abstractNumId="17" w15:restartNumberingAfterBreak="0">
     <w:nsid w:val="64851D42"/>
     <w:multiLevelType w:val="hybridMultilevel"/>
     <w:tmpl w:val="6D2A54F6"/>
@@ -5456,7 +5905,7 @@
       </w:pPr>
     </w:lvl>
   </w:abstractNum>
-  <w:abstractNum w:abstractNumId="17" w15:restartNumberingAfterBreak="0">
+  <w:abstractNum w:abstractNumId="18" w15:restartNumberingAfterBreak="0">
     <w:nsid w:val="693732B1"/>
     <w:multiLevelType w:val="multilevel"/>
     <w:tmpl w:val="393C3686"/>
@@ -5542,7 +5991,7 @@
       </w:pPr>
     </w:lvl>
   </w:abstractNum>
-  <w:abstractNum w:abstractNumId="18" w15:restartNumberingAfterBreak="0">
+  <w:abstractNum w:abstractNumId="19" w15:restartNumberingAfterBreak="0">
     <w:nsid w:val="6E946A08"/>
     <w:multiLevelType w:val="multilevel"/>
     <w:tmpl w:val="6234E562"/>
@@ -5632,7 +6081,7 @@
       </w:pPr>
     </w:lvl>
   </w:abstractNum>
-  <w:abstractNum w:abstractNumId="19" w15:restartNumberingAfterBreak="0">
+  <w:abstractNum w:abstractNumId="20" w15:restartNumberingAfterBreak="0">
     <w:nsid w:val="6EAB6542"/>
     <w:multiLevelType w:val="hybridMultilevel"/>
     <w:tmpl w:val="E33AE3B6"/>
@@ -5718,7 +6167,7 @@
       </w:pPr>
     </w:lvl>
   </w:abstractNum>
-  <w:abstractNum w:abstractNumId="20" w15:restartNumberingAfterBreak="0">
+  <w:abstractNum w:abstractNumId="21" w15:restartNumberingAfterBreak="0">
     <w:nsid w:val="748E2F9F"/>
     <w:multiLevelType w:val="multilevel"/>
     <w:tmpl w:val="0C0A001F"/>
@@ -5804,7 +6253,7 @@
       </w:pPr>
     </w:lvl>
   </w:abstractNum>
-  <w:abstractNum w:abstractNumId="21" w15:restartNumberingAfterBreak="0">
+  <w:abstractNum w:abstractNumId="22" w15:restartNumberingAfterBreak="0">
     <w:nsid w:val="7D4A58B6"/>
     <w:multiLevelType w:val="multilevel"/>
     <w:tmpl w:val="E0A4B08C"/>
@@ -5894,7 +6343,7 @@
     <w:abstractNumId w:val="8"/>
   </w:num>
   <w:num w:numId="2" w16cid:durableId="1947275272">
-    <w:abstractNumId w:val="19"/>
+    <w:abstractNumId w:val="20"/>
   </w:num>
   <w:num w:numId="3" w16cid:durableId="2018772219">
     <w:abstractNumId w:val="11"/>
@@ -5915,7 +6364,7 @@
     <w:abstractNumId w:val="9"/>
   </w:num>
   <w:num w:numId="9" w16cid:durableId="1304579770">
-    <w:abstractNumId w:val="16"/>
+    <w:abstractNumId w:val="17"/>
   </w:num>
   <w:num w:numId="10" w16cid:durableId="1256354795">
     <w:abstractNumId w:val="15"/>
@@ -5948,16 +6397,16 @@
     <w:abstractNumId w:val="10"/>
   </w:num>
   <w:num w:numId="17" w16cid:durableId="1340544895">
-    <w:abstractNumId w:val="20"/>
+    <w:abstractNumId w:val="21"/>
   </w:num>
   <w:num w:numId="18" w16cid:durableId="1420177678">
-    <w:abstractNumId w:val="18"/>
+    <w:abstractNumId w:val="19"/>
   </w:num>
   <w:num w:numId="19" w16cid:durableId="1642493223">
-    <w:abstractNumId w:val="21"/>
+    <w:abstractNumId w:val="22"/>
   </w:num>
   <w:num w:numId="20" w16cid:durableId="842742992">
-    <w:abstractNumId w:val="17"/>
+    <w:abstractNumId w:val="18"/>
   </w:num>
   <w:num w:numId="21" w16cid:durableId="1459450684">
     <w:abstractNumId w:val="3"/>
@@ -5970,6 +6419,9 @@
   </w:num>
   <w:num w:numId="24" w16cid:durableId="597712412">
     <w:abstractNumId w:val="6"/>
+  </w:num>
+  <w:num w:numId="25" w16cid:durableId="1091900183">
+    <w:abstractNumId w:val="16"/>
   </w:num>
 </w:numbering>
 </file>
@@ -7414,7 +7866,7 @@
     </w:tblPr>
     <w:tblStylePr w:type="firstRow">
       <w:rPr>
-        <w:rFonts w:ascii="UnitOT-Medi" w:hAnsi="UnitOT-Medi"/>
+        <w:rFonts w:ascii="UnitOT-Light" w:hAnsi="UnitOT-Light"/>
         <w:color w:val="FFFFFF" w:themeColor="background1"/>
         <w:sz w:val="20"/>
       </w:rPr>
@@ -7429,7 +7881,7 @@
         <w:jc w:val="center"/>
       </w:pPr>
       <w:rPr>
-        <w:rFonts w:ascii="UnitOT-Light" w:hAnsi="UnitOT-Light"/>
+        <w:rFonts w:ascii="Tahoma" w:hAnsi="Tahoma"/>
         <w:color w:val="4D4D4D"/>
         <w:sz w:val="20"/>
       </w:rPr>
@@ -7716,10 +8168,22 @@
 </file>
 
 <file path=customXml/item1.xml><?xml version="1.0" encoding="utf-8"?>
+<p:properties xmlns:p="http://schemas.microsoft.com/office/2006/metadata/properties" xmlns:xsi="http://www.w3.org/2001/XMLSchema-instance" xmlns:pc="http://schemas.microsoft.com/office/infopath/2007/PartnerControls">
+  <documentManagement>
+    <TaxCatchAll xmlns="0a70e875-3d35-4be2-921f-7117c31bab9b" xsi:nil="true"/>
+    <lcf76f155ced4ddcb4097134ff3c332f xmlns="27c1adeb-3674-457c-b08c-8a73f31b6e23">
+      <Terms xmlns="http://schemas.microsoft.com/office/infopath/2007/PartnerControls"/>
+    </lcf76f155ced4ddcb4097134ff3c332f>
+    <_Flow_SignoffStatus xmlns="27c1adeb-3674-457c-b08c-8a73f31b6e23" xsi:nil="true"/>
+  </documentManagement>
+</p:properties>
+</file>
+
+<file path=customXml/item2.xml><?xml version="1.0" encoding="utf-8"?>
 <b:Sources xmlns:b="http://schemas.openxmlformats.org/officeDocument/2006/bibliography" xmlns="http://schemas.openxmlformats.org/officeDocument/2006/bibliography" SelectedStyle="\APASixthEditionOfficeOnline.xsl" StyleName="APA" Version="6"/>
 </file>
 
-<file path=customXml/item2.xml><?xml version="1.0" encoding="utf-8"?>
+<file path=customXml/item3.xml><?xml version="1.0" encoding="utf-8"?>
 <?mso-contentType ?>
 <FormTemplates xmlns="http://schemas.microsoft.com/sharepoint/v3/contenttype/forms">
   <Display>DocumentLibraryForm</Display>
@@ -7728,7 +8192,7 @@
 </FormTemplates>
 </file>
 
-<file path=customXml/item3.xml><?xml version="1.0" encoding="utf-8"?>
+<file path=customXml/item4.xml><?xml version="1.0" encoding="utf-8"?>
 <ct:contentTypeSchema xmlns:ct="http://schemas.microsoft.com/office/2006/metadata/contentType" xmlns:ma="http://schemas.microsoft.com/office/2006/metadata/properties/metaAttributes" ct:_="" ma:_="" ma:contentTypeName="Documento" ma:contentTypeID="0x010100DF3D7C797EA12745A270EF30E38719B9" ma:contentTypeVersion="19" ma:contentTypeDescription="Crear nuevo documento." ma:contentTypeScope="" ma:versionID="227b02526234ef39b0b78895a9d90cf5">
   <xsd:schema xmlns:xsd="http://www.w3.org/2001/XMLSchema" xmlns:xs="http://www.w3.org/2001/XMLSchema" xmlns:p="http://schemas.microsoft.com/office/2006/metadata/properties" xmlns:ns2="0a70e875-3d35-4be2-921f-7117c31bab9b" xmlns:ns3="27c1adeb-3674-457c-b08c-8a73f31b6e23" targetNamespace="http://schemas.microsoft.com/office/2006/metadata/properties" ma:root="true" ma:fieldsID="3c939c8607e2f594db8bbb23634dd059" ns2:_="" ns3:_="">
     <xsd:import namespace="0a70e875-3d35-4be2-921f-7117c31bab9b"/>
@@ -7989,19 +8453,18 @@
 </ct:contentTypeSchema>
 </file>
 
-<file path=customXml/item4.xml><?xml version="1.0" encoding="utf-8"?>
-<p:properties xmlns:p="http://schemas.microsoft.com/office/2006/metadata/properties" xmlns:xsi="http://www.w3.org/2001/XMLSchema-instance" xmlns:pc="http://schemas.microsoft.com/office/infopath/2007/PartnerControls">
-  <documentManagement>
-    <TaxCatchAll xmlns="0a70e875-3d35-4be2-921f-7117c31bab9b" xsi:nil="true"/>
-    <lcf76f155ced4ddcb4097134ff3c332f xmlns="27c1adeb-3674-457c-b08c-8a73f31b6e23">
-      <Terms xmlns="http://schemas.microsoft.com/office/infopath/2007/PartnerControls"/>
-    </lcf76f155ced4ddcb4097134ff3c332f>
-    <_Flow_SignoffStatus xmlns="27c1adeb-3674-457c-b08c-8a73f31b6e23" xsi:nil="true"/>
-  </documentManagement>
-</p:properties>
+<file path=customXml/itemProps1.xml><?xml version="1.0" encoding="utf-8"?>
+<ds:datastoreItem xmlns:ds="http://schemas.openxmlformats.org/officeDocument/2006/customXml" ds:itemID="{1F3C1B10-EE25-478F-A378-26280E5A2662}">
+  <ds:schemaRefs>
+    <ds:schemaRef ds:uri="http://schemas.microsoft.com/office/2006/metadata/properties"/>
+    <ds:schemaRef ds:uri="http://schemas.microsoft.com/office/infopath/2007/PartnerControls"/>
+    <ds:schemaRef ds:uri="0a70e875-3d35-4be2-921f-7117c31bab9b"/>
+    <ds:schemaRef ds:uri="27c1adeb-3674-457c-b08c-8a73f31b6e23"/>
+  </ds:schemaRefs>
+</ds:datastoreItem>
 </file>
 
-<file path=customXml/itemProps1.xml><?xml version="1.0" encoding="utf-8"?>
+<file path=customXml/itemProps2.xml><?xml version="1.0" encoding="utf-8"?>
 <ds:datastoreItem xmlns:ds="http://schemas.openxmlformats.org/officeDocument/2006/customXml" ds:itemID="{FD1A1271-5F91-421F-91AA-F5599BF2C903}">
   <ds:schemaRefs>
     <ds:schemaRef ds:uri="http://schemas.openxmlformats.org/officeDocument/2006/bibliography"/>
@@ -8009,7 +8472,7 @@
 </ds:datastoreItem>
 </file>
 
-<file path=customXml/itemProps2.xml><?xml version="1.0" encoding="utf-8"?>
+<file path=customXml/itemProps3.xml><?xml version="1.0" encoding="utf-8"?>
 <ds:datastoreItem xmlns:ds="http://schemas.openxmlformats.org/officeDocument/2006/customXml" ds:itemID="{5B3F4A43-888D-4D33-BD1C-7066736CDCB4}">
   <ds:schemaRefs>
     <ds:schemaRef ds:uri="http://schemas.microsoft.com/sharepoint/v3/contenttype/forms"/>
@@ -8017,7 +8480,7 @@
 </ds:datastoreItem>
 </file>
 
-<file path=customXml/itemProps3.xml><?xml version="1.0" encoding="utf-8"?>
+<file path=customXml/itemProps4.xml><?xml version="1.0" encoding="utf-8"?>
 <ds:datastoreItem xmlns:ds="http://schemas.openxmlformats.org/officeDocument/2006/customXml" ds:itemID="{3624E214-1B8A-4A51-B10D-C847268B4539}">
   <ds:schemaRefs>
     <ds:schemaRef ds:uri="http://schemas.microsoft.com/office/2006/metadata/contentType"/>
@@ -8034,15 +8497,4 @@
     <ds:schemaRef ds:uri="http://schemas.microsoft.com/internal/obd"/>
   </ds:schemaRefs>
 </ds:datastoreItem>
-</file>
-
-<file path=customXml/itemProps4.xml><?xml version="1.0" encoding="utf-8"?>
-<ds:datastoreItem xmlns:ds="http://schemas.openxmlformats.org/officeDocument/2006/customXml" ds:itemID="{1F3C1B10-EE25-478F-A378-26280E5A2662}">
-  <ds:schemaRefs>
-    <ds:schemaRef ds:uri="http://schemas.microsoft.com/office/2006/metadata/properties"/>
-    <ds:schemaRef ds:uri="http://schemas.microsoft.com/office/infopath/2007/PartnerControls"/>
-    <ds:schemaRef ds:uri="0a70e875-3d35-4be2-921f-7117c31bab9b"/>
-    <ds:schemaRef ds:uri="27c1adeb-3674-457c-b08c-8a73f31b6e23"/>
-  </ds:schemaRefs>
-</ds:datastoreItem>
 </file>
</xml_diff>

<commit_message>
Add enunciado PDF and update plantilla.docx
Add the new enunciado.pdf to the docs directory and apply updates to docs/plantilla.docx (binary changes). These changes provide the latest assignment statement and refresh the project template document.
</commit_message>
<xml_diff>
--- a/docs/plantilla.docx
+++ b/docs/plantilla.docx
@@ -491,9 +491,6 @@
         <w:br w:type="page"/>
       </w:r>
       <w:r>
-        <w:rPr>
-          <w:highlight w:val="magenta"/>
-        </w:rPr>
         <w:lastRenderedPageBreak/>
         <w:t>Resumen</w:t>
       </w:r>
@@ -797,7 +794,21 @@
         <w:rPr>
           <w:lang w:eastAsia="en-US"/>
         </w:rPr>
-        <w:t xml:space="preserve"> mediante una recomendación de personaje en la fase de selección de personaje y recomendaciones de objetos y anotaciones a tener en cuenta para la partida</w:t>
+        <w:t xml:space="preserve"> mediante una recomendación de personaje en la fase de selección de personaje y recomendaciones de objetos y anotaciones </w:t>
+      </w:r>
+      <w:proofErr w:type="gramStart"/>
+      <w:r>
+        <w:rPr>
+          <w:lang w:eastAsia="en-US"/>
+        </w:rPr>
+        <w:t>a</w:t>
+      </w:r>
+      <w:proofErr w:type="gramEnd"/>
+      <w:r>
+        <w:rPr>
+          <w:lang w:eastAsia="en-US"/>
+        </w:rPr>
+        <w:t xml:space="preserve"> tener en cuenta para la partida</w:t>
       </w:r>
       <w:r>
         <w:rPr>
@@ -930,7 +941,6 @@
       </w:pPr>
       <w:r>
         <w:rPr>
-          <w:highlight w:val="magenta"/>
           <w:lang w:val="en-US"/>
         </w:rPr>
         <w:lastRenderedPageBreak/>
@@ -3272,45 +3282,110 @@
     <w:p>
       <w:pPr>
         <w:pStyle w:val="Ttulo1"/>
-        <w:rPr>
-          <w:highlight w:val="magenta"/>
-        </w:rPr>
       </w:pPr>
       <w:bookmarkStart w:id="1" w:name="_Toc437515557"/>
       <w:bookmarkStart w:id="2" w:name="_Toc14106979"/>
       <w:bookmarkStart w:id="3" w:name="_Toc149554656"/>
       <w:r>
-        <w:rPr>
-          <w:highlight w:val="magenta"/>
-        </w:rPr>
         <w:lastRenderedPageBreak/>
         <w:t>I</w:t>
       </w:r>
       <w:r>
-        <w:rPr>
-          <w:highlight w:val="magenta"/>
-        </w:rPr>
         <w:t>n</w:t>
       </w:r>
       <w:bookmarkEnd w:id="1"/>
       <w:bookmarkEnd w:id="2"/>
       <w:r>
-        <w:rPr>
-          <w:highlight w:val="magenta"/>
-        </w:rPr>
         <w:t>troducción</w:t>
       </w:r>
       <w:bookmarkEnd w:id="3"/>
       <w:r>
-        <w:rPr>
-          <w:highlight w:val="magenta"/>
-        </w:rPr>
         <w:t xml:space="preserve"> </w:t>
       </w:r>
     </w:p>
     <w:p>
       <w:r>
-        <w:t xml:space="preserve">En </w:t>
+        <w:t>La industria de los videojuegos ha sufrido cambios constantes en los últimos años. Antiguamente solo se percibía a los videojuegos como una fuente de entretenimiento</w:t>
+      </w:r>
+      <w:r>
+        <w:t>,</w:t>
+      </w:r>
+      <w:r>
+        <w:t xml:space="preserve"> hoy en día, muchos de los títulos que solamente trataban de cumplir la función de entretener al usuario se han ido profesionalizando con el tiempo, llegando a convertirse en deportes electrónicos o </w:t>
+      </w:r>
+      <w:proofErr w:type="spellStart"/>
+      <w:r>
+        <w:t>eSports</w:t>
+      </w:r>
+      <w:proofErr w:type="spellEnd"/>
+      <w:r>
+        <w:t>, comparables incluso a los deportes tradicionales. Dentro de este contexto, los juegos del género MOBA (Multiplayer Online Battle Arena), y en especial League of Legends (LoL), destacan como un escenario muy interesante para aplicar conceptos de ingeniería informática y, en particular, de inteligencia artificial y análisis de datos.</w:t>
+      </w:r>
+    </w:p>
+    <w:p/>
+    <w:p>
+      <w:r>
+        <w:t>Mi idea no es simplemente crear otra herramienta más de consulta, pues en el mercado actual hay varias ofertas que cumplen con mi propósito, pero tienen ciertos problemas individualmente. Lo que realmente busco es analizar cómo los sistemas basados en conocimiento pueden ayudar a poner orden en un entorno donde la información es incompleta, cambiante y bastante compleja. En resumen, trato de poder ordenar un entorno de variables constantes para buscar la mejor solución a problemas que se dan en la partida.</w:t>
+      </w:r>
+    </w:p>
+    <w:p/>
+    <w:p>
+      <w:r>
+        <w:t>A lo largo de mis estudios y también gracias a mi experiencia personal con League of Legends, he visto algo que se repite bastante: aunque muchos jugadores tienen un nivel mecánico muy alto, les falla la toma de decisiones estratégicas. Esto ocurre sobre todo en momentos clave como la selección de campeones (draft), la cual puede llegar a determinar gran parte del resultado de la partida sin siquiera jugar esta misma. De hecho, estudios sobre predicción en juegos competitivos sugieren que la fase de selección puede condicionar el éxito del encuentro de manera determinante antes de que los jugadores entren al mapa (Yang et al., 2016).</w:t>
+      </w:r>
+    </w:p>
+    <w:p/>
+    <w:p>
+      <w:r>
+        <w:t xml:space="preserve">Para ello, he decidido desarrollar un sistema experto que funcione como una especie de asesor estratégico. La idea es que pueda imitar el razonamiento de un analista humano </w:t>
+      </w:r>
+      <w:r>
+        <w:lastRenderedPageBreak/>
+        <w:t>experto en la materia, pero aprovechando la capacidad de cálculo de un sistema informático, su velocidad y sin las limitaciones típicas como el cansancio o la presión.</w:t>
+      </w:r>
+    </w:p>
+    <w:p/>
+    <w:p>
+      <w:r>
+        <w:t>Este proyecto no es relevante solo desde el punto de vista del juego. A nivel más teórico, League of Legends plantea un problema muy interesante relacionado con la teoría de juegos aplicada. Algunos estudios señalan que la dificultad no está únicamente en lo que ocurre dentro de la partida, sino también en todo el conocimiento que rodea al juego, lo que se conoce como “</w:t>
+      </w:r>
+      <w:proofErr w:type="spellStart"/>
+      <w:r>
+        <w:t>metagame</w:t>
+      </w:r>
+      <w:proofErr w:type="spellEnd"/>
+      <w:r>
+        <w:t>” (Mora-Cantallops &amp; Sicart, 2018). Sustento esta idea gracias a que, con el tiempo, la escena competitiva dentro del mundo de los videojuegos se ha profesionalizado y se han estandarizado posiciones de coach (entrenador), analistas de draft, etc., mostrando que a nivel competitivo la toma de decisiones es relevante a los mismos niveles que saber jugar al juego con unas mecánicas profesionales.</w:t>
+      </w:r>
+    </w:p>
+    <w:p/>
+    <w:p>
+      <w:r>
+        <w:t xml:space="preserve">Durante el desarrollo, me he encontrado con varios retos técnicos importantes. Por ejemplo, trabajar con datos en tiempo real usando las </w:t>
+      </w:r>
+      <w:proofErr w:type="spellStart"/>
+      <w:r>
+        <w:t>APIs</w:t>
+      </w:r>
+      <w:proofErr w:type="spellEnd"/>
+      <w:r>
+        <w:t xml:space="preserve"> oficiales de Riot Games (2024), o diseñar un sistema en Python capaz de no solo dar recomendaciones, sino también explicar por qué las da. Esto último es especialmente relevante, ya que muchos modelos actuales de inteligencia artificial funcionan como “cajas negras” y no ofrecen una justificación clara de sus decisiones, lo que dificulta que el usuario confíe plenamente en el sistema (Russell &amp; Norvig, 2021).</w:t>
+      </w:r>
+    </w:p>
+    <w:p/>
+    <w:p>
+      <w:r>
+        <w:t>De hecho, he optado por alejarme un poco del enfoque basado únicamente en Machine Learning, que es el más utilizado hoy en día. Aunque estos modelos son muy buenos prediciendo resultados, suelen fallar en algo clave: la explicabilidad. En este trabajo he intentado priorizar precisamente eso, construyendo un sistema que no solo indique qué hacer, sino que también explique el motivo, basándose en factores como las sinergias entre campeones, los enfrentamientos directos o el equilibrio del equipo y sus necesidades.</w:t>
+      </w:r>
+    </w:p>
+    <w:p/>
+    <w:p>
+      <w:r>
+        <w:t xml:space="preserve">Por último, esta introducción sirve como punto de partida para entender el resto del documento. En ella explico tanto la motivación detrás del proyecto como los conceptos básicos necesarios para seguirlo, incluso si no se tiene experiencia previa con este tipo de </w:t>
+      </w:r>
+      <w:r>
+        <w:lastRenderedPageBreak/>
+        <w:t>juegos competitivos. También presento la estructura del trabajo, que dará paso a un análisis más técnico donde se detallará cómo se ha desarrollado el sistema. En esencia, este proyecto intenta dar forma y sentido al caos estratégico de una partida de League of Legends, utilizando herramientas propias de la lógica computacional.</w:t>
       </w:r>
     </w:p>
     <w:p/>
@@ -7047,7 +7122,6 @@
   <w:style w:type="character" w:default="1" w:styleId="Fuentedeprrafopredeter">
     <w:name w:val="Default Paragraph Font"/>
     <w:uiPriority w:val="1"/>
-    <w:semiHidden/>
     <w:unhideWhenUsed/>
   </w:style>
   <w:style w:type="table" w:default="1" w:styleId="Tablanormal">

</xml_diff>

<commit_message>
Add meeting topics and update subtitle
Add docs/temas a comentar reunion.txt containing meeting questions about subsection numbering (e.g. 1.2.1) and citation references; update templates/index.html to expand the subtitle to 'Motor de Inferencia Estratégica 5v5 - TFG UNIR - Oscar Sánchez García'; update binary docs/plantilla.docx (content changed).
</commit_message>
<xml_diff>
--- a/docs/plantilla.docx
+++ b/docs/plantilla.docx
@@ -794,21 +794,7 @@
         <w:rPr>
           <w:lang w:eastAsia="en-US"/>
         </w:rPr>
-        <w:t xml:space="preserve"> mediante una recomendación de personaje en la fase de selección de personaje y recomendaciones de objetos y anotaciones </w:t>
-      </w:r>
-      <w:proofErr w:type="gramStart"/>
-      <w:r>
-        <w:rPr>
-          <w:lang w:eastAsia="en-US"/>
-        </w:rPr>
-        <w:t>a</w:t>
-      </w:r>
-      <w:proofErr w:type="gramEnd"/>
-      <w:r>
-        <w:rPr>
-          <w:lang w:eastAsia="en-US"/>
-        </w:rPr>
-        <w:t xml:space="preserve"> tener en cuenta para la partida</w:t>
+        <w:t xml:space="preserve"> mediante una recomendación de personaje en la fase de selección de personaje y recomendaciones de objetos y anotaciones a tener en cuenta para la partida</w:t>
       </w:r>
       <w:r>
         <w:rPr>
@@ -3079,6 +3065,87 @@
         <w:tabs>
           <w:tab w:val="right" w:leader="dot" w:pos="9061"/>
         </w:tabs>
+      </w:pPr>
+      <w:r>
+        <w:fldChar w:fldCharType="begin"/>
+      </w:r>
+      <w:r>
+        <w:instrText xml:space="preserve"> TOC \h \z \c "Figura" </w:instrText>
+      </w:r>
+      <w:r>
+        <w:fldChar w:fldCharType="separate"/>
+      </w:r>
+      <w:hyperlink w:anchor="_Toc149554676" w:history="1">
+        <w:r>
+          <w:rPr>
+            <w:rStyle w:val="Hipervnculo"/>
+            <w:noProof/>
+          </w:rPr>
+          <w:t xml:space="preserve">Figura 1. </w:t>
+        </w:r>
+        <w:r>
+          <w:rPr>
+            <w:rStyle w:val="Hipervnculo"/>
+            <w:noProof/>
+          </w:rPr>
+          <w:t>Mapa de la Grieta del Invocador con las líneas (Top, Mid, Bot y Jungla)</w:t>
+        </w:r>
+        <w:r>
+          <w:rPr>
+            <w:noProof/>
+            <w:webHidden/>
+          </w:rPr>
+          <w:tab/>
+        </w:r>
+        <w:r>
+          <w:rPr>
+            <w:noProof/>
+            <w:webHidden/>
+          </w:rPr>
+          <w:fldChar w:fldCharType="begin"/>
+        </w:r>
+        <w:r>
+          <w:rPr>
+            <w:noProof/>
+            <w:webHidden/>
+          </w:rPr>
+          <w:instrText xml:space="preserve"> PAGEREF _Toc149554676 \h </w:instrText>
+        </w:r>
+        <w:r>
+          <w:rPr>
+            <w:noProof/>
+            <w:webHidden/>
+          </w:rPr>
+        </w:r>
+        <w:r>
+          <w:rPr>
+            <w:noProof/>
+            <w:webHidden/>
+          </w:rPr>
+          <w:fldChar w:fldCharType="separate"/>
+        </w:r>
+        <w:r>
+          <w:rPr>
+            <w:noProof/>
+            <w:webHidden/>
+          </w:rPr>
+          <w:t>2</w:t>
+        </w:r>
+        <w:r>
+          <w:rPr>
+            <w:noProof/>
+            <w:webHidden/>
+          </w:rPr>
+          <w:fldChar w:fldCharType="end"/>
+        </w:r>
+      </w:hyperlink>
+    </w:p>
+    <w:p>
+      <w:pPr>
+        <w:pStyle w:val="Tabladeilustraciones"/>
+        <w:tabs>
+          <w:tab w:val="right" w:leader="dot" w:pos="9061"/>
+        </w:tabs>
         <w:rPr>
           <w:rFonts w:eastAsiaTheme="minorEastAsia" w:cstheme="minorBidi"/>
           <w:noProof/>
@@ -3088,22 +3155,34 @@
           <w14:ligatures w14:val="standardContextual"/>
         </w:rPr>
       </w:pPr>
-      <w:r>
-        <w:fldChar w:fldCharType="begin"/>
-      </w:r>
-      <w:r>
-        <w:instrText xml:space="preserve"> TOC \h \z \c "Figura" </w:instrText>
-      </w:r>
-      <w:r>
-        <w:fldChar w:fldCharType="separate"/>
-      </w:r>
       <w:hyperlink w:anchor="_Toc149554676" w:history="1">
         <w:r>
           <w:rPr>
             <w:rStyle w:val="Hipervnculo"/>
             <w:noProof/>
           </w:rPr>
-          <w:t>Figura 1. Ámbito de un identificador.</w:t>
+          <w:t xml:space="preserve">Figura </w:t>
+        </w:r>
+        <w:r>
+          <w:rPr>
+            <w:rStyle w:val="Hipervnculo"/>
+            <w:noProof/>
+          </w:rPr>
+          <w:t>2</w:t>
+        </w:r>
+        <w:r>
+          <w:rPr>
+            <w:rStyle w:val="Hipervnculo"/>
+            <w:noProof/>
+          </w:rPr>
+          <w:t xml:space="preserve">. </w:t>
+        </w:r>
+        <w:r>
+          <w:rPr>
+            <w:rStyle w:val="Hipervnculo"/>
+            <w:noProof/>
+          </w:rPr>
+          <w:t>Interfaz del recomendador pidiendo al usuario insertar los datos de los campeones de la partida actual.</w:t>
         </w:r>
         <w:r>
           <w:rPr>
@@ -3154,30 +3233,6 @@
           <w:fldChar w:fldCharType="end"/>
         </w:r>
       </w:hyperlink>
-    </w:p>
-    <w:p>
-      <w:r>
-        <w:fldChar w:fldCharType="end"/>
-      </w:r>
-    </w:p>
-    <w:p/>
-    <w:p/>
-    <w:p/>
-    <w:p/>
-    <w:p>
-      <w:pPr>
-        <w:pStyle w:val="Ttulondices"/>
-      </w:pPr>
-      <w:r>
-        <w:br w:type="page"/>
-      </w:r>
-      <w:r>
-        <w:lastRenderedPageBreak/>
-        <w:t>Í</w:t>
-      </w:r>
-      <w:r>
-        <w:t>ndice de tablas</w:t>
-      </w:r>
     </w:p>
     <w:p>
       <w:pPr>
@@ -3194,6 +3249,217 @@
           <w14:ligatures w14:val="standardContextual"/>
         </w:rPr>
       </w:pPr>
+      <w:hyperlink w:anchor="_Toc149554676" w:history="1">
+        <w:r>
+          <w:rPr>
+            <w:rStyle w:val="Hipervnculo"/>
+            <w:noProof/>
+          </w:rPr>
+          <w:t xml:space="preserve">Figura </w:t>
+        </w:r>
+        <w:r>
+          <w:rPr>
+            <w:rStyle w:val="Hipervnculo"/>
+            <w:noProof/>
+          </w:rPr>
+          <w:t>X</w:t>
+        </w:r>
+        <w:r>
+          <w:rPr>
+            <w:rStyle w:val="Hipervnculo"/>
+            <w:noProof/>
+          </w:rPr>
+          <w:t xml:space="preserve">. </w:t>
+        </w:r>
+        <w:r>
+          <w:rPr>
+            <w:rStyle w:val="Hipervnculo"/>
+            <w:noProof/>
+          </w:rPr>
+          <w:t>X</w:t>
+        </w:r>
+        <w:r>
+          <w:rPr>
+            <w:noProof/>
+            <w:webHidden/>
+          </w:rPr>
+          <w:tab/>
+        </w:r>
+        <w:r>
+          <w:rPr>
+            <w:noProof/>
+            <w:webHidden/>
+          </w:rPr>
+          <w:fldChar w:fldCharType="begin"/>
+        </w:r>
+        <w:r>
+          <w:rPr>
+            <w:noProof/>
+            <w:webHidden/>
+          </w:rPr>
+          <w:instrText xml:space="preserve"> PAGEREF _Toc149554676 \h </w:instrText>
+        </w:r>
+        <w:r>
+          <w:rPr>
+            <w:noProof/>
+            <w:webHidden/>
+          </w:rPr>
+        </w:r>
+        <w:r>
+          <w:rPr>
+            <w:noProof/>
+            <w:webHidden/>
+          </w:rPr>
+          <w:fldChar w:fldCharType="separate"/>
+        </w:r>
+        <w:r>
+          <w:rPr>
+            <w:noProof/>
+            <w:webHidden/>
+          </w:rPr>
+          <w:t>2</w:t>
+        </w:r>
+        <w:r>
+          <w:rPr>
+            <w:noProof/>
+            <w:webHidden/>
+          </w:rPr>
+          <w:fldChar w:fldCharType="end"/>
+        </w:r>
+      </w:hyperlink>
+    </w:p>
+    <w:p>
+      <w:pPr>
+        <w:pStyle w:val="Tabladeilustraciones"/>
+        <w:tabs>
+          <w:tab w:val="right" w:leader="dot" w:pos="9061"/>
+        </w:tabs>
+        <w:rPr>
+          <w:rFonts w:eastAsiaTheme="minorEastAsia" w:cstheme="minorBidi"/>
+          <w:noProof/>
+          <w:kern w:val="2"/>
+          <w:sz w:val="22"/>
+          <w:szCs w:val="22"/>
+          <w14:ligatures w14:val="standardContextual"/>
+        </w:rPr>
+      </w:pPr>
+      <w:hyperlink w:anchor="_Toc149554676" w:history="1">
+        <w:r>
+          <w:rPr>
+            <w:rStyle w:val="Hipervnculo"/>
+            <w:noProof/>
+          </w:rPr>
+          <w:t xml:space="preserve">Figura </w:t>
+        </w:r>
+        <w:r>
+          <w:rPr>
+            <w:rStyle w:val="Hipervnculo"/>
+            <w:noProof/>
+          </w:rPr>
+          <w:t>X</w:t>
+        </w:r>
+        <w:r>
+          <w:rPr>
+            <w:rStyle w:val="Hipervnculo"/>
+            <w:noProof/>
+          </w:rPr>
+          <w:t>.</w:t>
+        </w:r>
+        <w:r>
+          <w:rPr>
+            <w:rStyle w:val="Hipervnculo"/>
+            <w:noProof/>
+          </w:rPr>
+          <w:t xml:space="preserve"> X</w:t>
+        </w:r>
+        <w:r>
+          <w:rPr>
+            <w:noProof/>
+            <w:webHidden/>
+          </w:rPr>
+          <w:tab/>
+        </w:r>
+        <w:r>
+          <w:rPr>
+            <w:noProof/>
+            <w:webHidden/>
+          </w:rPr>
+          <w:fldChar w:fldCharType="begin"/>
+        </w:r>
+        <w:r>
+          <w:rPr>
+            <w:noProof/>
+            <w:webHidden/>
+          </w:rPr>
+          <w:instrText xml:space="preserve"> PAGEREF _Toc149554676 \h </w:instrText>
+        </w:r>
+        <w:r>
+          <w:rPr>
+            <w:noProof/>
+            <w:webHidden/>
+          </w:rPr>
+        </w:r>
+        <w:r>
+          <w:rPr>
+            <w:noProof/>
+            <w:webHidden/>
+          </w:rPr>
+          <w:fldChar w:fldCharType="separate"/>
+        </w:r>
+        <w:r>
+          <w:rPr>
+            <w:noProof/>
+            <w:webHidden/>
+          </w:rPr>
+          <w:t>2</w:t>
+        </w:r>
+        <w:r>
+          <w:rPr>
+            <w:noProof/>
+            <w:webHidden/>
+          </w:rPr>
+          <w:fldChar w:fldCharType="end"/>
+        </w:r>
+      </w:hyperlink>
+    </w:p>
+    <w:p>
+      <w:pPr>
+        <w:rPr>
+          <w:rFonts w:eastAsiaTheme="minorEastAsia"/>
+        </w:rPr>
+      </w:pPr>
+    </w:p>
+    <w:p>
+      <w:r>
+        <w:fldChar w:fldCharType="end"/>
+      </w:r>
+    </w:p>
+    <w:p/>
+    <w:p/>
+    <w:p/>
+    <w:p/>
+    <w:p>
+      <w:pPr>
+        <w:pStyle w:val="Ttulondices"/>
+      </w:pPr>
+      <w:r>
+        <w:br w:type="page"/>
+      </w:r>
+      <w:r>
+        <w:lastRenderedPageBreak/>
+        <w:t>Í</w:t>
+      </w:r>
+      <w:r>
+        <w:t>ndice de tablas</w:t>
+      </w:r>
+    </w:p>
+    <w:p>
+      <w:pPr>
+        <w:pStyle w:val="Tabladeilustraciones"/>
+        <w:tabs>
+          <w:tab w:val="right" w:leader="dot" w:pos="9061"/>
+        </w:tabs>
+      </w:pPr>
       <w:r>
         <w:fldChar w:fldCharType="begin"/>
       </w:r>
@@ -3209,7 +3475,14 @@
             <w:rStyle w:val="Hipervnculo"/>
             <w:noProof/>
           </w:rPr>
-          <w:t>Tabla 1. Usuarios potenciales de un documento de requisitos.</w:t>
+          <w:t xml:space="preserve">Tabla 1. </w:t>
+        </w:r>
+        <w:r>
+          <w:rPr>
+            <w:rStyle w:val="Hipervnculo"/>
+            <w:noProof/>
+          </w:rPr>
+          <w:t>Ontología de Etiquetas del Sistema Experto</w:t>
         </w:r>
         <w:r>
           <w:rPr>
@@ -3223,43 +3496,16 @@
             <w:noProof/>
             <w:webHidden/>
           </w:rPr>
-          <w:fldChar w:fldCharType="begin"/>
-        </w:r>
-        <w:r>
-          <w:rPr>
-            <w:noProof/>
-            <w:webHidden/>
-          </w:rPr>
-          <w:instrText xml:space="preserve"> PAGEREF _Toc149554677 \h </w:instrText>
-        </w:r>
-        <w:r>
-          <w:rPr>
-            <w:noProof/>
-            <w:webHidden/>
-          </w:rPr>
-        </w:r>
-        <w:r>
-          <w:rPr>
-            <w:noProof/>
-            <w:webHidden/>
-          </w:rPr>
-          <w:fldChar w:fldCharType="separate"/>
-        </w:r>
-        <w:r>
-          <w:rPr>
-            <w:noProof/>
-            <w:webHidden/>
-          </w:rPr>
           <w:t>3</w:t>
         </w:r>
-        <w:r>
-          <w:rPr>
-            <w:noProof/>
-            <w:webHidden/>
-          </w:rPr>
-          <w:fldChar w:fldCharType="end"/>
-        </w:r>
       </w:hyperlink>
+    </w:p>
+    <w:p>
+      <w:pPr>
+        <w:rPr>
+          <w:rFonts w:eastAsiaTheme="minorEastAsia"/>
+        </w:rPr>
+      </w:pPr>
     </w:p>
     <w:p>
       <w:pPr>
@@ -3331,7 +3577,13 @@
     <w:p/>
     <w:p>
       <w:r>
-        <w:t>A lo largo de mis estudios y también gracias a mi experiencia personal con League of Legends, he visto algo que se repite bastante: aunque muchos jugadores tienen un nivel mecánico muy alto, les falla la toma de decisiones estratégicas. Esto ocurre sobre todo en momentos clave como la selección de campeones (draft), la cual puede llegar a determinar gran parte del resultado de la partida sin siquiera jugar esta misma. De hecho, estudios sobre predicción en juegos competitivos sugieren que la fase de selección puede condicionar el éxito del encuentro de manera determinante antes de que los jugadores entren al mapa (Yang et al., 2016).</w:t>
+        <w:t xml:space="preserve">A lo largo de mis estudios y también gracias a mi experiencia personal con League of Legends, he visto algo que se repite bastante: aunque muchos jugadores tienen un nivel mecánico muy alto, les falla la toma de decisiones estratégicas. Esto ocurre sobre todo en momentos clave como la selección de campeones (draft), la cual puede llegar a determinar gran parte del resultado de la partida sin siquiera jugar esta misma. De hecho, estudios sobre predicción en juegos competitivos sugieren que la fase de selección puede condicionar el éxito del encuentro de manera determinante antes de que los jugadores entren al mapa </w:t>
+      </w:r>
+      <w:r>
+        <w:t xml:space="preserve">[1] </w:t>
+      </w:r>
+      <w:r>
+        <w:t>(Yang et al., 2016).</w:t>
       </w:r>
     </w:p>
     <w:p/>
@@ -3355,7 +3607,13 @@
       </w:r>
       <w:proofErr w:type="spellEnd"/>
       <w:r>
-        <w:t>” (Mora-Cantallops &amp; Sicart, 2018). Sustento esta idea gracias a que, con el tiempo, la escena competitiva dentro del mundo de los videojuegos se ha profesionalizado y se han estandarizado posiciones de coach (entrenador), analistas de draft, etc., mostrando que a nivel competitivo la toma de decisiones es relevante a los mismos niveles que saber jugar al juego con unas mecánicas profesionales.</w:t>
+        <w:t>”</w:t>
+      </w:r>
+      <w:r>
+        <w:t xml:space="preserve"> [2]</w:t>
+      </w:r>
+      <w:r>
+        <w:t xml:space="preserve"> (Mora-Cantallops &amp; Sicart, 2018). Sustento esta idea gracias a que, con el tiempo, la escena competitiva dentro del mundo de los videojuegos se ha profesionalizado y se han estandarizado posiciones de coach (entrenador), analistas de draft, etc., mostrando que a nivel competitivo la toma de decisiones es relevante a los mismos niveles que saber jugar al juego con unas mecánicas profesionales.</w:t>
       </w:r>
     </w:p>
     <w:p/>
@@ -3369,7 +3627,19 @@
       </w:r>
       <w:proofErr w:type="spellEnd"/>
       <w:r>
-        <w:t xml:space="preserve"> oficiales de Riot Games (2024), o diseñar un sistema en Python capaz de no solo dar recomendaciones, sino también explicar por qué las da. Esto último es especialmente relevante, ya que muchos modelos actuales de inteligencia artificial funcionan como “cajas negras” y no ofrecen una justificación clara de sus decisiones, lo que dificulta que el usuario confíe plenamente en el sistema (Russell &amp; Norvig, 2021).</w:t>
+        <w:t xml:space="preserve"> oficiales de </w:t>
+      </w:r>
+      <w:r>
+        <w:t xml:space="preserve">[3] </w:t>
+      </w:r>
+      <w:r>
+        <w:t xml:space="preserve">Riot Games (2024), o diseñar un sistema en Python capaz de no solo dar recomendaciones, sino también explicar por qué las da. Esto último es especialmente relevante, ya que muchos modelos actuales de inteligencia artificial funcionan como “cajas negras” y no ofrecen una justificación clara de sus decisiones, lo que dificulta que el usuario confíe plenamente en el sistema </w:t>
+      </w:r>
+      <w:r>
+        <w:t xml:space="preserve">[4] </w:t>
+      </w:r>
+      <w:r>
+        <w:t>(Russell &amp; Norvig, 2021).</w:t>
       </w:r>
     </w:p>
     <w:p/>
@@ -3381,11 +3651,11 @@
     <w:p/>
     <w:p>
       <w:r>
-        <w:t xml:space="preserve">Por último, esta introducción sirve como punto de partida para entender el resto del documento. En ella explico tanto la motivación detrás del proyecto como los conceptos básicos necesarios para seguirlo, incluso si no se tiene experiencia previa con este tipo de </w:t>
+        <w:t xml:space="preserve">Por último, esta introducción sirve como punto de partida para entender el resto del documento. En ella explico tanto la motivación detrás del proyecto como los conceptos </w:t>
       </w:r>
       <w:r>
         <w:lastRenderedPageBreak/>
-        <w:t>juegos competitivos. También presento la estructura del trabajo, que dará paso a un análisis más técnico donde se detallará cómo se ha desarrollado el sistema. En esencia, este proyecto intenta dar forma y sentido al caos estratégico de una partida de League of Legends, utilizando herramientas propias de la lógica computacional.</w:t>
+        <w:t>básicos necesarios para seguirlo, incluso si no se tiene experiencia previa con este tipo de juegos competitivos. También presento la estructura del trabajo, que dará paso a un análisis más técnico donde se detallará cómo se ha desarrollado el sistema. En esencia, este proyecto intenta dar forma y sentido al caos estratégico de una partida de League of Legends, utilizando herramientas propias de la lógica computacional.</w:t>
       </w:r>
     </w:p>
     <w:p/>
@@ -3401,82 +3671,1699 @@
     </w:p>
     <w:p>
       <w:r>
-        <w:t>La industria de los deportes electrónicos, también conocidos como eSports, ha experimentado un crecimiento exponencial en la última década, consolidándose como uno de los sectores más rentables e innovadores del entretenimiento digital (</w:t>
-      </w:r>
-      <w:r>
-        <w:t>Arık</w:t>
-      </w:r>
-      <w:r>
-        <w:t xml:space="preserve">, </w:t>
-      </w:r>
-      <w:r>
-        <w:t>2023</w:t>
-      </w:r>
-      <w:r>
-        <w:t>)</w:t>
-      </w:r>
-      <w:r>
-        <w:t>. Dentro de este ámbito, los juegos de tipo Multiplayer Online Battle Arena, también conocidos popularmente como MOBA, y en particular League Of Legends, presentan desafíos computacionales de primer nivel. Con un elenco de más de 170 campeones disponibles en la actualidad (Riot Games, s.f.) y miles de permutaciones de objetos, considero que la fase de selección de personaje (Draft) y la itemización generan un espacio de estados combinatorio masivo (“The Architecture of Intelligence”, s.f.). En este entorno, la victoria no depende únicamente de la habilidad mecánica del jugador, sino de decisiones stratégicas que mximicen las sinergias del equipo y neutralicen la composición rival.</w:t>
-      </w:r>
-    </w:p>
-    <w:p>
-      <w:r>
-        <w:t>A pesar de que el estado del arte ha porpuesto múltiples modelos de Aprendizaje Automático (Machine Learning) capaces de predecir el resultado de una partida con precisiones superiores al 75% (Do et al., 2021), observo que estos enfoques estadísticos y de redes neuronales a menudo operan como “cajas negras”. La falta de transparencia en sus predicciones limita severamente su adopción por parte de los usuarios, quienes necesitan comprender el razonamiento detrás de una recomendación para mejorar su aprendizaje estratégico (García-Méndez &amp; de Arriba-Pérez, s.f.).</w:t>
-      </w:r>
-    </w:p>
-    <w:p>
-      <w:r>
-        <w:t xml:space="preserve">Esta investigación surge de mi motivación por resolver dicha limitación mediante la creación de un Sistema Experto basado en reglas lógicas. A diferencia de los modelos puramente probabilísticos, propongo un sistema experto capaz de manejar la incertidumbre táctica mediante inferencias (potencialmente ampliada con lógica difusa) y de ofrecer explicabilidad (Explainable AI). Considero esto un equisito fundamental para garanizar la confianza del </w:t>
+        <w:t>La elección de este tema para mi Trabajo de Fin de Grado no es</w:t>
+      </w:r>
+      <w:r>
+        <w:t xml:space="preserve"> simplemente un gusto personal por el videojuego y lo que ofrece, también reside en que a nivel regional yo he llegado a competir y soy experto en el tema, por eso mismamente pensé que como experto y jugador podría aportar algo de valor al desarrollo del proyecto y no solamente como ingeniero</w:t>
+      </w:r>
+      <w:r>
+        <w:t xml:space="preserve">. Como estudiante y seguidor de la escena competitiva de League of Legends desde hace años, siempre me ha fascinado la enorme brecha que existe entre la ejecución técnica y la estrategia pura. He visto cómo, </w:t>
+      </w:r>
+      <w:r>
+        <w:t>muy frecuentemente</w:t>
+      </w:r>
+      <w:r>
+        <w:t xml:space="preserve">, partidas con jugadores brillantes se perdían en apenas diez minutos simplemente por una mala planificación inicial o </w:t>
+      </w:r>
+      <w:r>
+        <w:t>por una mala</w:t>
+      </w:r>
+      <w:r>
+        <w:t xml:space="preserve"> composición del equipo a lo que la partida requería</w:t>
+      </w:r>
+      <w:r>
+        <w:t>, y yo personalmente he vivido esto muchísimas ocasiones</w:t>
+      </w:r>
+      <w:r>
+        <w:t>.</w:t>
+      </w:r>
+    </w:p>
+    <w:p/>
+    <w:p>
+      <w:r>
+        <w:t>Mi principal motivación personal nace de esa frustración</w:t>
+      </w:r>
+      <w:r>
+        <w:t>,</w:t>
+      </w:r>
+      <w:r>
+        <w:t xml:space="preserve"> la sensación de que, en un juego tan complejo, la mayoría de los jugadores tomamos decisiones "de memoria" o siguiendo modas, sin entender realmente la lógica que hay detrás. Al investigar las herramientas de asistencia que existen hoy en día, me di cuenta de que casi todas se limitan a darte un porcentaje de victoria o una lista de objetos recomendados basada en estadísticas masivas. Sin embargo, ninguna de ellas te explica el "porqué". Como futuro ingeniero, me motivaba el reto de crear algo diferente</w:t>
+      </w:r>
+      <w:r>
+        <w:t>,</w:t>
+      </w:r>
+      <w:r>
+        <w:t xml:space="preserve"> un sistema que no solo te diga qué elegir, sino que sea capaz de razonar su decisión como lo haría un analista profesional.</w:t>
+      </w:r>
+    </w:p>
+    <w:p/>
+    <w:p>
+      <w:r>
+        <w:t>En cuanto a el</w:t>
+      </w:r>
+      <w:r>
+        <w:t xml:space="preserve"> plano tecnológico, me planteé el reto de ir un poco a contracorriente de las tendencias actuales. Hoy en día parece que cualquier solución de inteligencia artificial debe pasar obligatoriamente por el Machine Learning, pero estos modelos a menudo funcionan </w:t>
       </w:r>
       <w:r>
         <w:lastRenderedPageBreak/>
-        <w:t>jugador, al justificar en lenguaje natural por qué una decisión es óptima dadas las circunstancias del juego (“The Architecut”)</w:t>
-      </w:r>
-    </w:p>
+        <w:t>como cajas negras donde es imposible entender el porqué de un resultado. Mi intención con este trabajo ha sido reivindicar la utilidad de los Sistemas Expertos en entornos estratégicos. Me motivaba profundamente el desafío de programar desde cero un motor de inferencia en Python que fuera capaz de procesar reglas lógicas creadas por humanos. Al final, lo que buscaba era que el usuario no tuviera que creerse la recomendación porque sí. Me parecía mucho más interesante diseñar una arquitectura donde la lógica fuera totalmente abierta</w:t>
+      </w:r>
+      <w:r>
+        <w:t>,</w:t>
+      </w:r>
+      <w:r>
+        <w:t xml:space="preserve"> que el programa no se limite a dar una respuesta, sino que sea capaz de explicarle al jugador el porqué de cada decisión de una forma que tenga sentido y sea fácil de seguir.</w:t>
+      </w:r>
+      <w:r>
+        <w:t xml:space="preserve"> Esto aporta muchísimo valor para los nuevos jugadores que entran por primera vez al juego, pues en mi caso mismamente, tengo amigos que empiezan a jugar y al haber tantas posibilidades y variables se abruman, y la mayoría de </w:t>
+      </w:r>
+      <w:r>
+        <w:t>las aplicaciones</w:t>
+      </w:r>
+      <w:r>
+        <w:t xml:space="preserve"> existentes no te explican nada, solamente te dicen lo que tienes que hacer y que tienes que seleccionar y ya.</w:t>
+      </w:r>
+    </w:p>
+    <w:p/>
+    <w:p>
+      <w:r>
+        <w:t xml:space="preserve">Otro gran motor de este proyecto ha sido el reto de la implementación real. No quería que este trabajo se quedara en un simple estudio teórico. Me propuse el objetivo de desarrollar una aplicación funcional, utilizando Flask para crear una interfaz web que fuera intuitiva y profesional. Enfrentarme a problemas reales, como la gestión de las </w:t>
+      </w:r>
+      <w:proofErr w:type="spellStart"/>
+      <w:r>
+        <w:t>APIs</w:t>
+      </w:r>
+      <w:proofErr w:type="spellEnd"/>
+      <w:r>
+        <w:t xml:space="preserve"> de Riot Games, la actualización constante de los datos del juego o el diseño de un sistema de degradación elegante para que la interfaz no falle si una imagen no carga, ha sido una de las partes más enriquecedoras del proceso.</w:t>
+      </w:r>
+    </w:p>
+    <w:p/>
+    <w:p>
+      <w:r>
+        <w:t>Por concluir</w:t>
+      </w:r>
+      <w:r>
+        <w:t xml:space="preserve">, lo que me </w:t>
+      </w:r>
+      <w:r>
+        <w:t>motiva</w:t>
+      </w:r>
+      <w:r>
+        <w:t xml:space="preserve"> con este trabajo es la posibilidad de unir mi formación técnica con una de mis pasiones</w:t>
+      </w:r>
+      <w:r>
+        <w:t xml:space="preserve"> y experiencias competitivas</w:t>
+      </w:r>
+      <w:r>
+        <w:t xml:space="preserve">, creando una herramienta que aporte valor real y que demuestre que la </w:t>
+      </w:r>
+      <w:r>
+        <w:t>i</w:t>
+      </w:r>
+      <w:r>
+        <w:t xml:space="preserve">nteligencia </w:t>
+      </w:r>
+      <w:r>
+        <w:t>a</w:t>
+      </w:r>
+      <w:r>
+        <w:t xml:space="preserve">rtificial, cuando se aplica con una base de conocimiento sólida y estructurada, puede ser el mejor aliado para la toma de decisiones en entornos tan caóticos y competitivos como son los </w:t>
+      </w:r>
+      <w:proofErr w:type="spellStart"/>
+      <w:r>
+        <w:t>eSports</w:t>
+      </w:r>
+      <w:proofErr w:type="spellEnd"/>
+      <w:r>
+        <w:t>.</w:t>
+      </w:r>
+    </w:p>
+    <w:p/>
     <w:p>
       <w:pPr>
         <w:pStyle w:val="Ttulo2"/>
       </w:pPr>
-      <w:bookmarkStart w:id="5" w:name="_Toc149554658"/>
-      <w:r>
-        <w:t>Planteamiento del trabajo</w:t>
-      </w:r>
-      <w:bookmarkEnd w:id="5"/>
-    </w:p>
-    <w:p>
-      <w:r>
-        <w:t>Describe aquí las líneas generales del planteamiento de tu solución. Se trata de explicar qué tipo de aportación presentas en tu trabajo, cuáles son los objetivos</w:t>
-      </w:r>
-      <w:r>
-        <w:t xml:space="preserve"> y a qué tipo de resultados llegas.</w:t>
-      </w:r>
-      <w:r>
-        <w:t xml:space="preserve"> Aprovecha para resaltar aquello que te parezca más novedoso, interesante o útil de tu aportación, poniendo en valor </w:t>
-      </w:r>
-      <w:r>
-        <w:t>su importancia.</w:t>
+      <w:r>
+        <w:t>Conceptos básicos y dominio del problema</w:t>
+      </w:r>
+    </w:p>
+    <w:p>
+      <w:r>
+        <w:t>Para entender cómo funciona el sistema experto que he desarrollado, primero hay que</w:t>
+      </w:r>
+      <w:r>
+        <w:t xml:space="preserve"> </w:t>
+      </w:r>
+      <w:r>
+        <w:t xml:space="preserve">explicar qué es lo que ocurre realmente en una partida de League of Legends y cómo he </w:t>
+      </w:r>
+      <w:r>
+        <w:lastRenderedPageBreak/>
+        <w:t>traducido ese caos a un lenguaje que mi programa pueda entender. No se trata solo de un juego de destruir la base enemiga</w:t>
+      </w:r>
+      <w:r>
+        <w:t>,</w:t>
+      </w:r>
+      <w:r>
+        <w:t xml:space="preserve"> es un entorno de alta estrategia donde cada elección tiene una consecuencia lógica</w:t>
+      </w:r>
+      <w:r>
+        <w:t>.</w:t>
       </w:r>
     </w:p>
     <w:p/>
     <w:p>
-      <w:pPr>
-        <w:pStyle w:val="Ttulo2"/>
-      </w:pPr>
-      <w:bookmarkStart w:id="6" w:name="_Toc149554659"/>
-      <w:r>
-        <w:t>Estructura del trabajo</w:t>
-      </w:r>
-      <w:bookmarkEnd w:id="6"/>
-    </w:p>
-    <w:p>
-      <w:r>
-        <w:t xml:space="preserve">Finaliza el capítulo de introducción con una </w:t>
-      </w:r>
+      <w:r>
+        <w:t xml:space="preserve">El </w:t>
+      </w:r>
+      <w:r>
+        <w:t>LoL es un juego de género MOBA (Multiplayer Online Battle Arena) donde dos equipos de cinco jugadores compiten en un mapa cerrado llamado "La Grieta del Invocador". El objetivo final es destruir la base enemiga</w:t>
+      </w:r>
+      <w:r>
+        <w:t xml:space="preserve">, también conocida como </w:t>
+      </w:r>
+      <w:r>
+        <w:t>el Nexo, pero para llegar a ese punto hay que superar una serie de obstáculos y tomar cientos de decisiones tácticas.</w:t>
+      </w:r>
+    </w:p>
+    <w:p/>
+    <w:p>
+      <w:pPr>
+        <w:pStyle w:val="Descripcin"/>
+        <w:jc w:val="both"/>
+      </w:pPr>
       <w:r>
         <w:rPr>
           <w:b/>
           <w:bCs/>
         </w:rPr>
+        <w:t>Figura</w:t>
+      </w:r>
+      <w:r>
+        <w:rPr>
+          <w:b/>
+          <w:bCs/>
+        </w:rPr>
+        <w:t xml:space="preserve"> </w:t>
+      </w:r>
+      <w:r>
+        <w:rPr>
+          <w:b/>
+          <w:bCs/>
+        </w:rPr>
+        <w:fldChar w:fldCharType="begin"/>
+      </w:r>
+      <w:r>
+        <w:rPr>
+          <w:b/>
+          <w:bCs/>
+        </w:rPr>
+        <w:instrText xml:space="preserve"> SEQ Ilustración \* ARABIC </w:instrText>
+      </w:r>
+      <w:r>
+        <w:rPr>
+          <w:b/>
+          <w:bCs/>
+        </w:rPr>
+        <w:fldChar w:fldCharType="separate"/>
+      </w:r>
+      <w:r>
+        <w:rPr>
+          <w:b/>
+          <w:bCs/>
+          <w:noProof/>
+        </w:rPr>
+        <w:t>1</w:t>
+      </w:r>
+      <w:r>
+        <w:rPr>
+          <w:b/>
+          <w:bCs/>
+        </w:rPr>
+        <w:fldChar w:fldCharType="end"/>
+      </w:r>
+      <w:r>
+        <w:rPr>
+          <w:b/>
+          <w:bCs/>
+        </w:rPr>
+        <w:t>.</w:t>
+      </w:r>
+      <w:r>
+        <w:t xml:space="preserve"> </w:t>
+      </w:r>
+      <w:r>
+        <w:t xml:space="preserve">Mapa de la Grieta del Invocador con las líneas (Top, </w:t>
+      </w:r>
+      <w:proofErr w:type="spellStart"/>
+      <w:r>
+        <w:t>Mid</w:t>
+      </w:r>
+      <w:proofErr w:type="spellEnd"/>
+      <w:r>
+        <w:t>, Bot y Jungla)</w:t>
+      </w:r>
+    </w:p>
+    <w:p>
+      <w:pPr>
+        <w:keepNext/>
+      </w:pPr>
+      <w:r>
+        <w:rPr>
+          <w:noProof/>
+        </w:rPr>
+        <w:drawing>
+          <wp:inline distT="0" distB="0" distL="0" distR="0" wp14:anchorId="30A24DFD" wp14:editId="4B039261">
+            <wp:extent cx="4476750" cy="4174714"/>
+            <wp:effectExtent l="0" t="0" r="0" b="0"/>
+            <wp:docPr id="1484751047" name="Imagen 2" descr="League of Legends map and important locations."/>
+            <wp:cNvGraphicFramePr>
+              <a:graphicFrameLocks xmlns:a="http://schemas.openxmlformats.org/drawingml/2006/main" noChangeAspect="1"/>
+            </wp:cNvGraphicFramePr>
+            <a:graphic xmlns:a="http://schemas.openxmlformats.org/drawingml/2006/main">
+              <a:graphicData uri="http://schemas.openxmlformats.org/drawingml/2006/picture">
+                <pic:pic xmlns:pic="http://schemas.openxmlformats.org/drawingml/2006/picture">
+                  <pic:nvPicPr>
+                    <pic:cNvPr id="0" name="Picture 3" descr="League of Legends map and important locations."/>
+                    <pic:cNvPicPr>
+                      <a:picLocks noChangeAspect="1" noChangeArrowheads="1"/>
+                    </pic:cNvPicPr>
+                  </pic:nvPicPr>
+                  <pic:blipFill>
+                    <a:blip r:embed="rId16">
+                      <a:extLst>
+                        <a:ext uri="{28A0092B-C50C-407E-A947-70E740481C1C}">
+                          <a14:useLocalDpi xmlns:a14="http://schemas.microsoft.com/office/drawing/2010/main" val="0"/>
+                        </a:ext>
+                      </a:extLst>
+                    </a:blip>
+                    <a:srcRect/>
+                    <a:stretch>
+                      <a:fillRect/>
+                    </a:stretch>
+                  </pic:blipFill>
+                  <pic:spPr bwMode="auto">
+                    <a:xfrm>
+                      <a:off x="0" y="0"/>
+                      <a:ext cx="4491466" cy="4188437"/>
+                    </a:xfrm>
+                    <a:prstGeom prst="rect">
+                      <a:avLst/>
+                    </a:prstGeom>
+                    <a:noFill/>
+                    <a:ln>
+                      <a:noFill/>
+                    </a:ln>
+                  </pic:spPr>
+                </pic:pic>
+              </a:graphicData>
+            </a:graphic>
+          </wp:inline>
+        </w:drawing>
+      </w:r>
+    </w:p>
+    <w:p>
+      <w:pPr>
+        <w:rPr>
+          <w:lang w:val="en-US"/>
+        </w:rPr>
+      </w:pPr>
+      <w:r>
+        <w:rPr>
+          <w:lang w:val="en-US"/>
+        </w:rPr>
+        <w:t xml:space="preserve">Fuente: </w:t>
+      </w:r>
+      <w:r>
+        <w:rPr>
+          <w:lang w:val="en-US"/>
+        </w:rPr>
+        <w:t xml:space="preserve">[5] </w:t>
+      </w:r>
+      <w:r>
+        <w:rPr>
+          <w:lang w:val="en-US"/>
+        </w:rPr>
+        <w:t>League of Legends m</w:t>
+      </w:r>
+      <w:r>
+        <w:rPr>
+          <w:lang w:val="en-US"/>
+        </w:rPr>
+        <w:t>ap and important locations</w:t>
+      </w:r>
+      <w:r>
+        <w:rPr>
+          <w:lang w:val="en-US"/>
+        </w:rPr>
+        <w:t>,</w:t>
+      </w:r>
+      <w:r>
+        <w:rPr>
+          <w:lang w:val="en-US"/>
+        </w:rPr>
+        <w:t xml:space="preserve"> </w:t>
+      </w:r>
+      <w:r>
+        <w:rPr>
+          <w:lang w:val="en-US"/>
+        </w:rPr>
+        <w:t>ResearchGate</w:t>
+      </w:r>
+      <w:r>
+        <w:rPr>
+          <w:lang w:val="en-US"/>
+        </w:rPr>
+        <w:t xml:space="preserve"> (2019)</w:t>
+      </w:r>
+    </w:p>
+    <w:p>
+      <w:pPr>
+        <w:rPr>
+          <w:lang w:val="en-US"/>
+        </w:rPr>
+      </w:pPr>
+    </w:p>
+    <w:p>
+      <w:r>
+        <w:t xml:space="preserve">Como se ve en el mapa, cada jugador ocupa una posición. Sin embargo, lo que realmente importa para mi sistema no es solo dónde se coloca el jugador, sino qué "tipo" de entidad está </w:t>
+      </w:r>
+      <w:r>
+        <w:lastRenderedPageBreak/>
+        <w:t>manejando. Aquí es donde entra la parte técnica de mi trabajo: la creación de una ontología de etiquetas propia.</w:t>
+      </w:r>
+    </w:p>
+    <w:p/>
+    <w:p>
+      <w:pPr>
+        <w:rPr>
+          <w:rFonts w:asciiTheme="majorHAnsi" w:hAnsiTheme="majorHAnsi" w:cs="Arial"/>
+          <w:bCs/>
+          <w:iCs/>
+          <w:color w:val="0098CD"/>
+          <w:sz w:val="28"/>
+          <w:szCs w:val="28"/>
+        </w:rPr>
+      </w:pPr>
+      <w:r>
+        <w:rPr>
+          <w:rFonts w:asciiTheme="majorHAnsi" w:hAnsiTheme="majorHAnsi" w:cs="Arial"/>
+          <w:bCs/>
+          <w:iCs/>
+          <w:color w:val="0098CD"/>
+          <w:sz w:val="28"/>
+          <w:szCs w:val="28"/>
+        </w:rPr>
+        <w:t>1.2.1</w:t>
+      </w:r>
+      <w:r>
+        <w:rPr>
+          <w:rFonts w:asciiTheme="majorHAnsi" w:hAnsiTheme="majorHAnsi" w:cs="Arial"/>
+          <w:bCs/>
+          <w:iCs/>
+          <w:color w:val="0098CD"/>
+          <w:sz w:val="28"/>
+          <w:szCs w:val="28"/>
+        </w:rPr>
+        <w:t>.</w:t>
+      </w:r>
+      <w:r>
+        <w:rPr>
+          <w:rFonts w:asciiTheme="majorHAnsi" w:hAnsiTheme="majorHAnsi" w:cs="Arial"/>
+          <w:bCs/>
+          <w:iCs/>
+          <w:color w:val="0098CD"/>
+          <w:sz w:val="28"/>
+          <w:szCs w:val="28"/>
+        </w:rPr>
+        <w:t xml:space="preserve"> </w:t>
+      </w:r>
+      <w:r>
+        <w:rPr>
+          <w:rFonts w:asciiTheme="majorHAnsi" w:hAnsiTheme="majorHAnsi" w:cs="Arial"/>
+          <w:bCs/>
+          <w:iCs/>
+          <w:color w:val="0098CD"/>
+          <w:sz w:val="28"/>
+          <w:szCs w:val="28"/>
+        </w:rPr>
+        <w:t>Ontología de etiquetas y roles</w:t>
+      </w:r>
+    </w:p>
+    <w:p>
+      <w:r>
+        <w:t xml:space="preserve">A diferencia de otras herramientas que usan las categorías estándar que vienen en la documentación oficial, yo he decidido crear un vocabulario de etiquetas propio en mi base de conocimientos. Esto me permite ser mucho más preciso. Por ejemplo, en lugar de decir simplemente que un campeón es un "Mago", mi sistema puede identificar si es un </w:t>
+      </w:r>
+      <w:proofErr w:type="spellStart"/>
+      <w:r>
+        <w:t>magic_damage</w:t>
+      </w:r>
+      <w:proofErr w:type="spellEnd"/>
+      <w:r>
+        <w:t xml:space="preserve"> (fuente de daño) o si tiene </w:t>
+      </w:r>
+      <w:proofErr w:type="spellStart"/>
+      <w:r>
+        <w:t>cc_heavy</w:t>
+      </w:r>
+      <w:proofErr w:type="spellEnd"/>
+      <w:r>
+        <w:t xml:space="preserve"> (mucho control de masas).</w:t>
+      </w:r>
+    </w:p>
+    <w:p/>
+    <w:p>
+      <w:r>
+        <w:t xml:space="preserve">En la siguiente tabla detallo algunas de las etiquetas clave que he definido en el archivo </w:t>
+      </w:r>
+      <w:proofErr w:type="spellStart"/>
+      <w:r>
+        <w:t>champions.json</w:t>
+      </w:r>
+      <w:proofErr w:type="spellEnd"/>
+      <w:r>
+        <w:t xml:space="preserve"> y que el motor de inferencia utiliza para razonar:</w:t>
+      </w:r>
+    </w:p>
+    <w:p>
+      <w:r>
+        <w:rPr>
+          <w:b/>
+          <w:bCs/>
+        </w:rPr>
+        <w:t>Tabla 1</w:t>
+      </w:r>
+      <w:r>
+        <w:rPr>
+          <w:b/>
+          <w:bCs/>
+        </w:rPr>
+        <w:t xml:space="preserve">. </w:t>
+      </w:r>
+      <w:r>
+        <w:t>Ontología de Etiquetas del Sistema Experto</w:t>
+      </w:r>
+    </w:p>
+    <w:tbl>
+      <w:tblPr>
+        <w:tblStyle w:val="Tablaconcuadrcula"/>
+        <w:tblW w:w="9183" w:type="dxa"/>
+        <w:tblBorders>
+          <w:top w:val="none" w:sz="0" w:space="0" w:color="auto"/>
+          <w:left w:val="none" w:sz="0" w:space="0" w:color="auto"/>
+          <w:bottom w:val="none" w:sz="0" w:space="0" w:color="auto"/>
+          <w:right w:val="none" w:sz="0" w:space="0" w:color="auto"/>
+          <w:insideH w:val="none" w:sz="0" w:space="0" w:color="auto"/>
+          <w:insideV w:val="none" w:sz="0" w:space="0" w:color="auto"/>
+        </w:tblBorders>
+        <w:tblLook w:val="04A0" w:firstRow="1" w:lastRow="0" w:firstColumn="1" w:lastColumn="0" w:noHBand="0" w:noVBand="1"/>
+      </w:tblPr>
+      <w:tblGrid>
+        <w:gridCol w:w="3061"/>
+        <w:gridCol w:w="3061"/>
+        <w:gridCol w:w="3061"/>
+      </w:tblGrid>
+      <w:tr>
+        <w:trPr>
+          <w:trHeight w:val="454"/>
+        </w:trPr>
+        <w:tc>
+          <w:tcPr>
+            <w:tcW w:w="3061" w:type="dxa"/>
+            <w:tcBorders>
+              <w:top w:val="single" w:sz="12" w:space="0" w:color="auto"/>
+              <w:bottom w:val="single" w:sz="12" w:space="0" w:color="auto"/>
+            </w:tcBorders>
+            <w:shd w:val="clear" w:color="auto" w:fill="D9D9D9" w:themeFill="background1" w:themeFillShade="D9"/>
+            <w:vAlign w:val="center"/>
+          </w:tcPr>
+          <w:p>
+            <w:pPr>
+              <w:jc w:val="center"/>
+              <w:rPr>
+                <w:b/>
+                <w:bCs/>
+                <w:sz w:val="22"/>
+                <w:szCs w:val="22"/>
+              </w:rPr>
+            </w:pPr>
+            <w:r>
+              <w:rPr>
+                <w:b/>
+                <w:bCs/>
+                <w:sz w:val="22"/>
+                <w:szCs w:val="22"/>
+              </w:rPr>
+              <w:t>Etiqueta (Tag)</w:t>
+            </w:r>
+          </w:p>
+        </w:tc>
+        <w:tc>
+          <w:tcPr>
+            <w:tcW w:w="3061" w:type="dxa"/>
+            <w:tcBorders>
+              <w:top w:val="single" w:sz="12" w:space="0" w:color="auto"/>
+              <w:bottom w:val="single" w:sz="12" w:space="0" w:color="auto"/>
+            </w:tcBorders>
+            <w:shd w:val="clear" w:color="auto" w:fill="D9D9D9" w:themeFill="background1" w:themeFillShade="D9"/>
+            <w:vAlign w:val="center"/>
+          </w:tcPr>
+          <w:p>
+            <w:pPr>
+              <w:jc w:val="center"/>
+              <w:rPr>
+                <w:b/>
+                <w:bCs/>
+                <w:sz w:val="22"/>
+                <w:szCs w:val="22"/>
+              </w:rPr>
+            </w:pPr>
+            <w:r>
+              <w:rPr>
+                <w:b/>
+                <w:bCs/>
+                <w:sz w:val="22"/>
+                <w:szCs w:val="22"/>
+              </w:rPr>
+              <w:t xml:space="preserve"> Significado Estratégico</w:t>
+            </w:r>
+          </w:p>
+        </w:tc>
+        <w:tc>
+          <w:tcPr>
+            <w:tcW w:w="3061" w:type="dxa"/>
+            <w:tcBorders>
+              <w:top w:val="single" w:sz="12" w:space="0" w:color="auto"/>
+              <w:bottom w:val="single" w:sz="12" w:space="0" w:color="auto"/>
+            </w:tcBorders>
+            <w:shd w:val="clear" w:color="auto" w:fill="D9D9D9" w:themeFill="background1" w:themeFillShade="D9"/>
+            <w:vAlign w:val="center"/>
+          </w:tcPr>
+          <w:p>
+            <w:pPr>
+              <w:jc w:val="center"/>
+              <w:rPr>
+                <w:b/>
+                <w:bCs/>
+                <w:sz w:val="22"/>
+                <w:szCs w:val="22"/>
+              </w:rPr>
+            </w:pPr>
+            <w:r>
+              <w:rPr>
+                <w:b/>
+                <w:bCs/>
+                <w:sz w:val="22"/>
+                <w:szCs w:val="22"/>
+              </w:rPr>
+              <w:t>Función en el Motor</w:t>
+            </w:r>
+          </w:p>
+        </w:tc>
+      </w:tr>
+      <w:tr>
+        <w:trPr>
+          <w:trHeight w:val="454"/>
+        </w:trPr>
+        <w:tc>
+          <w:tcPr>
+            <w:tcW w:w="3061" w:type="dxa"/>
+            <w:tcBorders>
+              <w:top w:val="single" w:sz="12" w:space="0" w:color="auto"/>
+              <w:bottom w:val="single" w:sz="4" w:space="0" w:color="auto"/>
+            </w:tcBorders>
+            <w:vAlign w:val="center"/>
+          </w:tcPr>
+          <w:p>
+            <w:pPr>
+              <w:jc w:val="left"/>
+              <w:rPr>
+                <w:sz w:val="22"/>
+                <w:szCs w:val="22"/>
+              </w:rPr>
+            </w:pPr>
+            <w:proofErr w:type="spellStart"/>
+            <w:r>
+              <w:rPr>
+                <w:sz w:val="22"/>
+                <w:szCs w:val="22"/>
+              </w:rPr>
+              <w:t>Bruiser</w:t>
+            </w:r>
+            <w:proofErr w:type="spellEnd"/>
+            <w:r>
+              <w:rPr>
+                <w:sz w:val="22"/>
+                <w:szCs w:val="22"/>
+              </w:rPr>
+              <w:t xml:space="preserve"> / </w:t>
+            </w:r>
+            <w:proofErr w:type="spellStart"/>
+            <w:r>
+              <w:rPr>
+                <w:sz w:val="22"/>
+                <w:szCs w:val="22"/>
+              </w:rPr>
+              <w:t>Fighter</w:t>
+            </w:r>
+            <w:proofErr w:type="spellEnd"/>
+          </w:p>
+        </w:tc>
+        <w:tc>
+          <w:tcPr>
+            <w:tcW w:w="3061" w:type="dxa"/>
+            <w:tcBorders>
+              <w:top w:val="single" w:sz="12" w:space="0" w:color="auto"/>
+              <w:bottom w:val="single" w:sz="4" w:space="0" w:color="auto"/>
+            </w:tcBorders>
+            <w:vAlign w:val="center"/>
+          </w:tcPr>
+          <w:p>
+            <w:pPr>
+              <w:jc w:val="center"/>
+              <w:rPr>
+                <w:sz w:val="22"/>
+                <w:szCs w:val="22"/>
+              </w:rPr>
+            </w:pPr>
+            <w:r>
+              <w:rPr>
+                <w:sz w:val="22"/>
+                <w:szCs w:val="22"/>
+              </w:rPr>
+              <w:t>Luchador cuerpo a cuerpo.</w:t>
+            </w:r>
+          </w:p>
+        </w:tc>
+        <w:tc>
+          <w:tcPr>
+            <w:tcW w:w="3061" w:type="dxa"/>
+            <w:tcBorders>
+              <w:top w:val="single" w:sz="12" w:space="0" w:color="auto"/>
+              <w:bottom w:val="single" w:sz="4" w:space="0" w:color="auto"/>
+            </w:tcBorders>
+            <w:vAlign w:val="center"/>
+          </w:tcPr>
+          <w:p>
+            <w:pPr>
+              <w:jc w:val="center"/>
+              <w:rPr>
+                <w:sz w:val="22"/>
+                <w:szCs w:val="22"/>
+              </w:rPr>
+            </w:pPr>
+            <w:r>
+              <w:rPr>
+                <w:sz w:val="22"/>
+                <w:szCs w:val="22"/>
+              </w:rPr>
+              <w:t>Evalúa la resistencia en peleas largas.</w:t>
+            </w:r>
+          </w:p>
+        </w:tc>
+      </w:tr>
+      <w:tr>
+        <w:trPr>
+          <w:trHeight w:val="454"/>
+        </w:trPr>
+        <w:tc>
+          <w:tcPr>
+            <w:tcW w:w="3061" w:type="dxa"/>
+            <w:tcBorders>
+              <w:top w:val="single" w:sz="4" w:space="0" w:color="auto"/>
+              <w:bottom w:val="single" w:sz="4" w:space="0" w:color="auto"/>
+            </w:tcBorders>
+            <w:vAlign w:val="center"/>
+          </w:tcPr>
+          <w:p>
+            <w:pPr>
+              <w:jc w:val="left"/>
+              <w:rPr>
+                <w:sz w:val="22"/>
+                <w:szCs w:val="22"/>
+              </w:rPr>
+            </w:pPr>
+            <w:r>
+              <w:rPr>
+                <w:sz w:val="22"/>
+                <w:szCs w:val="22"/>
+              </w:rPr>
+              <w:t>Marksman</w:t>
+            </w:r>
+          </w:p>
+        </w:tc>
+        <w:tc>
+          <w:tcPr>
+            <w:tcW w:w="3061" w:type="dxa"/>
+            <w:tcBorders>
+              <w:top w:val="single" w:sz="4" w:space="0" w:color="auto"/>
+              <w:bottom w:val="single" w:sz="4" w:space="0" w:color="auto"/>
+            </w:tcBorders>
+            <w:vAlign w:val="center"/>
+          </w:tcPr>
+          <w:p>
+            <w:pPr>
+              <w:jc w:val="center"/>
+              <w:rPr>
+                <w:sz w:val="22"/>
+                <w:szCs w:val="22"/>
+              </w:rPr>
+            </w:pPr>
+            <w:r>
+              <w:rPr>
+                <w:sz w:val="22"/>
+                <w:szCs w:val="22"/>
+              </w:rPr>
+              <w:t>Tirador de daño constante.</w:t>
+            </w:r>
+          </w:p>
+        </w:tc>
+        <w:tc>
+          <w:tcPr>
+            <w:tcW w:w="3061" w:type="dxa"/>
+            <w:tcBorders>
+              <w:top w:val="single" w:sz="4" w:space="0" w:color="auto"/>
+              <w:bottom w:val="single" w:sz="4" w:space="0" w:color="auto"/>
+            </w:tcBorders>
+            <w:vAlign w:val="center"/>
+          </w:tcPr>
+          <w:p>
+            <w:pPr>
+              <w:jc w:val="center"/>
+              <w:rPr>
+                <w:sz w:val="22"/>
+                <w:szCs w:val="22"/>
+              </w:rPr>
+            </w:pPr>
+            <w:r>
+              <w:rPr>
+                <w:sz w:val="22"/>
+                <w:szCs w:val="22"/>
+              </w:rPr>
+              <w:t>Detecta la necesidad de protección o de armadura enemiga.</w:t>
+            </w:r>
+          </w:p>
+        </w:tc>
+      </w:tr>
+      <w:tr>
+        <w:trPr>
+          <w:trHeight w:val="454"/>
+        </w:trPr>
+        <w:tc>
+          <w:tcPr>
+            <w:tcW w:w="3061" w:type="dxa"/>
+            <w:tcBorders>
+              <w:top w:val="single" w:sz="4" w:space="0" w:color="auto"/>
+              <w:bottom w:val="single" w:sz="4" w:space="0" w:color="auto"/>
+            </w:tcBorders>
+            <w:vAlign w:val="center"/>
+          </w:tcPr>
+          <w:p>
+            <w:pPr>
+              <w:jc w:val="left"/>
+              <w:rPr>
+                <w:sz w:val="22"/>
+                <w:szCs w:val="22"/>
+              </w:rPr>
+            </w:pPr>
+            <w:proofErr w:type="spellStart"/>
+            <w:r>
+              <w:rPr>
+                <w:sz w:val="22"/>
+                <w:szCs w:val="22"/>
+              </w:rPr>
+              <w:t>Healing_self</w:t>
+            </w:r>
+            <w:proofErr w:type="spellEnd"/>
+          </w:p>
+        </w:tc>
+        <w:tc>
+          <w:tcPr>
+            <w:tcW w:w="3061" w:type="dxa"/>
+            <w:tcBorders>
+              <w:top w:val="single" w:sz="4" w:space="0" w:color="auto"/>
+              <w:bottom w:val="single" w:sz="4" w:space="0" w:color="auto"/>
+            </w:tcBorders>
+            <w:vAlign w:val="center"/>
+          </w:tcPr>
+          <w:p>
+            <w:pPr>
+              <w:jc w:val="center"/>
+              <w:rPr>
+                <w:sz w:val="22"/>
+                <w:szCs w:val="22"/>
+              </w:rPr>
+            </w:pPr>
+            <w:r>
+              <w:rPr>
+                <w:sz w:val="22"/>
+                <w:szCs w:val="22"/>
+              </w:rPr>
+              <w:t>Autocuración propia.</w:t>
+            </w:r>
+          </w:p>
+        </w:tc>
+        <w:tc>
+          <w:tcPr>
+            <w:tcW w:w="3061" w:type="dxa"/>
+            <w:tcBorders>
+              <w:top w:val="single" w:sz="4" w:space="0" w:color="auto"/>
+              <w:bottom w:val="single" w:sz="4" w:space="0" w:color="auto"/>
+            </w:tcBorders>
+            <w:vAlign w:val="center"/>
+          </w:tcPr>
+          <w:p>
+            <w:pPr>
+              <w:jc w:val="center"/>
+              <w:rPr>
+                <w:sz w:val="22"/>
+                <w:szCs w:val="22"/>
+              </w:rPr>
+            </w:pPr>
+            <w:r>
+              <w:rPr>
+                <w:sz w:val="22"/>
+                <w:szCs w:val="22"/>
+              </w:rPr>
+              <w:t>Dispara la regla de recomendación de "</w:t>
+            </w:r>
+            <w:proofErr w:type="spellStart"/>
+            <w:r>
+              <w:rPr>
+                <w:sz w:val="22"/>
+                <w:szCs w:val="22"/>
+              </w:rPr>
+              <w:t>anti-curación</w:t>
+            </w:r>
+            <w:proofErr w:type="spellEnd"/>
+            <w:r>
+              <w:rPr>
+                <w:sz w:val="22"/>
+                <w:szCs w:val="22"/>
+              </w:rPr>
+              <w:t>".</w:t>
+            </w:r>
+          </w:p>
+        </w:tc>
+      </w:tr>
+      <w:tr>
+        <w:trPr>
+          <w:trHeight w:val="454"/>
+        </w:trPr>
+        <w:tc>
+          <w:tcPr>
+            <w:tcW w:w="3061" w:type="dxa"/>
+            <w:tcBorders>
+              <w:top w:val="single" w:sz="4" w:space="0" w:color="auto"/>
+              <w:bottom w:val="single" w:sz="4" w:space="0" w:color="auto"/>
+            </w:tcBorders>
+            <w:vAlign w:val="center"/>
+          </w:tcPr>
+          <w:p>
+            <w:pPr>
+              <w:jc w:val="left"/>
+              <w:rPr>
+                <w:sz w:val="22"/>
+                <w:szCs w:val="22"/>
+              </w:rPr>
+            </w:pPr>
+            <w:proofErr w:type="spellStart"/>
+            <w:r>
+              <w:rPr>
+                <w:sz w:val="22"/>
+                <w:szCs w:val="22"/>
+              </w:rPr>
+              <w:t>Cc_heavy</w:t>
+            </w:r>
+            <w:proofErr w:type="spellEnd"/>
+          </w:p>
+        </w:tc>
+        <w:tc>
+          <w:tcPr>
+            <w:tcW w:w="3061" w:type="dxa"/>
+            <w:tcBorders>
+              <w:top w:val="single" w:sz="4" w:space="0" w:color="auto"/>
+              <w:bottom w:val="single" w:sz="4" w:space="0" w:color="auto"/>
+            </w:tcBorders>
+            <w:vAlign w:val="center"/>
+          </w:tcPr>
+          <w:p>
+            <w:pPr>
+              <w:jc w:val="center"/>
+              <w:rPr>
+                <w:sz w:val="22"/>
+                <w:szCs w:val="22"/>
+              </w:rPr>
+            </w:pPr>
+            <w:r>
+              <w:rPr>
+                <w:sz w:val="22"/>
+                <w:szCs w:val="22"/>
+              </w:rPr>
+              <w:t>Control de masas múltiple.</w:t>
+            </w:r>
+          </w:p>
+        </w:tc>
+        <w:tc>
+          <w:tcPr>
+            <w:tcW w:w="3061" w:type="dxa"/>
+            <w:tcBorders>
+              <w:top w:val="single" w:sz="4" w:space="0" w:color="auto"/>
+              <w:bottom w:val="single" w:sz="4" w:space="0" w:color="auto"/>
+            </w:tcBorders>
+            <w:vAlign w:val="center"/>
+          </w:tcPr>
+          <w:p>
+            <w:pPr>
+              <w:jc w:val="center"/>
+              <w:rPr>
+                <w:sz w:val="22"/>
+                <w:szCs w:val="22"/>
+              </w:rPr>
+            </w:pPr>
+            <w:r>
+              <w:rPr>
+                <w:sz w:val="22"/>
+                <w:szCs w:val="22"/>
+              </w:rPr>
+              <w:t>Activa la recomendación de "tenacidad" o resistencia.</w:t>
+            </w:r>
+          </w:p>
+        </w:tc>
+      </w:tr>
+      <w:tr>
+        <w:trPr>
+          <w:trHeight w:val="454"/>
+        </w:trPr>
+        <w:tc>
+          <w:tcPr>
+            <w:tcW w:w="3061" w:type="dxa"/>
+            <w:tcBorders>
+              <w:top w:val="single" w:sz="4" w:space="0" w:color="auto"/>
+              <w:bottom w:val="single" w:sz="4" w:space="0" w:color="auto"/>
+            </w:tcBorders>
+            <w:vAlign w:val="center"/>
+          </w:tcPr>
+          <w:p>
+            <w:pPr>
+              <w:jc w:val="left"/>
+              <w:rPr>
+                <w:sz w:val="22"/>
+                <w:szCs w:val="22"/>
+              </w:rPr>
+            </w:pPr>
+            <w:proofErr w:type="spellStart"/>
+            <w:r>
+              <w:rPr>
+                <w:sz w:val="22"/>
+                <w:szCs w:val="22"/>
+              </w:rPr>
+              <w:t>Magic_damage</w:t>
+            </w:r>
+            <w:proofErr w:type="spellEnd"/>
+          </w:p>
+        </w:tc>
+        <w:tc>
+          <w:tcPr>
+            <w:tcW w:w="3061" w:type="dxa"/>
+            <w:tcBorders>
+              <w:top w:val="single" w:sz="4" w:space="0" w:color="auto"/>
+              <w:bottom w:val="single" w:sz="4" w:space="0" w:color="auto"/>
+            </w:tcBorders>
+            <w:vAlign w:val="center"/>
+          </w:tcPr>
+          <w:p>
+            <w:pPr>
+              <w:jc w:val="center"/>
+              <w:rPr>
+                <w:sz w:val="22"/>
+                <w:szCs w:val="22"/>
+              </w:rPr>
+            </w:pPr>
+            <w:r>
+              <w:rPr>
+                <w:sz w:val="22"/>
+                <w:szCs w:val="22"/>
+              </w:rPr>
+              <w:t>Daño de tipo mágico.</w:t>
+            </w:r>
+          </w:p>
+        </w:tc>
+        <w:tc>
+          <w:tcPr>
+            <w:tcW w:w="3061" w:type="dxa"/>
+            <w:tcBorders>
+              <w:top w:val="single" w:sz="4" w:space="0" w:color="auto"/>
+              <w:bottom w:val="single" w:sz="4" w:space="0" w:color="auto"/>
+            </w:tcBorders>
+            <w:vAlign w:val="center"/>
+          </w:tcPr>
+          <w:p>
+            <w:pPr>
+              <w:jc w:val="center"/>
+              <w:rPr>
+                <w:sz w:val="22"/>
+                <w:szCs w:val="22"/>
+              </w:rPr>
+            </w:pPr>
+            <w:r>
+              <w:rPr>
+                <w:sz w:val="22"/>
+                <w:szCs w:val="22"/>
+              </w:rPr>
+              <w:t>Se usa para equilibrar el daño del equipo aliado (AP vs AD).</w:t>
+            </w:r>
+          </w:p>
+        </w:tc>
+      </w:tr>
+    </w:tbl>
+    <w:p/>
+    <w:p>
+      <w:r>
+        <w:lastRenderedPageBreak/>
+        <w:t xml:space="preserve">Fuente: </w:t>
+      </w:r>
+      <w:r>
+        <w:t>Elaboración propia basada en la arquitectura del motor de inferencia.</w:t>
+      </w:r>
+    </w:p>
+    <w:p/>
+    <w:p>
+      <w:pPr>
+        <w:rPr>
+          <w:rFonts w:asciiTheme="majorHAnsi" w:hAnsiTheme="majorHAnsi" w:cs="Arial"/>
+          <w:bCs/>
+          <w:iCs/>
+          <w:color w:val="0098CD"/>
+          <w:sz w:val="28"/>
+          <w:szCs w:val="28"/>
+        </w:rPr>
+      </w:pPr>
+      <w:r>
+        <w:rPr>
+          <w:rFonts w:asciiTheme="majorHAnsi" w:hAnsiTheme="majorHAnsi" w:cs="Arial"/>
+          <w:bCs/>
+          <w:iCs/>
+          <w:color w:val="0098CD"/>
+          <w:sz w:val="28"/>
+          <w:szCs w:val="28"/>
+        </w:rPr>
+        <w:t>1.2.</w:t>
+      </w:r>
+      <w:r>
+        <w:rPr>
+          <w:rFonts w:asciiTheme="majorHAnsi" w:hAnsiTheme="majorHAnsi" w:cs="Arial"/>
+          <w:bCs/>
+          <w:iCs/>
+          <w:color w:val="0098CD"/>
+          <w:sz w:val="28"/>
+          <w:szCs w:val="28"/>
+        </w:rPr>
+        <w:t>2</w:t>
+      </w:r>
+      <w:r>
+        <w:rPr>
+          <w:rFonts w:asciiTheme="majorHAnsi" w:hAnsiTheme="majorHAnsi" w:cs="Arial"/>
+          <w:bCs/>
+          <w:iCs/>
+          <w:color w:val="0098CD"/>
+          <w:sz w:val="28"/>
+          <w:szCs w:val="28"/>
+        </w:rPr>
+        <w:t>.</w:t>
+      </w:r>
+      <w:r>
+        <w:rPr>
+          <w:rFonts w:asciiTheme="majorHAnsi" w:hAnsiTheme="majorHAnsi" w:cs="Arial"/>
+          <w:bCs/>
+          <w:iCs/>
+          <w:color w:val="0098CD"/>
+          <w:sz w:val="28"/>
+          <w:szCs w:val="28"/>
+        </w:rPr>
+        <w:t xml:space="preserve"> </w:t>
+      </w:r>
+      <w:r>
+        <w:rPr>
+          <w:rFonts w:asciiTheme="majorHAnsi" w:hAnsiTheme="majorHAnsi" w:cs="Arial"/>
+          <w:bCs/>
+          <w:iCs/>
+          <w:color w:val="0098CD"/>
+          <w:sz w:val="28"/>
+          <w:szCs w:val="28"/>
+        </w:rPr>
+        <w:t>El “hecho” (</w:t>
+      </w:r>
+      <w:proofErr w:type="spellStart"/>
+      <w:r>
+        <w:rPr>
+          <w:rFonts w:asciiTheme="majorHAnsi" w:hAnsiTheme="majorHAnsi" w:cs="Arial"/>
+          <w:bCs/>
+          <w:iCs/>
+          <w:color w:val="0098CD"/>
+          <w:sz w:val="28"/>
+          <w:szCs w:val="28"/>
+        </w:rPr>
+        <w:t>fact</w:t>
+      </w:r>
+      <w:proofErr w:type="spellEnd"/>
+      <w:r>
+        <w:rPr>
+          <w:rFonts w:asciiTheme="majorHAnsi" w:hAnsiTheme="majorHAnsi" w:cs="Arial"/>
+          <w:bCs/>
+          <w:iCs/>
+          <w:color w:val="0098CD"/>
+          <w:sz w:val="28"/>
+          <w:szCs w:val="28"/>
+        </w:rPr>
+        <w:t>) y la explicabilidad</w:t>
+      </w:r>
+    </w:p>
+    <w:p>
+      <w:r>
+        <w:t xml:space="preserve">Para que el sistema tome una decisión, necesita convertir lo que pasa en la pantalla en "hechos" lógicos. He diseñado una clase llamada </w:t>
+      </w:r>
+      <w:proofErr w:type="spellStart"/>
+      <w:r>
+        <w:t>Fact</w:t>
+      </w:r>
+      <w:proofErr w:type="spellEnd"/>
+      <w:r>
+        <w:t xml:space="preserve"> que es el corazón de la inteligencia del programa. Lo que hace especial a esta clase es que no solo guarda el dato (por ejemplo, "hay un enemigo tanque"), sino que guarda el </w:t>
+      </w:r>
+      <w:proofErr w:type="spellStart"/>
+      <w:r>
+        <w:t>source</w:t>
+      </w:r>
+      <w:proofErr w:type="spellEnd"/>
+      <w:r>
+        <w:t xml:space="preserve"> (la fuente).</w:t>
+      </w:r>
+    </w:p>
+    <w:p/>
+    <w:p>
+      <w:r>
+        <w:t xml:space="preserve">Esto es fundamental para lo que comentaba antes sobre la explicabilidad. Como señalan </w:t>
+      </w:r>
+      <w:r>
+        <w:t xml:space="preserve">[4] </w:t>
+      </w:r>
+      <w:r>
+        <w:t xml:space="preserve">Russell y Norvig (2021), un sistema inteligente es mucho más útil si puede justificar sus conclusiones. Gracias a este atributo </w:t>
+      </w:r>
+      <w:proofErr w:type="spellStart"/>
+      <w:r>
+        <w:t>source</w:t>
+      </w:r>
+      <w:proofErr w:type="spellEnd"/>
+      <w:r>
+        <w:t>, mi programa no te dice simplemente "compra este objeto", sino que es capaz de decirte "te recomiendo este objeto porque el campeón X tiene la etiqueta de curación".</w:t>
+      </w:r>
+    </w:p>
+    <w:p/>
+    <w:p>
+      <w:pPr>
+        <w:rPr>
+          <w:rFonts w:asciiTheme="majorHAnsi" w:hAnsiTheme="majorHAnsi" w:cs="Arial"/>
+          <w:bCs/>
+          <w:iCs/>
+          <w:color w:val="0098CD"/>
+          <w:sz w:val="28"/>
+          <w:szCs w:val="28"/>
+        </w:rPr>
+      </w:pPr>
+      <w:r>
+        <w:rPr>
+          <w:rFonts w:asciiTheme="majorHAnsi" w:hAnsiTheme="majorHAnsi" w:cs="Arial"/>
+          <w:bCs/>
+          <w:iCs/>
+          <w:color w:val="0098CD"/>
+          <w:sz w:val="28"/>
+          <w:szCs w:val="28"/>
+        </w:rPr>
+        <w:t>1.2.</w:t>
+      </w:r>
+      <w:r>
+        <w:rPr>
+          <w:rFonts w:asciiTheme="majorHAnsi" w:hAnsiTheme="majorHAnsi" w:cs="Arial"/>
+          <w:bCs/>
+          <w:iCs/>
+          <w:color w:val="0098CD"/>
+          <w:sz w:val="28"/>
+          <w:szCs w:val="28"/>
+        </w:rPr>
+        <w:t>3. La fase de selección (draft) y las reglas de producción</w:t>
+      </w:r>
+    </w:p>
+    <w:p>
+      <w:r>
+        <w:t xml:space="preserve">El momento donde el sistema brilla es en el Draft. Es esa fase previa a la partida donde se eligen los personajes. Es un juego de "piedra, papel o tijera" pero con miles de variables. Como indican </w:t>
+      </w:r>
+      <w:r>
+        <w:t xml:space="preserve">[2] </w:t>
+      </w:r>
+      <w:r>
+        <w:t>Mora-Cantallops y Sicart (2018), el conocimiento del "</w:t>
+      </w:r>
+      <w:proofErr w:type="spellStart"/>
+      <w:r>
+        <w:t>metagame</w:t>
+      </w:r>
+      <w:proofErr w:type="spellEnd"/>
+      <w:r>
+        <w:t>" y las sinergias en esta fase son lo que diferencia a un jugador promedio de uno experto.</w:t>
+      </w:r>
+    </w:p>
+    <w:p/>
+    <w:p>
+      <w:pPr>
+        <w:pStyle w:val="Descripcin"/>
+        <w:jc w:val="both"/>
+      </w:pPr>
+      <w:r>
+        <w:rPr>
+          <w:b/>
+          <w:bCs/>
+        </w:rPr>
+        <w:lastRenderedPageBreak/>
+        <w:t>Figura</w:t>
+      </w:r>
+      <w:r>
+        <w:rPr>
+          <w:b/>
+          <w:bCs/>
+        </w:rPr>
+        <w:t xml:space="preserve"> </w:t>
+      </w:r>
+      <w:r>
+        <w:rPr>
+          <w:b/>
+          <w:bCs/>
+        </w:rPr>
+        <w:fldChar w:fldCharType="begin"/>
+      </w:r>
+      <w:r>
+        <w:rPr>
+          <w:b/>
+          <w:bCs/>
+        </w:rPr>
+        <w:instrText xml:space="preserve"> SEQ Ilustración \* ARABIC </w:instrText>
+      </w:r>
+      <w:r>
+        <w:rPr>
+          <w:b/>
+          <w:bCs/>
+        </w:rPr>
+        <w:fldChar w:fldCharType="separate"/>
+      </w:r>
+      <w:r>
+        <w:rPr>
+          <w:b/>
+          <w:bCs/>
+          <w:noProof/>
+        </w:rPr>
+        <w:t>2</w:t>
+      </w:r>
+      <w:r>
+        <w:rPr>
+          <w:b/>
+          <w:bCs/>
+        </w:rPr>
+        <w:fldChar w:fldCharType="end"/>
+      </w:r>
+      <w:r>
+        <w:rPr>
+          <w:b/>
+          <w:bCs/>
+        </w:rPr>
+        <w:t>.</w:t>
+      </w:r>
+      <w:r>
+        <w:t xml:space="preserve"> </w:t>
+      </w:r>
+      <w:r>
+        <w:t xml:space="preserve">Interfaz del recomendador </w:t>
+      </w:r>
+      <w:r>
+        <w:t>pidiendo al usuario insertar los datos de los campeones de la partida actual.</w:t>
+      </w:r>
+    </w:p>
+    <w:p>
+      <w:r>
+        <w:drawing>
+          <wp:inline distT="0" distB="0" distL="0" distR="0" wp14:anchorId="2F662F8C" wp14:editId="4F0739CC">
+            <wp:extent cx="5760085" cy="2674620"/>
+            <wp:effectExtent l="0" t="0" r="0" b="0"/>
+            <wp:docPr id="1481568995" name="Imagen 1"/>
+            <wp:cNvGraphicFramePr>
+              <a:graphicFrameLocks xmlns:a="http://schemas.openxmlformats.org/drawingml/2006/main" noChangeAspect="1"/>
+            </wp:cNvGraphicFramePr>
+            <a:graphic xmlns:a="http://schemas.openxmlformats.org/drawingml/2006/main">
+              <a:graphicData uri="http://schemas.openxmlformats.org/drawingml/2006/picture">
+                <pic:pic xmlns:pic="http://schemas.openxmlformats.org/drawingml/2006/picture">
+                  <pic:nvPicPr>
+                    <pic:cNvPr id="1481568995" name=""/>
+                    <pic:cNvPicPr/>
+                  </pic:nvPicPr>
+                  <pic:blipFill>
+                    <a:blip r:embed="rId17"/>
+                    <a:stretch>
+                      <a:fillRect/>
+                    </a:stretch>
+                  </pic:blipFill>
+                  <pic:spPr>
+                    <a:xfrm>
+                      <a:off x="0" y="0"/>
+                      <a:ext cx="5760085" cy="2674620"/>
+                    </a:xfrm>
+                    <a:prstGeom prst="rect">
+                      <a:avLst/>
+                    </a:prstGeom>
+                  </pic:spPr>
+                </pic:pic>
+              </a:graphicData>
+            </a:graphic>
+          </wp:inline>
+        </w:drawing>
+      </w:r>
+    </w:p>
+    <w:p/>
+    <w:p>
+      <w:r>
+        <w:t>Una vez el usuario inserta los datos de los personajes que hay en la partida</w:t>
+      </w:r>
+      <w:r>
+        <w:t>,</w:t>
+      </w:r>
+      <w:r>
+        <w:t xml:space="preserve"> da una recomendación en base al </w:t>
+      </w:r>
+      <w:r>
+        <w:t>cálculo</w:t>
+      </w:r>
+      <w:r>
+        <w:t xml:space="preserve"> realizado por el programa, teniendo en cuenta todo momento la posición faltante del usuario</w:t>
+      </w:r>
+      <w:r>
+        <w:t>,</w:t>
+      </w:r>
+      <w:r>
+        <w:t xml:space="preserve"> las carencias o sinergias del equipo aliado y las debilidades o ventajas del equipo enemigo.</w:t>
+      </w:r>
+    </w:p>
+    <w:p>
+      <w:pPr>
+        <w:pStyle w:val="Descripcin"/>
+        <w:jc w:val="both"/>
+        <w:rPr>
+          <w:b/>
+          <w:bCs/>
+        </w:rPr>
+      </w:pPr>
+    </w:p>
+    <w:p>
+      <w:pPr>
+        <w:pStyle w:val="Descripcin"/>
+        <w:jc w:val="both"/>
+      </w:pPr>
+      <w:r>
+        <w:rPr>
+          <w:b/>
+          <w:bCs/>
+        </w:rPr>
+        <w:t xml:space="preserve">Figura </w:t>
+      </w:r>
+      <w:r>
+        <w:rPr>
+          <w:b/>
+          <w:bCs/>
+        </w:rPr>
+        <w:fldChar w:fldCharType="begin"/>
+      </w:r>
+      <w:r>
+        <w:rPr>
+          <w:b/>
+          <w:bCs/>
+        </w:rPr>
+        <w:instrText xml:space="preserve"> SEQ Ilustración \* ARABIC </w:instrText>
+      </w:r>
+      <w:r>
+        <w:rPr>
+          <w:b/>
+          <w:bCs/>
+        </w:rPr>
+        <w:fldChar w:fldCharType="separate"/>
+      </w:r>
+      <w:r>
+        <w:rPr>
+          <w:b/>
+          <w:bCs/>
+          <w:noProof/>
+        </w:rPr>
+        <w:t>3</w:t>
+      </w:r>
+      <w:r>
+        <w:rPr>
+          <w:b/>
+          <w:bCs/>
+        </w:rPr>
+        <w:fldChar w:fldCharType="end"/>
+      </w:r>
+      <w:r>
+        <w:rPr>
+          <w:b/>
+          <w:bCs/>
+        </w:rPr>
+        <w:t>.</w:t>
+      </w:r>
+      <w:r>
+        <w:t xml:space="preserve"> Interfaz del recomendador tras un usuario haber insertado los personajes de la partida.</w:t>
+      </w:r>
+    </w:p>
+    <w:p>
+      <w:r>
+        <w:drawing>
+          <wp:inline distT="0" distB="0" distL="0" distR="0" wp14:anchorId="5BFCE30F" wp14:editId="2D9E2BB1">
+            <wp:extent cx="5760085" cy="2480310"/>
+            <wp:effectExtent l="0" t="0" r="0" b="0"/>
+            <wp:docPr id="854884858" name="Imagen 1"/>
+            <wp:cNvGraphicFramePr>
+              <a:graphicFrameLocks xmlns:a="http://schemas.openxmlformats.org/drawingml/2006/main" noChangeAspect="1"/>
+            </wp:cNvGraphicFramePr>
+            <a:graphic xmlns:a="http://schemas.openxmlformats.org/drawingml/2006/main">
+              <a:graphicData uri="http://schemas.openxmlformats.org/drawingml/2006/picture">
+                <pic:pic xmlns:pic="http://schemas.openxmlformats.org/drawingml/2006/picture">
+                  <pic:nvPicPr>
+                    <pic:cNvPr id="854884858" name=""/>
+                    <pic:cNvPicPr/>
+                  </pic:nvPicPr>
+                  <pic:blipFill>
+                    <a:blip r:embed="rId18"/>
+                    <a:stretch>
+                      <a:fillRect/>
+                    </a:stretch>
+                  </pic:blipFill>
+                  <pic:spPr>
+                    <a:xfrm>
+                      <a:off x="0" y="0"/>
+                      <a:ext cx="5760085" cy="2480310"/>
+                    </a:xfrm>
+                    <a:prstGeom prst="rect">
+                      <a:avLst/>
+                    </a:prstGeom>
+                  </pic:spPr>
+                </pic:pic>
+              </a:graphicData>
+            </a:graphic>
+          </wp:inline>
+        </w:drawing>
+      </w:r>
+    </w:p>
+    <w:p/>
+    <w:p>
+      <w:r>
+        <w:lastRenderedPageBreak/>
+        <w:t xml:space="preserve">Al </w:t>
+      </w:r>
+      <w:r>
+        <w:t>dar</w:t>
+      </w:r>
+      <w:r>
+        <w:t xml:space="preserve"> </w:t>
+      </w:r>
+      <w:r>
+        <w:t>esa</w:t>
+      </w:r>
+      <w:r>
+        <w:t xml:space="preserve"> composición de ejemplo al programa </w:t>
+      </w:r>
+      <w:r>
+        <w:t>este calcula todo lo anteriormente comentado y da un resultado, recomendando tres posibles opciones de campeón para seleccionar y avisando y recordando al usuario en todo momento de</w:t>
+      </w:r>
+      <w:r>
+        <w:t xml:space="preserve"> las reglas que han saltado y como poder evitar posibles problemas dando ciertas soluciones.</w:t>
+      </w:r>
+    </w:p>
+    <w:p/>
+    <w:p>
+      <w:pPr>
+        <w:pStyle w:val="Descripcin"/>
+        <w:jc w:val="both"/>
+      </w:pPr>
+      <w:r>
+        <w:rPr>
+          <w:b/>
+          <w:bCs/>
+        </w:rPr>
+        <w:t xml:space="preserve">Ilustración </w:t>
+      </w:r>
+      <w:r>
+        <w:rPr>
+          <w:b/>
+          <w:bCs/>
+        </w:rPr>
+        <w:fldChar w:fldCharType="begin"/>
+      </w:r>
+      <w:r>
+        <w:rPr>
+          <w:b/>
+          <w:bCs/>
+        </w:rPr>
+        <w:instrText xml:space="preserve"> SEQ Ilustración \* ARABIC </w:instrText>
+      </w:r>
+      <w:r>
+        <w:rPr>
+          <w:b/>
+          <w:bCs/>
+        </w:rPr>
+        <w:fldChar w:fldCharType="separate"/>
+      </w:r>
+      <w:r>
+        <w:rPr>
+          <w:b/>
+          <w:bCs/>
+          <w:noProof/>
+        </w:rPr>
+        <w:t>4</w:t>
+      </w:r>
+      <w:r>
+        <w:rPr>
+          <w:b/>
+          <w:bCs/>
+        </w:rPr>
+        <w:fldChar w:fldCharType="end"/>
+      </w:r>
+      <w:r>
+        <w:rPr>
+          <w:b/>
+          <w:bCs/>
+        </w:rPr>
+        <w:t>.</w:t>
+      </w:r>
+      <w:r>
+        <w:t xml:space="preserve"> El programa da como resultado su conclusión tras realizar los </w:t>
+      </w:r>
+      <w:proofErr w:type="spellStart"/>
+      <w:r>
+        <w:t>calculos</w:t>
+      </w:r>
+      <w:proofErr w:type="spellEnd"/>
+      <w:r>
+        <w:t xml:space="preserve"> y recomienda las mejores opciones.</w:t>
+      </w:r>
+    </w:p>
+    <w:p>
+      <w:r>
+        <w:drawing>
+          <wp:inline distT="0" distB="0" distL="0" distR="0" wp14:anchorId="656D8039" wp14:editId="20900466">
+            <wp:extent cx="5760085" cy="5046345"/>
+            <wp:effectExtent l="0" t="0" r="0" b="1905"/>
+            <wp:docPr id="2113822264" name="Imagen 1"/>
+            <wp:cNvGraphicFramePr>
+              <a:graphicFrameLocks xmlns:a="http://schemas.openxmlformats.org/drawingml/2006/main" noChangeAspect="1"/>
+            </wp:cNvGraphicFramePr>
+            <a:graphic xmlns:a="http://schemas.openxmlformats.org/drawingml/2006/main">
+              <a:graphicData uri="http://schemas.openxmlformats.org/drawingml/2006/picture">
+                <pic:pic xmlns:pic="http://schemas.openxmlformats.org/drawingml/2006/picture">
+                  <pic:nvPicPr>
+                    <pic:cNvPr id="2113822264" name=""/>
+                    <pic:cNvPicPr/>
+                  </pic:nvPicPr>
+                  <pic:blipFill>
+                    <a:blip r:embed="rId19"/>
+                    <a:stretch>
+                      <a:fillRect/>
+                    </a:stretch>
+                  </pic:blipFill>
+                  <pic:spPr>
+                    <a:xfrm>
+                      <a:off x="0" y="0"/>
+                      <a:ext cx="5760085" cy="5046345"/>
+                    </a:xfrm>
+                    <a:prstGeom prst="rect">
+                      <a:avLst/>
+                    </a:prstGeom>
+                  </pic:spPr>
+                </pic:pic>
+              </a:graphicData>
+            </a:graphic>
+          </wp:inline>
+        </w:drawing>
+      </w:r>
+    </w:p>
+    <w:p/>
+    <w:p>
+      <w:r>
+        <w:t xml:space="preserve">Como se puede observar en la imagen anterior, hacer un análisis heurístico y avisa de que reglas han hecho saltar esas recomendaciones, en el caso anterior las tres reglas principales han sido: Anti-Curaciones, Anti-Tanques y Resistencia Mágica. A la derecha de cada regla explica que personajes han hecho disparar estas reglas y da una recomendación de compras </w:t>
+      </w:r>
+      <w:r>
+        <w:lastRenderedPageBreak/>
+        <w:t xml:space="preserve">de objetos para prevenir posibles problemas durante la partida. Si un personaje como Soraka cura mucho, el programa lo detecta y recomienda automáticamente un objeto como el Morellonomicon que aporta anti-curaciones. En el caso de la regla de </w:t>
+      </w:r>
+      <w:proofErr w:type="spellStart"/>
+      <w:r>
+        <w:t>anti-tanques</w:t>
+      </w:r>
+      <w:proofErr w:type="spellEnd"/>
+      <w:r>
+        <w:t xml:space="preserve">, si un personaje como Olaf suele ser bastante robusto recomienda objetos para poder </w:t>
+      </w:r>
+      <w:proofErr w:type="spellStart"/>
+      <w:r>
+        <w:t>deterner</w:t>
+      </w:r>
+      <w:proofErr w:type="spellEnd"/>
+      <w:r>
+        <w:t xml:space="preserve"> a los tanques, como en este caso el Recordatorio Letal, siendo este, la mejor opción de objeto para la partida ya que aporta penetración de armadura para poder acabar con los tanques, y aporta anti-curaciones para denegar la curación a ciertos personajes.</w:t>
+      </w:r>
+    </w:p>
+    <w:p/>
+    <w:p>
+      <w:r>
+        <w:t>También se puede observar como dejando la selección de ADC (Bot) vacía recomienda a personajes para esta posición en específico y tiene en cuenta el porcentaje de victoria en individual con el enfrentamiento del ADC (Bot) enemigo y su porcentaje de victorias varía también dependiendo de las sinergias aliadas.</w:t>
+      </w:r>
+    </w:p>
+    <w:p/>
+    <w:p>
+      <w:pPr>
+        <w:pStyle w:val="Ttulo2"/>
+      </w:pPr>
+      <w:bookmarkStart w:id="5" w:name="_Toc149554659"/>
+      <w:r>
+        <w:t>Estructura del trabajo</w:t>
+      </w:r>
+      <w:bookmarkEnd w:id="5"/>
+    </w:p>
+    <w:p>
+      <w:r>
+        <w:t xml:space="preserve">Finaliza el capítulo de introducción con una </w:t>
+      </w:r>
+      <w:r>
+        <w:rPr>
+          <w:b/>
+          <w:bCs/>
+        </w:rPr>
         <w:t>descripción general</w:t>
       </w:r>
       <w:r>
@@ -3533,14 +5420,14 @@
           <w:highlight w:val="magenta"/>
         </w:rPr>
       </w:pPr>
-      <w:bookmarkStart w:id="7" w:name="_Toc149554660"/>
+      <w:bookmarkStart w:id="6" w:name="_Toc149554660"/>
       <w:r>
         <w:rPr>
           <w:highlight w:val="magenta"/>
         </w:rPr>
         <w:t>Contexto y Estado del Arte</w:t>
       </w:r>
-      <w:bookmarkEnd w:id="7"/>
+      <w:bookmarkEnd w:id="6"/>
     </w:p>
     <w:p>
       <w:r>
@@ -3575,6 +5462,7 @@
           <w:b/>
           <w:bCs/>
         </w:rPr>
+        <w:lastRenderedPageBreak/>
         <w:t>2. Análisis del contexto</w:t>
       </w:r>
       <w:r>
@@ -3604,26 +5492,40 @@
       <w:pPr>
         <w:pStyle w:val="Ttulo2"/>
       </w:pPr>
-      <w:bookmarkStart w:id="8" w:name="_Toc149554661"/>
-      <w:r>
-        <w:lastRenderedPageBreak/>
+      <w:bookmarkStart w:id="7" w:name="_Toc149554661"/>
+      <w:r>
         <w:t>“T</w:t>
       </w:r>
       <w:r>
         <w:t>ítulo 2” del menú de estilos</w:t>
       </w:r>
+      <w:bookmarkEnd w:id="7"/>
+    </w:p>
+    <w:p>
+      <w:r>
+        <w:t>Aprovecha los títulos de nivel 2 y sucesivos para estructurar adecuadamente la información de los capítulos. Como norma general, no debería superarse un nivel de subapartados más allá del 4.</w:t>
+      </w:r>
+    </w:p>
+    <w:p>
+      <w:pPr>
+        <w:pStyle w:val="Ttulo3"/>
+      </w:pPr>
+      <w:bookmarkStart w:id="8" w:name="_Toc149554662"/>
+      <w:r>
+        <w:t>“Título 3” del menú de estilos</w:t>
+      </w:r>
       <w:bookmarkEnd w:id="8"/>
     </w:p>
     <w:p>
       <w:r>
-        <w:t>Aprovecha los títulos de nivel 2 y sucesivos para estructurar adecuadamente la información de los capítulos. Como norma general, no debería superarse un nivel de subapartados más allá del 4.</w:t>
+        <w:t>Contenido de un apartado de nivel 3.</w:t>
       </w:r>
     </w:p>
     <w:p>
       <w:pPr>
         <w:pStyle w:val="Ttulo3"/>
       </w:pPr>
-      <w:bookmarkStart w:id="9" w:name="_Toc149554662"/>
+      <w:bookmarkStart w:id="9" w:name="_Toc149554663"/>
       <w:r>
         <w:t>“Título 3” del menú de estilos</w:t>
       </w:r>
@@ -3636,48 +5538,33 @@
     </w:p>
     <w:p>
       <w:pPr>
-        <w:pStyle w:val="Ttulo3"/>
-      </w:pPr>
-      <w:bookmarkStart w:id="10" w:name="_Toc149554663"/>
-      <w:r>
-        <w:t>“Título 3” del menú de estilos</w:t>
+        <w:pStyle w:val="Ttulo4"/>
+      </w:pPr>
+      <w:r>
+        <w:t>"Título 4" del menú de estilos</w:t>
+      </w:r>
+    </w:p>
+    <w:p>
+      <w:r>
+        <w:t>Contenido de un apartado de nivel 4.</w:t>
+      </w:r>
+    </w:p>
+    <w:p/>
+    <w:p>
+      <w:pPr>
+        <w:pStyle w:val="Ttulo2"/>
+      </w:pPr>
+      <w:r>
+        <w:t xml:space="preserve"> </w:t>
+      </w:r>
+      <w:bookmarkStart w:id="10" w:name="_Toc149554664"/>
+      <w:r>
+        <w:t>“T</w:t>
+      </w:r>
+      <w:r>
+        <w:t>ítulo 2” del menú de estilos</w:t>
       </w:r>
       <w:bookmarkEnd w:id="10"/>
-    </w:p>
-    <w:p>
-      <w:r>
-        <w:t>Contenido de un apartado de nivel 3.</w:t>
-      </w:r>
-    </w:p>
-    <w:p>
-      <w:pPr>
-        <w:pStyle w:val="Ttulo4"/>
-      </w:pPr>
-      <w:r>
-        <w:t>"Título 4" del menú de estilos</w:t>
-      </w:r>
-    </w:p>
-    <w:p>
-      <w:r>
-        <w:t>Contenido de un apartado de nivel 4.</w:t>
-      </w:r>
-    </w:p>
-    <w:p/>
-    <w:p>
-      <w:pPr>
-        <w:pStyle w:val="Ttulo2"/>
-      </w:pPr>
-      <w:r>
-        <w:t xml:space="preserve"> </w:t>
-      </w:r>
-      <w:bookmarkStart w:id="11" w:name="_Toc149554664"/>
-      <w:r>
-        <w:t>“T</w:t>
-      </w:r>
-      <w:r>
-        <w:t>ítulo 2” del menú de estilos</w:t>
-      </w:r>
-      <w:bookmarkEnd w:id="11"/>
     </w:p>
     <w:p/>
     <w:p/>
@@ -3697,7 +5584,7 @@
           <w:highlight w:val="magenta"/>
         </w:rPr>
       </w:pPr>
-      <w:bookmarkStart w:id="12" w:name="_Toc149554665"/>
+      <w:bookmarkStart w:id="11" w:name="_Toc149554665"/>
       <w:r>
         <w:rPr>
           <w:highlight w:val="magenta"/>
@@ -3705,41 +5592,41 @@
         <w:lastRenderedPageBreak/>
         <w:t>Objetivos y metodología de trabajo</w:t>
       </w:r>
+      <w:bookmarkEnd w:id="11"/>
+    </w:p>
+    <w:p>
+      <w:r>
+        <w:t>En este capítulo debes indicar el objetivo general de tu trabajo, así como los objetivos específicos en los que se puede desagregar el primero. Los objetivos específicos son más concretos, más fácil de medir, y la combinación de todos ellos permite alcanzar el objetivo general que has planteado.</w:t>
+      </w:r>
+    </w:p>
+    <w:p>
+      <w:r>
+        <w:t xml:space="preserve">Una vez analizado el contexto de tu solución y las soluciones o avances que has encontrado en el estado del arte, es fácil asentar un objetivo para tu trabajo que suponga algún tipo de avance o mejora </w:t>
+      </w:r>
+      <w:r>
+        <w:t>de la problemática que has abordado</w:t>
+      </w:r>
+      <w:r>
+        <w:t>.</w:t>
+      </w:r>
+    </w:p>
+    <w:p>
+      <w:r>
+        <w:t xml:space="preserve">La metodología debe indicar de manera estructurada qué pasos, qué acciones y qué </w:t>
+      </w:r>
+      <w:r>
+        <w:t>herramientas utilizarás para conseguir alcanzar los objetivos que te has marcado.</w:t>
+      </w:r>
+    </w:p>
+    <w:p>
+      <w:pPr>
+        <w:pStyle w:val="Ttulo2"/>
+      </w:pPr>
+      <w:bookmarkStart w:id="12" w:name="_Toc149554666"/>
+      <w:r>
+        <w:t>Objetivo general</w:t>
+      </w:r>
       <w:bookmarkEnd w:id="12"/>
-    </w:p>
-    <w:p>
-      <w:r>
-        <w:t>En este capítulo debes indicar el objetivo general de tu trabajo, así como los objetivos específicos en los que se puede desagregar el primero. Los objetivos específicos son más concretos, más fácil de medir, y la combinación de todos ellos permite alcanzar el objetivo general que has planteado.</w:t>
-      </w:r>
-    </w:p>
-    <w:p>
-      <w:r>
-        <w:t xml:space="preserve">Una vez analizado el contexto de tu solución y las soluciones o avances que has encontrado en el estado del arte, es fácil asentar un objetivo para tu trabajo que suponga algún tipo de avance o mejora </w:t>
-      </w:r>
-      <w:r>
-        <w:t>de la problemática que has abordado</w:t>
-      </w:r>
-      <w:r>
-        <w:t>.</w:t>
-      </w:r>
-    </w:p>
-    <w:p>
-      <w:r>
-        <w:t xml:space="preserve">La metodología debe indicar de manera estructurada qué pasos, qué acciones y qué </w:t>
-      </w:r>
-      <w:r>
-        <w:t>herramientas utilizarás para conseguir alcanzar los objetivos que te has marcado.</w:t>
-      </w:r>
-    </w:p>
-    <w:p>
-      <w:pPr>
-        <w:pStyle w:val="Ttulo2"/>
-      </w:pPr>
-      <w:bookmarkStart w:id="13" w:name="_Toc149554666"/>
-      <w:r>
-        <w:t>Objetivo general</w:t>
-      </w:r>
-      <w:bookmarkEnd w:id="13"/>
     </w:p>
     <w:p/>
     <w:p/>
@@ -3747,25 +5634,25 @@
       <w:pPr>
         <w:pStyle w:val="Ttulo2"/>
       </w:pPr>
-      <w:bookmarkStart w:id="14" w:name="_Toc149554667"/>
+      <w:bookmarkStart w:id="13" w:name="_Toc149554667"/>
       <w:r>
         <w:t>Objetivos específicos</w:t>
       </w:r>
+      <w:bookmarkEnd w:id="13"/>
+    </w:p>
+    <w:p/>
+    <w:p>
+      <w:pPr>
+        <w:pStyle w:val="Ttulo2"/>
+      </w:pPr>
+      <w:bookmarkStart w:id="14" w:name="_Toc149554668"/>
+      <w:r>
+        <w:t>Metodología de trabajo</w:t>
+      </w:r>
       <w:bookmarkEnd w:id="14"/>
     </w:p>
     <w:p/>
     <w:p>
-      <w:pPr>
-        <w:pStyle w:val="Ttulo2"/>
-      </w:pPr>
-      <w:bookmarkStart w:id="15" w:name="_Toc149554668"/>
-      <w:r>
-        <w:t>Metodología de trabajo</w:t>
-      </w:r>
-      <w:bookmarkEnd w:id="15"/>
-    </w:p>
-    <w:p/>
-    <w:p>
       <w:r>
         <w:br w:type="page"/>
       </w:r>
@@ -3777,7 +5664,7 @@
           <w:highlight w:val="magenta"/>
         </w:rPr>
       </w:pPr>
-      <w:bookmarkStart w:id="16" w:name="_Toc149554669"/>
+      <w:bookmarkStart w:id="15" w:name="_Toc149554669"/>
       <w:r>
         <w:rPr>
           <w:highlight w:val="magenta"/>
@@ -3785,7 +5672,7 @@
         <w:lastRenderedPageBreak/>
         <w:t>Título del capítulo</w:t>
       </w:r>
-      <w:bookmarkEnd w:id="16"/>
+      <w:bookmarkEnd w:id="15"/>
     </w:p>
     <w:p>
       <w:r>
@@ -3822,7 +5709,7 @@
           <w:highlight w:val="magenta"/>
         </w:rPr>
       </w:pPr>
-      <w:bookmarkStart w:id="17" w:name="_Toc149554670"/>
+      <w:bookmarkStart w:id="16" w:name="_Toc149554670"/>
       <w:r>
         <w:rPr>
           <w:highlight w:val="magenta"/>
@@ -3830,7 +5717,7 @@
         <w:lastRenderedPageBreak/>
         <w:t>Conclusiones y trabajo futuro</w:t>
       </w:r>
-      <w:bookmarkEnd w:id="17"/>
+      <w:bookmarkEnd w:id="16"/>
     </w:p>
     <w:p>
       <w:r>
@@ -3895,29 +5782,29 @@
       <w:pPr>
         <w:pStyle w:val="Ttulo2"/>
       </w:pPr>
-      <w:bookmarkStart w:id="18" w:name="_Toc149554671"/>
+      <w:bookmarkStart w:id="17" w:name="_Toc149554671"/>
       <w:r>
         <w:t>Conclusiones del trabajo</w:t>
       </w:r>
+      <w:bookmarkEnd w:id="17"/>
+    </w:p>
+    <w:p>
+      <w:r>
+        <w:t>Tras una breve introducción de esta sección, dedica al menos un párrafo a analizar cómo has intentado alcanzar cada uno de los objetivos que te habías planteado, y en qué medida lo consideras cumplido. Se trata de</w:t>
+      </w:r>
+      <w:r>
+        <w:t xml:space="preserve"> recordar cómo los diferentes contenidos y resultados de los capítulos anteriores materializan tu nivel de cumplimiento de estos objetivos.</w:t>
+      </w:r>
+    </w:p>
+    <w:p>
+      <w:pPr>
+        <w:pStyle w:val="Ttulo2"/>
+      </w:pPr>
+      <w:bookmarkStart w:id="18" w:name="_Toc149554672"/>
+      <w:r>
+        <w:t>Líneas de trabajo futuro</w:t>
+      </w:r>
       <w:bookmarkEnd w:id="18"/>
-    </w:p>
-    <w:p>
-      <w:r>
-        <w:t>Tras una breve introducción de esta sección, dedica al menos un párrafo a analizar cómo has intentado alcanzar cada uno de los objetivos que te habías planteado, y en qué medida lo consideras cumplido. Se trata de</w:t>
-      </w:r>
-      <w:r>
-        <w:t xml:space="preserve"> recordar cómo los diferentes contenidos y resultados de los capítulos anteriores materializan tu nivel de cumplimiento de estos objetivos.</w:t>
-      </w:r>
-    </w:p>
-    <w:p>
-      <w:pPr>
-        <w:pStyle w:val="Ttulo2"/>
-      </w:pPr>
-      <w:bookmarkStart w:id="19" w:name="_Toc149554672"/>
-      <w:r>
-        <w:t>Líneas de trabajo futuro</w:t>
-      </w:r>
-      <w:bookmarkEnd w:id="19"/>
     </w:p>
     <w:p>
       <w:r>
@@ -3937,7 +5824,7 @@
       <w:pPr>
         <w:pStyle w:val="Ttulo1sinnumerar"/>
       </w:pPr>
-      <w:bookmarkStart w:id="20" w:name="_Toc149554673"/>
+      <w:bookmarkStart w:id="19" w:name="_Toc149554673"/>
       <w:r>
         <w:rPr>
           <w:highlight w:val="magenta"/>
@@ -3945,47 +5832,66 @@
         <w:lastRenderedPageBreak/>
         <w:t>Referencias bibliográficas</w:t>
       </w:r>
-      <w:bookmarkEnd w:id="20"/>
+      <w:bookmarkEnd w:id="19"/>
     </w:p>
     <w:p>
       <w:pPr>
         <w:pStyle w:val="Bibliografa1"/>
-      </w:pPr>
-      <w:r>
+        <w:rPr>
+          <w:lang w:val="en-US"/>
+        </w:rPr>
+      </w:pPr>
+      <w:r>
+        <w:rPr>
+          <w:lang w:val="en-US"/>
+        </w:rPr>
+        <w:t xml:space="preserve">[1] </w:t>
+      </w:r>
+      <w:r>
+        <w:rPr>
+          <w:lang w:val="en-US"/>
+        </w:rPr>
+        <w:t>Yang, P., Harrison, B., &amp; Roberts, D. L. (2016). Predicting Winning Teams in Dota 2. In Proceedings of the 11th International Conference on the Foundations of Digital Games.</w:t>
+      </w:r>
+    </w:p>
+    <w:p>
+      <w:pPr>
+        <w:pStyle w:val="Bibliografa1"/>
         <w:rPr>
           <w:lang w:val="es-ES_tradnl"/>
         </w:rPr>
-        <w:t xml:space="preserve">Joyanes, L. (2008). </w:t>
-      </w:r>
-      <w:r>
-        <w:rPr>
-          <w:i/>
-          <w:iCs/>
+      </w:pPr>
+      <w:r>
+        <w:rPr>
           <w:lang w:val="es-ES_tradnl"/>
         </w:rPr>
-        <w:t>Fundamentos de programación: Algoritmos, estructura de datos y objetos</w:t>
+        <w:t xml:space="preserve">[2] </w:t>
       </w:r>
       <w:r>
         <w:rPr>
           <w:lang w:val="es-ES_tradnl"/>
         </w:rPr>
-        <w:t xml:space="preserve"> (4.</w:t>
-      </w:r>
-      <w:r>
-        <w:rPr>
-          <w:vertAlign w:val="superscript"/>
+        <w:t xml:space="preserve">Mora-Cantallops, M., &amp; Sicart, M. (2018). </w:t>
+      </w:r>
+      <w:r>
+        <w:rPr>
+          <w:lang w:val="en-US"/>
+        </w:rPr>
+        <w:t xml:space="preserve">League of Legends, out of the box: A video game’s impact on the esports ecosystem. </w:t>
+      </w:r>
+      <w:proofErr w:type="spellStart"/>
+      <w:r>
+        <w:rPr>
           <w:lang w:val="es-ES_tradnl"/>
         </w:rPr>
-        <w:t>a</w:t>
-      </w:r>
+        <w:t>Entertainment</w:t>
+      </w:r>
+      <w:proofErr w:type="spellEnd"/>
       <w:r>
         <w:rPr>
           <w:lang w:val="es-ES_tradnl"/>
         </w:rPr>
-        <w:t xml:space="preserve"> ed.). </w:t>
-      </w:r>
-      <w:r>
-        <w:t>McGraw-Hill Interamericana de España S.L.</w:t>
+        <w:t xml:space="preserve"> Computing, 26, 1-9.</w:t>
       </w:r>
     </w:p>
     <w:p>
@@ -3997,65 +5903,151 @@
       </w:pPr>
       <w:r>
         <w:rPr>
+          <w:lang w:val="en-US"/>
+        </w:rPr>
+        <w:t xml:space="preserve">[3] </w:t>
+      </w:r>
+      <w:r>
+        <w:rPr>
+          <w:lang w:val="en-US"/>
+        </w:rPr>
+        <w:t xml:space="preserve">Riot Games. (2024). Data Dragon Tool &amp; API Documentation. </w:t>
+      </w:r>
+      <w:r>
+        <w:rPr>
           <w:lang w:val="es-ES_tradnl"/>
         </w:rPr>
-        <w:t xml:space="preserve">Sommerville, I. (2011). </w:t>
-      </w:r>
-      <w:r>
-        <w:rPr>
-          <w:i/>
-          <w:iCs/>
+        <w:t>Riot Developer Portal.</w:t>
+      </w:r>
+    </w:p>
+    <w:p>
+      <w:pPr>
+        <w:pStyle w:val="Bibliografa1"/>
+        <w:rPr>
           <w:lang w:val="es-ES_tradnl"/>
         </w:rPr>
-        <w:t>Ingeniería de software: Novena edición</w:t>
+      </w:pPr>
+      <w:r>
+        <w:rPr>
+          <w:lang w:val="en-US"/>
+        </w:rPr>
+        <w:t xml:space="preserve">[4] </w:t>
+      </w:r>
+      <w:r>
+        <w:rPr>
+          <w:lang w:val="en-US"/>
+        </w:rPr>
+        <w:t xml:space="preserve">Russell, S. J., &amp; Norvig, P. (2021). Artificial Intelligence: A Modern Approach (4th ed.). </w:t>
       </w:r>
       <w:r>
         <w:rPr>
           <w:lang w:val="es-ES_tradnl"/>
         </w:rPr>
-        <w:t xml:space="preserve"> (9.</w:t>
-      </w:r>
-      <w:r>
-        <w:rPr>
-          <w:vertAlign w:val="superscript"/>
+        <w:t>Pearson.</w:t>
+      </w:r>
+    </w:p>
+    <w:p>
+      <w:pPr>
+        <w:pStyle w:val="Bibliografa1"/>
+        <w:rPr>
           <w:lang w:val="es-ES_tradnl"/>
         </w:rPr>
-        <w:t>a</w:t>
-      </w:r>
+      </w:pPr>
       <w:r>
         <w:rPr>
           <w:lang w:val="es-ES_tradnl"/>
         </w:rPr>
-        <w:t xml:space="preserve"> ed.). México: Pearson Educación de México.</w:t>
-      </w:r>
-    </w:p>
-    <w:p>
-      <w:pPr>
-        <w:pStyle w:val="Referenciasbibliogrficas"/>
-      </w:pPr>
-      <w:r>
-        <w:rPr>
-          <w:lang w:val="es-ES"/>
-        </w:rPr>
-        <w:t xml:space="preserve">Swanson, E., Barnes, M., Fall, A. M., &amp; Roberts, G. (2017). </w:t>
-      </w:r>
-      <w:r>
-        <w:t xml:space="preserve">Predictors of Reading Comprehension Among Struggling Readers Who Exhibit Differing Levels of Inattention and Hyperactivity. </w:t>
-      </w:r>
-      <w:r>
-        <w:rPr>
-          <w:i/>
-        </w:rPr>
-        <w:t>Reading &amp; Writing Quarterly, 34</w:t>
-      </w:r>
-      <w:r>
-        <w:t>(2), 132-146. doi:</w:t>
-      </w:r>
-      <w:r>
-        <w:rPr>
-          <w:u w:val="single"/>
-        </w:rPr>
-        <w:t>10.1080/10573569.2017.1359712</w:t>
+        <w:t xml:space="preserve">[5] Ana Paula Afonso, </w:t>
+      </w:r>
+      <w:proofErr w:type="spellStart"/>
+      <w:r>
+        <w:rPr>
+          <w:lang w:val="es-ES_tradnl"/>
+        </w:rPr>
+        <w:t>Maria</w:t>
+      </w:r>
+      <w:proofErr w:type="spellEnd"/>
+      <w:r>
+        <w:rPr>
+          <w:lang w:val="es-ES_tradnl"/>
+        </w:rPr>
+        <w:t xml:space="preserve"> Beatriz Carmo, Tiago Gonçalves, Pedro Vieira (2019) </w:t>
+      </w:r>
+      <w:proofErr w:type="spellStart"/>
+      <w:r>
+        <w:rPr>
+          <w:lang w:val="es-ES_tradnl"/>
+        </w:rPr>
+        <w:t>VisuaLeague</w:t>
+      </w:r>
+      <w:proofErr w:type="spellEnd"/>
+      <w:r>
+        <w:rPr>
+          <w:lang w:val="es-ES_tradnl"/>
+        </w:rPr>
+        <w:t xml:space="preserve">: Player performance </w:t>
+      </w:r>
+      <w:proofErr w:type="spellStart"/>
+      <w:r>
+        <w:rPr>
+          <w:lang w:val="es-ES_tradnl"/>
+        </w:rPr>
+        <w:t>analysis</w:t>
+      </w:r>
+      <w:proofErr w:type="spellEnd"/>
+      <w:r>
+        <w:rPr>
+          <w:lang w:val="es-ES_tradnl"/>
+        </w:rPr>
+        <w:t xml:space="preserve"> </w:t>
+      </w:r>
+      <w:proofErr w:type="spellStart"/>
+      <w:r>
+        <w:rPr>
+          <w:lang w:val="es-ES_tradnl"/>
+        </w:rPr>
+        <w:t>using</w:t>
+      </w:r>
+      <w:proofErr w:type="spellEnd"/>
+      <w:r>
+        <w:rPr>
+          <w:lang w:val="es-ES_tradnl"/>
+        </w:rPr>
+        <w:t xml:space="preserve"> </w:t>
+      </w:r>
+      <w:proofErr w:type="spellStart"/>
+      <w:r>
+        <w:rPr>
+          <w:lang w:val="es-ES_tradnl"/>
+        </w:rPr>
+        <w:t>spatial</w:t>
+      </w:r>
+      <w:proofErr w:type="spellEnd"/>
+      <w:r>
+        <w:rPr>
+          <w:lang w:val="es-ES_tradnl"/>
+        </w:rPr>
+        <w:t>-temporal data</w:t>
+      </w:r>
+      <w:r>
+        <w:rPr>
+          <w:lang w:val="es-ES_tradnl"/>
+        </w:rPr>
+        <w:t xml:space="preserve">. </w:t>
+      </w:r>
+      <w:proofErr w:type="spellStart"/>
+      <w:r>
+        <w:rPr>
+          <w:lang w:val="es-ES_tradnl"/>
+        </w:rPr>
+        <w:t>Researchgate</w:t>
+      </w:r>
+      <w:proofErr w:type="spellEnd"/>
+      <w:r>
+        <w:rPr>
+          <w:lang w:val="es-ES_tradnl"/>
+        </w:rPr>
+        <w:t>.</w:t>
       </w:r>
     </w:p>
     <w:p>
@@ -4074,7 +6066,7 @@
           <w:highlight w:val="magenta"/>
         </w:rPr>
       </w:pPr>
-      <w:bookmarkStart w:id="21" w:name="_Toc149554674"/>
+      <w:bookmarkStart w:id="20" w:name="_Toc149554674"/>
       <w:r>
         <w:rPr>
           <w:highlight w:val="magenta"/>
@@ -4082,7 +6074,7 @@
         <w:lastRenderedPageBreak/>
         <w:t>Título del anexo.</w:t>
       </w:r>
-      <w:bookmarkEnd w:id="21"/>
+      <w:bookmarkEnd w:id="20"/>
     </w:p>
     <w:p>
       <w:pPr>
@@ -4119,7 +6111,7 @@
       <w:pPr>
         <w:pStyle w:val="Ttulo1sinnumerar"/>
       </w:pPr>
-      <w:bookmarkStart w:id="22" w:name="_Toc149554675"/>
+      <w:bookmarkStart w:id="21" w:name="_Toc149554675"/>
       <w:r>
         <w:rPr>
           <w:highlight w:val="magenta"/>
@@ -4127,7 +6119,7 @@
         <w:lastRenderedPageBreak/>
         <w:t>Índice de acrónimos</w:t>
       </w:r>
-      <w:bookmarkEnd w:id="22"/>
+      <w:bookmarkEnd w:id="21"/>
     </w:p>
     <w:p>
       <w:r>
@@ -4276,14 +6268,7 @@
         <w:rFonts w:asciiTheme="majorHAnsi" w:hAnsiTheme="majorHAnsi"/>
         <w:sz w:val="20"/>
       </w:rPr>
-      <w:t xml:space="preserve">Nombre y apellidos del </w:t>
-    </w:r>
-    <w:r>
-      <w:rPr>
-        <w:rFonts w:asciiTheme="majorHAnsi" w:hAnsiTheme="majorHAnsi"/>
-        <w:sz w:val="20"/>
-      </w:rPr>
-      <w:t>estudiante</w:t>
+      <w:t>Oscar Sánchez García</w:t>
     </w:r>
   </w:p>
   <w:p>
@@ -4301,7 +6286,14 @@
         <w:rFonts w:asciiTheme="majorHAnsi" w:hAnsiTheme="majorHAnsi"/>
         <w:sz w:val="20"/>
       </w:rPr>
-      <w:t>Título del Trabajo Fin de Estudios</w:t>
+      <w:t>Sistema experto para la toma de decisiones estratégicas en League Of Legends</w:t>
+    </w:r>
+    <w:r>
+      <w:rPr>
+        <w:rFonts w:asciiTheme="majorHAnsi" w:hAnsiTheme="majorHAnsi"/>
+        <w:sz w:val="20"/>
+      </w:rPr>
+      <w:t xml:space="preserve"> (provisional)</w:t>
     </w:r>
   </w:p>
 </w:hdr>
@@ -8242,6 +10234,10 @@
 </file>
 
 <file path=customXml/item1.xml><?xml version="1.0" encoding="utf-8"?>
+<b:Sources xmlns:b="http://schemas.openxmlformats.org/officeDocument/2006/bibliography" xmlns="http://schemas.openxmlformats.org/officeDocument/2006/bibliography" SelectedStyle="\APASixthEditionOfficeOnline.xsl" StyleName="APA" Version="6"/>
+</file>
+
+<file path=customXml/item2.xml><?xml version="1.0" encoding="utf-8"?>
 <p:properties xmlns:p="http://schemas.microsoft.com/office/2006/metadata/properties" xmlns:xsi="http://www.w3.org/2001/XMLSchema-instance" xmlns:pc="http://schemas.microsoft.com/office/infopath/2007/PartnerControls">
   <documentManagement>
     <TaxCatchAll xmlns="0a70e875-3d35-4be2-921f-7117c31bab9b" xsi:nil="true"/>
@@ -8253,20 +10249,7 @@
 </p:properties>
 </file>
 
-<file path=customXml/item2.xml><?xml version="1.0" encoding="utf-8"?>
-<b:Sources xmlns:b="http://schemas.openxmlformats.org/officeDocument/2006/bibliography" xmlns="http://schemas.openxmlformats.org/officeDocument/2006/bibliography" SelectedStyle="\APASixthEditionOfficeOnline.xsl" StyleName="APA" Version="6"/>
-</file>
-
 <file path=customXml/item3.xml><?xml version="1.0" encoding="utf-8"?>
-<?mso-contentType ?>
-<FormTemplates xmlns="http://schemas.microsoft.com/sharepoint/v3/contenttype/forms">
-  <Display>DocumentLibraryForm</Display>
-  <Edit>DocumentLibraryForm</Edit>
-  <New>DocumentLibraryForm</New>
-</FormTemplates>
-</file>
-
-<file path=customXml/item4.xml><?xml version="1.0" encoding="utf-8"?>
 <ct:contentTypeSchema xmlns:ct="http://schemas.microsoft.com/office/2006/metadata/contentType" xmlns:ma="http://schemas.microsoft.com/office/2006/metadata/properties/metaAttributes" ct:_="" ma:_="" ma:contentTypeName="Documento" ma:contentTypeID="0x010100DF3D7C797EA12745A270EF30E38719B9" ma:contentTypeVersion="19" ma:contentTypeDescription="Crear nuevo documento." ma:contentTypeScope="" ma:versionID="227b02526234ef39b0b78895a9d90cf5">
   <xsd:schema xmlns:xsd="http://www.w3.org/2001/XMLSchema" xmlns:xs="http://www.w3.org/2001/XMLSchema" xmlns:p="http://schemas.microsoft.com/office/2006/metadata/properties" xmlns:ns2="0a70e875-3d35-4be2-921f-7117c31bab9b" xmlns:ns3="27c1adeb-3674-457c-b08c-8a73f31b6e23" targetNamespace="http://schemas.microsoft.com/office/2006/metadata/properties" ma:root="true" ma:fieldsID="3c939c8607e2f594db8bbb23634dd059" ns2:_="" ns3:_="">
     <xsd:import namespace="0a70e875-3d35-4be2-921f-7117c31bab9b"/>
@@ -8527,7 +10510,24 @@
 </ct:contentTypeSchema>
 </file>
 
+<file path=customXml/item4.xml><?xml version="1.0" encoding="utf-8"?>
+<?mso-contentType ?>
+<FormTemplates xmlns="http://schemas.microsoft.com/sharepoint/v3/contenttype/forms">
+  <Display>DocumentLibraryForm</Display>
+  <Edit>DocumentLibraryForm</Edit>
+  <New>DocumentLibraryForm</New>
+</FormTemplates>
+</file>
+
 <file path=customXml/itemProps1.xml><?xml version="1.0" encoding="utf-8"?>
+<ds:datastoreItem xmlns:ds="http://schemas.openxmlformats.org/officeDocument/2006/customXml" ds:itemID="{FD1A1271-5F91-421F-91AA-F5599BF2C903}">
+  <ds:schemaRefs>
+    <ds:schemaRef ds:uri="http://schemas.openxmlformats.org/officeDocument/2006/bibliography"/>
+  </ds:schemaRefs>
+</ds:datastoreItem>
+</file>
+
+<file path=customXml/itemProps2.xml><?xml version="1.0" encoding="utf-8"?>
 <ds:datastoreItem xmlns:ds="http://schemas.openxmlformats.org/officeDocument/2006/customXml" ds:itemID="{1F3C1B10-EE25-478F-A378-26280E5A2662}">
   <ds:schemaRefs>
     <ds:schemaRef ds:uri="http://schemas.microsoft.com/office/2006/metadata/properties"/>
@@ -8538,23 +10538,7 @@
 </ds:datastoreItem>
 </file>
 
-<file path=customXml/itemProps2.xml><?xml version="1.0" encoding="utf-8"?>
-<ds:datastoreItem xmlns:ds="http://schemas.openxmlformats.org/officeDocument/2006/customXml" ds:itemID="{FD1A1271-5F91-421F-91AA-F5599BF2C903}">
-  <ds:schemaRefs>
-    <ds:schemaRef ds:uri="http://schemas.openxmlformats.org/officeDocument/2006/bibliography"/>
-  </ds:schemaRefs>
-</ds:datastoreItem>
-</file>
-
 <file path=customXml/itemProps3.xml><?xml version="1.0" encoding="utf-8"?>
-<ds:datastoreItem xmlns:ds="http://schemas.openxmlformats.org/officeDocument/2006/customXml" ds:itemID="{5B3F4A43-888D-4D33-BD1C-7066736CDCB4}">
-  <ds:schemaRefs>
-    <ds:schemaRef ds:uri="http://schemas.microsoft.com/sharepoint/v3/contenttype/forms"/>
-  </ds:schemaRefs>
-</ds:datastoreItem>
-</file>
-
-<file path=customXml/itemProps4.xml><?xml version="1.0" encoding="utf-8"?>
 <ds:datastoreItem xmlns:ds="http://schemas.openxmlformats.org/officeDocument/2006/customXml" ds:itemID="{3624E214-1B8A-4A51-B10D-C847268B4539}">
   <ds:schemaRefs>
     <ds:schemaRef ds:uri="http://schemas.microsoft.com/office/2006/metadata/contentType"/>
@@ -8571,4 +10555,12 @@
     <ds:schemaRef ds:uri="http://schemas.microsoft.com/internal/obd"/>
   </ds:schemaRefs>
 </ds:datastoreItem>
+</file>
+
+<file path=customXml/itemProps4.xml><?xml version="1.0" encoding="utf-8"?>
+<ds:datastoreItem xmlns:ds="http://schemas.openxmlformats.org/officeDocument/2006/customXml" ds:itemID="{5B3F4A43-888D-4D33-BD1C-7066736CDCB4}">
+  <ds:schemaRefs>
+    <ds:schemaRef ds:uri="http://schemas.microsoft.com/sharepoint/v3/contenttype/forms"/>
+  </ds:schemaRefs>
+</ds:datastoreItem>
 </file>
</xml_diff>